<commit_message>
Add PS-SUB-03 to the Payment Stats bug report
The refresh icon ignores exactly one click, the first after page load. No
spin, no request, no feedback. Click it again and it works.

Measured on IPG by sampling the icon class every 40ms, so a spin too brief to
see would still have been caught: click 1 never span and sent nothing, clicks
2 and 3 both span and returned 200.

The cause is in the notes - the handler clears the date-set flag and then
reads it on the next line, before React has applied the change, so the fetch
branch is skipped. Also corrects an earlier note claiming the icon only works
after a Submit has run; a second click is enough on its own.

No screenshot: a still cannot show the absence of a spin. The timing
measurement is the evidence.
</commit_message>
<xml_diff>
--- a/PaymentStats_Bugs.docx
+++ b/PaymentStats_Bugs.docx
@@ -192,6 +192,72 @@
                 <w:sz w:val="20"/>
               </w:rPr>
               <w:t xml:space="preserve">Switching sub-merchant does not reload the stats</w:t>
+            </w:r>
+          </w:p>
+        </w:tc>
+        <w:tc>
+          <w:tcPr>
+            <w:tcW w:w="2340" w:type="dxa"/>
+          </w:tcPr>
+          <w:p>
+            <w:pPr>
+              <w:spacing w:before="40" w:after="40"/>
+            </w:pPr>
+            <w:r>
+              <w:rPr>
+                <w:sz w:val="20"/>
+              </w:rPr>
+              <w:t xml:space="preserve">all gateways</w:t>
+            </w:r>
+          </w:p>
+        </w:tc>
+      </w:tr>
+      <w:tr>
+        <w:tc>
+          <w:tcPr>
+            <w:tcW w:w="2340" w:type="dxa"/>
+          </w:tcPr>
+          <w:p>
+            <w:pPr>
+              <w:spacing w:before="40" w:after="40"/>
+            </w:pPr>
+            <w:r>
+              <w:rPr>
+                <w:sz w:val="20"/>
+              </w:rPr>
+              <w:t xml:space="preserve">2</w:t>
+            </w:r>
+          </w:p>
+        </w:tc>
+        <w:tc>
+          <w:tcPr>
+            <w:tcW w:w="2340" w:type="dxa"/>
+          </w:tcPr>
+          <w:p>
+            <w:pPr>
+              <w:spacing w:before="40" w:after="40"/>
+            </w:pPr>
+            <w:r>
+              <w:rPr>
+                <w:sz w:val="20"/>
+              </w:rPr>
+              <w:t xml:space="preserve">PS-SUB-03</w:t>
+            </w:r>
+          </w:p>
+        </w:tc>
+        <w:tc>
+          <w:tcPr>
+            <w:tcW w:w="2340" w:type="dxa"/>
+          </w:tcPr>
+          <w:p>
+            <w:pPr>
+              <w:spacing w:before="40" w:after="40"/>
+            </w:pPr>
+            <w:r>
+              <w:rPr>
+                <w:sz w:val="20"/>
+              </w:rPr>
+              <w:t xml:space="preserve">The first refresh click after page load is swallowed</w:t>
             </w:r>
           </w:p>
         </w:tc>
@@ -941,6 +1007,642 @@
         <w:t xml:space="preserve">• Worth checking the graph as well as the table: both are drawn from the same fetch, so both stay stale.</w:t>
       </w:r>
     </w:p>
+    <w:p>
+      <w:pPr>
+        <w:spacing w:before="0" w:after="200"/>
+        <w:rPr>
+          <w:sz w:val="36"/>
+          <w:b/>
+        </w:rPr>
+      </w:pPr>
+      <w:r>
+        <w:rPr>
+          <w:sz w:val="36"/>
+          <w:b/>
+        </w:rPr>
+        <w:t xml:space="preserve">2. PS-SUB-03 — the first refresh click after page load is swallowed</w:t>
+      </w:r>
+    </w:p>
+    <w:p>
+      <w:pPr>
+        <w:spacing w:before="0" w:after="120"/>
+        <w:rPr>
+          <w:sz w:val="22"/>
+        </w:rPr>
+      </w:pPr>
+      <w:r>
+        <w:rPr>
+          <w:sz w:val="22"/>
+          <w:b/>
+        </w:rPr>
+        <w:t xml:space="preserve">Test case:</w:t>
+      </w:r>
+      <w:r>
+        <w:rPr>
+          <w:sz w:val="22"/>
+        </w:rPr>
+        <w:t xml:space="preserve"> PS-SUB-03 </w:t>
+      </w:r>
+      <w:r>
+        <w:rPr>
+          <w:sz w:val="22"/>
+          <w:b/>
+        </w:rPr>
+        <w:t xml:space="preserve">Priority:</w:t>
+      </w:r>
+      <w:r>
+        <w:rPr>
+          <w:sz w:val="22"/>
+        </w:rPr>
+        <w:t xml:space="preserve"> Medium </w:t>
+      </w:r>
+      <w:r>
+        <w:rPr>
+          <w:sz w:val="22"/>
+          <w:b/>
+        </w:rPr>
+        <w:t xml:space="preserve">Gateways seen on:</w:t>
+      </w:r>
+      <w:r>
+        <w:rPr>
+          <w:sz w:val="22"/>
+        </w:rPr>
+        <w:t xml:space="preserve"> all gateways — measured on IPG </w:t>
+      </w:r>
+      <w:r>
+        <w:rPr>
+          <w:sz w:val="22"/>
+          <w:b/>
+        </w:rPr>
+        <w:t xml:space="preserve">Date observed:</w:t>
+      </w:r>
+      <w:r>
+        <w:rPr>
+          <w:sz w:val="22"/>
+        </w:rPr>
+        <w:t xml:space="preserve"> 17 September 2026</w:t>
+      </w:r>
+    </w:p>
+    <w:p>
+      <w:pPr>
+        <w:spacing w:before="280" w:after="120"/>
+        <w:rPr>
+          <w:sz w:val="28"/>
+          <w:b/>
+        </w:rPr>
+      </w:pPr>
+      <w:r>
+        <w:rPr>
+          <w:sz w:val="28"/>
+          <w:b/>
+        </w:rPr>
+        <w:t xml:space="preserve">Summary</w:t>
+      </w:r>
+    </w:p>
+    <w:p>
+      <w:pPr>
+        <w:spacing w:before="0" w:after="120"/>
+        <w:rPr>
+          <w:sz w:val="22"/>
+        </w:rPr>
+      </w:pPr>
+      <w:r>
+        <w:rPr>
+          <w:sz w:val="22"/>
+        </w:rPr>
+        <w:t xml:space="preserve">The refresh icon beside the </w:t>
+      </w:r>
+      <w:r>
+        <w:rPr>
+          <w:sz w:val="22"/>
+          <w:b/>
+        </w:rPr>
+        <w:t xml:space="preserve">Payment Stats</w:t>
+      </w:r>
+      <w:r>
+        <w:rPr>
+          <w:sz w:val="22"/>
+        </w:rPr>
+        <w:t xml:space="preserve"> heading ignores exactly one click: the first one after the page loads. Nothing spins, no request goes out, and nothing on screen says so. Click it again and it works normally.</w:t>
+      </w:r>
+    </w:p>
+    <w:p>
+      <w:pPr>
+        <w:spacing w:before="0" w:after="120"/>
+        <w:rPr>
+          <w:sz w:val="22"/>
+        </w:rPr>
+      </w:pPr>
+      <w:r>
+        <w:rPr>
+          <w:sz w:val="22"/>
+        </w:rPr>
+        <w:t xml:space="preserve">The icon is not dead, and it is not a slow response. It is one click, lost.</w:t>
+      </w:r>
+    </w:p>
+    <w:p>
+      <w:pPr>
+        <w:spacing w:before="280" w:after="120"/>
+        <w:rPr>
+          <w:sz w:val="28"/>
+          <w:b/>
+        </w:rPr>
+      </w:pPr>
+      <w:r>
+        <w:rPr>
+          <w:sz w:val="28"/>
+          <w:b/>
+        </w:rPr>
+        <w:t xml:space="preserve">Steps to reproduce</w:t>
+      </w:r>
+    </w:p>
+    <w:p>
+      <w:pPr>
+        <w:spacing w:before="0" w:after="120"/>
+        <w:rPr>
+          <w:sz w:val="22"/>
+        </w:rPr>
+      </w:pPr>
+      <w:r>
+        <w:rPr>
+          <w:sz w:val="22"/>
+        </w:rPr>
+        <w:t xml:space="preserve">1. Sign in on any gateway. 2. Go to </w:t>
+      </w:r>
+      <w:r>
+        <w:rPr>
+          <w:sz w:val="22"/>
+          <w:b/>
+        </w:rPr>
+        <w:t xml:space="preserve">Payment Analytics → Payment Stats</w:t>
+      </w:r>
+      <w:r>
+        <w:rPr>
+          <w:sz w:val="22"/>
+        </w:rPr>
+        <w:t xml:space="preserve"> from the sidebar and let the page settle. 3. Click the refresh icon beside the </w:t>
+      </w:r>
+      <w:r>
+        <w:rPr>
+          <w:sz w:val="22"/>
+          <w:b/>
+        </w:rPr>
+        <w:t xml:space="preserve">Payment Stats</w:t>
+      </w:r>
+      <w:r>
+        <w:rPr>
+          <w:sz w:val="22"/>
+        </w:rPr>
+        <w:t xml:space="preserve"> heading, once. 4. Watch the icon. It should spin while the page fetches. 5. Click it a second time and watch again.</w:t>
+      </w:r>
+    </w:p>
+    <w:p>
+      <w:pPr>
+        <w:spacing w:before="280" w:after="120"/>
+        <w:rPr>
+          <w:sz w:val="28"/>
+          <w:b/>
+        </w:rPr>
+      </w:pPr>
+      <w:r>
+        <w:rPr>
+          <w:sz w:val="28"/>
+          <w:b/>
+        </w:rPr>
+        <w:t xml:space="preserve">Expected result</w:t>
+      </w:r>
+    </w:p>
+    <w:p>
+      <w:pPr>
+        <w:spacing w:before="0" w:after="120"/>
+        <w:rPr>
+          <w:sz w:val="22"/>
+        </w:rPr>
+      </w:pPr>
+      <w:r>
+        <w:rPr>
+          <w:sz w:val="22"/>
+        </w:rPr>
+        <w:t xml:space="preserve">Every click on the refresh icon reloads the stats, and the icon spins while the request is in flight.</w:t>
+      </w:r>
+    </w:p>
+    <w:p>
+      <w:pPr>
+        <w:spacing w:before="280" w:after="120"/>
+        <w:rPr>
+          <w:sz w:val="28"/>
+          <w:b/>
+        </w:rPr>
+      </w:pPr>
+      <w:r>
+        <w:rPr>
+          <w:sz w:val="28"/>
+          <w:b/>
+        </w:rPr>
+        <w:t xml:space="preserve">Actual result</w:t>
+      </w:r>
+    </w:p>
+    <w:tbl>
+      <w:tblPr>
+        <w:tblW w:w="9360" w:type="dxa"/>
+        <w:tblBorders>
+          <w:top w:val="single" w:sz="4" w:space="0" w:color="BFBFBF"/>
+          <w:left w:val="single" w:sz="4" w:space="0" w:color="BFBFBF"/>
+          <w:bottom w:val="single" w:sz="4" w:space="0" w:color="BFBFBF"/>
+          <w:right w:val="single" w:sz="4" w:space="0" w:color="BFBFBF"/>
+          <w:insideH w:val="single" w:sz="4" w:space="0" w:color="BFBFBF"/>
+          <w:insideV w:val="single" w:sz="4" w:space="0" w:color="BFBFBF"/>
+        </w:tblBorders>
+      </w:tblPr>
+      <w:tr>
+        <w:tc>
+          <w:tcPr>
+            <w:tcW w:w="3120" w:type="dxa"/>
+            <w:shd w:val="clear" w:fill="F2F2F2"/>
+          </w:tcPr>
+          <w:p>
+            <w:pPr>
+              <w:spacing w:before="40" w:after="40"/>
+            </w:pPr>
+            <w:r>
+              <w:rPr>
+                <w:sz w:val="20"/>
+                <w:b/>
+              </w:rPr>
+              <w:t xml:space="preserve">Click</w:t>
+            </w:r>
+          </w:p>
+        </w:tc>
+        <w:tc>
+          <w:tcPr>
+            <w:tcW w:w="3120" w:type="dxa"/>
+            <w:shd w:val="clear" w:fill="F2F2F2"/>
+          </w:tcPr>
+          <w:p>
+            <w:pPr>
+              <w:spacing w:before="40" w:after="40"/>
+            </w:pPr>
+            <w:r>
+              <w:rPr>
+                <w:sz w:val="20"/>
+                <w:b/>
+              </w:rPr>
+              <w:t xml:space="preserve">Icon</w:t>
+            </w:r>
+          </w:p>
+        </w:tc>
+        <w:tc>
+          <w:tcPr>
+            <w:tcW w:w="3120" w:type="dxa"/>
+            <w:shd w:val="clear" w:fill="F2F2F2"/>
+          </w:tcPr>
+          <w:p>
+            <w:pPr>
+              <w:spacing w:before="40" w:after="40"/>
+            </w:pPr>
+            <w:r>
+              <w:rPr>
+                <w:sz w:val="20"/>
+                <w:b/>
+              </w:rPr>
+              <w:t xml:space="preserve">Request</w:t>
+            </w:r>
+          </w:p>
+        </w:tc>
+      </w:tr>
+      <w:tr>
+        <w:tc>
+          <w:tcPr>
+            <w:tcW w:w="3120" w:type="dxa"/>
+          </w:tcPr>
+          <w:p>
+            <w:pPr>
+              <w:spacing w:before="40" w:after="40"/>
+            </w:pPr>
+            <w:r>
+              <w:rPr>
+                <w:sz w:val="20"/>
+              </w:rPr>
+              <w:t xml:space="preserve">1st after page load</w:t>
+            </w:r>
+          </w:p>
+        </w:tc>
+        <w:tc>
+          <w:tcPr>
+            <w:tcW w:w="3120" w:type="dxa"/>
+          </w:tcPr>
+          <w:p>
+            <w:pPr>
+              <w:spacing w:before="40" w:after="40"/>
+            </w:pPr>
+            <w:r>
+              <w:rPr>
+                <w:sz w:val="20"/>
+              </w:rPr>
+              <w:t xml:space="preserve">never spins</w:t>
+            </w:r>
+          </w:p>
+        </w:tc>
+        <w:tc>
+          <w:tcPr>
+            <w:tcW w:w="3120" w:type="dxa"/>
+          </w:tcPr>
+          <w:p>
+            <w:pPr>
+              <w:spacing w:before="40" w:after="40"/>
+            </w:pPr>
+            <w:r>
+              <w:rPr>
+                <w:sz w:val="20"/>
+              </w:rPr>
+              <w:t xml:space="preserve">none sent</w:t>
+            </w:r>
+          </w:p>
+        </w:tc>
+      </w:tr>
+      <w:tr>
+        <w:tc>
+          <w:tcPr>
+            <w:tcW w:w="3120" w:type="dxa"/>
+          </w:tcPr>
+          <w:p>
+            <w:pPr>
+              <w:spacing w:before="40" w:after="40"/>
+            </w:pPr>
+            <w:r>
+              <w:rPr>
+                <w:sz w:val="20"/>
+              </w:rPr>
+              <w:t xml:space="preserve">2nd</w:t>
+            </w:r>
+          </w:p>
+        </w:tc>
+        <w:tc>
+          <w:tcPr>
+            <w:tcW w:w="3120" w:type="dxa"/>
+          </w:tcPr>
+          <w:p>
+            <w:pPr>
+              <w:spacing w:before="40" w:after="40"/>
+            </w:pPr>
+            <w:r>
+              <w:rPr>
+                <w:sz w:val="20"/>
+              </w:rPr>
+              <w:t xml:space="preserve">spins</w:t>
+            </w:r>
+          </w:p>
+        </w:tc>
+        <w:tc>
+          <w:tcPr>
+            <w:tcW w:w="3120" w:type="dxa"/>
+          </w:tcPr>
+          <w:p>
+            <w:pPr>
+              <w:spacing w:before="40" w:after="40"/>
+            </w:pPr>
+            <w:r>
+              <w:rPr>
+                <w:sz w:val="20"/>
+              </w:rPr>
+              <w:t xml:space="preserve">sent, HTTP 200</w:t>
+            </w:r>
+          </w:p>
+        </w:tc>
+      </w:tr>
+      <w:tr>
+        <w:tc>
+          <w:tcPr>
+            <w:tcW w:w="3120" w:type="dxa"/>
+          </w:tcPr>
+          <w:p>
+            <w:pPr>
+              <w:spacing w:before="40" w:after="40"/>
+            </w:pPr>
+            <w:r>
+              <w:rPr>
+                <w:sz w:val="20"/>
+              </w:rPr>
+              <w:t xml:space="preserve">3rd</w:t>
+            </w:r>
+          </w:p>
+        </w:tc>
+        <w:tc>
+          <w:tcPr>
+            <w:tcW w:w="3120" w:type="dxa"/>
+          </w:tcPr>
+          <w:p>
+            <w:pPr>
+              <w:spacing w:before="40" w:after="40"/>
+            </w:pPr>
+            <w:r>
+              <w:rPr>
+                <w:sz w:val="20"/>
+              </w:rPr>
+              <w:t xml:space="preserve">spins</w:t>
+            </w:r>
+          </w:p>
+        </w:tc>
+        <w:tc>
+          <w:tcPr>
+            <w:tcW w:w="3120" w:type="dxa"/>
+          </w:tcPr>
+          <w:p>
+            <w:pPr>
+              <w:spacing w:before="40" w:after="40"/>
+            </w:pPr>
+            <w:r>
+              <w:rPr>
+                <w:sz w:val="20"/>
+              </w:rPr>
+              <w:t xml:space="preserve">sent, HTTP 200</w:t>
+            </w:r>
+          </w:p>
+        </w:tc>
+      </w:tr>
+    </w:tbl>
+    <w:p>
+      <w:pPr>
+        <w:spacing w:after="120"/>
+      </w:pPr>
+    </w:p>
+    <w:p>
+      <w:pPr>
+        <w:spacing w:before="0" w:after="120"/>
+        <w:rPr>
+          <w:sz w:val="22"/>
+        </w:rPr>
+      </w:pPr>
+      <w:r>
+        <w:rPr>
+          <w:sz w:val="22"/>
+        </w:rPr>
+        <w:t xml:space="preserve">Measured on IPG by sampling the icon's class every 40 milliseconds, so a spin too brief to see would still have been caught. There was none on the first click.</w:t>
+      </w:r>
+    </w:p>
+    <w:p>
+      <w:pPr>
+        <w:spacing w:before="0" w:after="120"/>
+        <w:rPr>
+          <w:sz w:val="22"/>
+        </w:rPr>
+      </w:pPr>
+      <w:r>
+        <w:rPr>
+          <w:sz w:val="22"/>
+        </w:rPr>
+        <w:t xml:space="preserve">An earlier note recorded this as "the icon only works once a Submit has run". That is wrong and should not be relied on — a second refresh click is enough on its own, with no Submit involved.</w:t>
+      </w:r>
+    </w:p>
+    <w:p>
+      <w:pPr>
+        <w:spacing w:before="280" w:after="120"/>
+        <w:rPr>
+          <w:sz w:val="28"/>
+          <w:b/>
+        </w:rPr>
+      </w:pPr>
+      <w:r>
+        <w:rPr>
+          <w:sz w:val="28"/>
+          <w:b/>
+        </w:rPr>
+        <w:t xml:space="preserve">Impact</w:t>
+      </w:r>
+    </w:p>
+    <w:p>
+      <w:pPr>
+        <w:spacing w:before="0" w:after="120"/>
+        <w:rPr>
+          <w:sz w:val="22"/>
+        </w:rPr>
+      </w:pPr>
+      <w:r>
+        <w:rPr>
+          <w:sz w:val="22"/>
+        </w:rPr>
+        <w:t xml:space="preserve">Minor in effect but easy to hit: the merchant presses refresh, nothing happens, and there is no feedback at all. The natural reading is that the button is broken or the page is frozen.</w:t>
+      </w:r>
+    </w:p>
+    <w:p>
+      <w:pPr>
+        <w:spacing w:before="0" w:after="120"/>
+        <w:rPr>
+          <w:sz w:val="22"/>
+        </w:rPr>
+      </w:pPr>
+      <w:r>
+        <w:rPr>
+          <w:sz w:val="22"/>
+          <w:b/>
+        </w:rPr>
+        <w:t xml:space="preserve">Workaround:</w:t>
+      </w:r>
+      <w:r>
+        <w:rPr>
+          <w:sz w:val="22"/>
+        </w:rPr>
+        <w:t xml:space="preserve"> click it twice.</w:t>
+      </w:r>
+    </w:p>
+    <w:p>
+      <w:pPr>
+        <w:spacing w:before="280" w:after="120"/>
+        <w:rPr>
+          <w:sz w:val="28"/>
+          <w:b/>
+        </w:rPr>
+      </w:pPr>
+      <w:r>
+        <w:rPr>
+          <w:sz w:val="28"/>
+          <w:b/>
+        </w:rPr>
+        <w:t xml:space="preserve">Notes for the developer</w:t>
+      </w:r>
+    </w:p>
+    <w:p>
+      <w:pPr>
+        <w:spacing w:before="0" w:after="120"/>
+        <w:rPr>
+          <w:sz w:val="22"/>
+        </w:rPr>
+      </w:pPr>
+      <w:r>
+        <w:rPr>
+          <w:sz w:val="22"/>
+        </w:rPr>
+        <w:t xml:space="preserve">The cause is a React state read that happens before the state has been applied. The handler clears the date-set flag and then tests it on the next line:</w:t>
+      </w:r>
+    </w:p>
+    <w:p>
+      <w:pPr>
+        <w:spacing w:before="0" w:after="120"/>
+        <w:rPr>
+          <w:sz w:val="22"/>
+        </w:rPr>
+      </w:pPr>
+      <w:r>
+        <w:rPr>
+          <w:sz w:val="22"/>
+          <w:rFonts w:ascii="Consolas" w:hAnsi="Consolas"/>
+          <w:sz w:val="20"/>
+        </w:rPr>
+        <w:t xml:space="preserve"/>
+      </w:r>
+      <w:r>
+        <w:rPr>
+          <w:sz w:val="22"/>
+          <w:rFonts w:ascii="Consolas" w:hAnsi="Consolas"/>
+          <w:sz w:val="20"/>
+        </w:rPr>
+        <w:t xml:space="preserve"> setDateSet(false); if (!Isdateset) { ...fetch... } </w:t>
+      </w:r>
+      <w:r>
+        <w:rPr>
+          <w:sz w:val="22"/>
+          <w:rFonts w:ascii="Consolas" w:hAnsi="Consolas"/>
+          <w:sz w:val="20"/>
+        </w:rPr>
+        <w:t xml:space="preserve"/>
+      </w:r>
+    </w:p>
+    <w:p>
+      <w:pPr>
+        <w:spacing w:before="0" w:after="120"/>
+        <w:rPr>
+          <w:sz w:val="22"/>
+        </w:rPr>
+      </w:pPr>
+      <w:r>
+        <w:rPr>
+          <w:sz w:val="22"/>
+          <w:rFonts w:ascii="Consolas" w:hAnsi="Consolas"/>
+          <w:sz w:val="20"/>
+        </w:rPr>
+        <w:t xml:space="preserve">Isdateset</w:t>
+      </w:r>
+      <w:r>
+        <w:rPr>
+          <w:sz w:val="22"/>
+        </w:rPr>
+        <w:t xml:space="preserve"> still holds the previous value at that point, so the fetch is skipped. On the second click the flag has settled and the branch is taken.</w:t>
+      </w:r>
+    </w:p>
+    <w:p>
+      <w:pPr>
+        <w:spacing w:before="0" w:after="120"/>
+        <w:rPr>
+          <w:sz w:val="22"/>
+        </w:rPr>
+      </w:pPr>
+      <w:r>
+        <w:rPr>
+          <w:sz w:val="22"/>
+        </w:rPr>
+        <w:t xml:space="preserve">This is the same class of problem as reading a state variable immediately after setting it anywhere else in the page, so it is worth a look for the same pattern nearby.</w:t>
+      </w:r>
+    </w:p>
     <w:sectPr>
       <w:pgSz w:w="12240" w:h="15840"/>
       <w:pgMar w:top="1440" w:right="1440" w:bottom="1440" w:left="1440"/>

</xml_diff>

<commit_message>
Add PS-NEG-11, and correct the claim that the failure is silent
A page refresh re-sends the stats request with an empty sub_merchant_id, the
server answers 400 and the table empties to "No rows". Two SnapPay
screenshots: the populated table reached through the sidebar, then the same
page after F5.

CORRECTION. The record said nothing is shown to the user. That is wrong. A red
toast appears carrying the server's message, "sub_merchant_id is required".
It is useless to a merchant and leaks an internal parameter name, but it is
not silence.

The silence measured under PS-NEG-01 was for a BLOCKED request, where no
response arrives and the page's handler never runs. When the server does
answer with an error, its message is shown. Both rows in the sheet now say so,
and the report describes what is actually on screen.
</commit_message>
<xml_diff>
--- a/PaymentStats_Bugs.docx
+++ b/PaymentStats_Bugs.docx
@@ -589,6 +589,88 @@
                 <w:sz w:val="20"/>
               </w:rPr>
               <w:t xml:space="preserve">MerchantE</w:t>
+            </w:r>
+          </w:p>
+        </w:tc>
+      </w:tr>
+      <w:tr>
+        <w:tc>
+          <w:tcPr>
+            <w:tcW w:w="1872" w:type="dxa"/>
+          </w:tcPr>
+          <w:p>
+            <w:pPr>
+              <w:spacing w:before="40" w:after="40"/>
+            </w:pPr>
+            <w:r>
+              <w:rPr>
+                <w:sz w:val="20"/>
+              </w:rPr>
+              <w:t xml:space="preserve">6</w:t>
+            </w:r>
+          </w:p>
+        </w:tc>
+        <w:tc>
+          <w:tcPr>
+            <w:tcW w:w="1872" w:type="dxa"/>
+          </w:tcPr>
+          <w:p>
+            <w:pPr>
+              <w:spacing w:before="40" w:after="40"/>
+            </w:pPr>
+            <w:r>
+              <w:rPr>
+                <w:sz w:val="20"/>
+              </w:rPr>
+              <w:t xml:space="preserve">PS-NEG-11</w:t>
+            </w:r>
+          </w:p>
+        </w:tc>
+        <w:tc>
+          <w:tcPr>
+            <w:tcW w:w="1872" w:type="dxa"/>
+          </w:tcPr>
+          <w:p>
+            <w:pPr>
+              <w:spacing w:before="40" w:after="40"/>
+            </w:pPr>
+            <w:r>
+              <w:rPr>
+                <w:sz w:val="20"/>
+              </w:rPr>
+              <w:t xml:space="preserve">A page refresh empties the table</w:t>
+            </w:r>
+          </w:p>
+        </w:tc>
+        <w:tc>
+          <w:tcPr>
+            <w:tcW w:w="1872" w:type="dxa"/>
+          </w:tcPr>
+          <w:p>
+            <w:pPr>
+              <w:spacing w:before="40" w:after="40"/>
+            </w:pPr>
+            <w:r>
+              <w:rPr>
+                <w:sz w:val="20"/>
+              </w:rPr>
+              <w:t xml:space="preserve">Critical</w:t>
+            </w:r>
+          </w:p>
+        </w:tc>
+        <w:tc>
+          <w:tcPr>
+            <w:tcW w:w="1872" w:type="dxa"/>
+          </w:tcPr>
+          <w:p>
+            <w:pPr>
+              <w:spacing w:before="40" w:after="40"/>
+            </w:pPr>
+            <w:r>
+              <w:rPr>
+                <w:sz w:val="20"/>
+              </w:rPr>
+              <w:t xml:space="preserve">all gateways</w:t>
             </w:r>
           </w:p>
         </w:tc>
@@ -4851,6 +4933,675 @@
         <w:t xml:space="preserve">• An earlier note recorded this case as blocked because MerchantE returned an error. That is no longer true and should not be relied on: the request succeeds.</w:t>
       </w:r>
     </w:p>
+    <w:p>
+      <w:pPr>
+        <w:spacing w:before="0" w:after="200"/>
+        <w:rPr>
+          <w:sz w:val="36"/>
+          <w:b/>
+        </w:rPr>
+      </w:pPr>
+      <w:r>
+        <w:rPr>
+          <w:sz w:val="36"/>
+          <w:b/>
+        </w:rPr>
+        <w:t xml:space="preserve">6. PS-NEG-11 — a page refresh empties the table</w:t>
+      </w:r>
+    </w:p>
+    <w:p>
+      <w:pPr>
+        <w:spacing w:before="0" w:after="120"/>
+        <w:rPr>
+          <w:sz w:val="22"/>
+        </w:rPr>
+      </w:pPr>
+      <w:r>
+        <w:rPr>
+          <w:sz w:val="22"/>
+          <w:b/>
+        </w:rPr>
+        <w:t xml:space="preserve">Test case:</w:t>
+      </w:r>
+      <w:r>
+        <w:rPr>
+          <w:sz w:val="22"/>
+        </w:rPr>
+        <w:t xml:space="preserve"> PS-NEG-11 </w:t>
+      </w:r>
+      <w:r>
+        <w:rPr>
+          <w:sz w:val="22"/>
+          <w:b/>
+        </w:rPr>
+        <w:t xml:space="preserve">Priority:</w:t>
+      </w:r>
+      <w:r>
+        <w:rPr>
+          <w:sz w:val="22"/>
+        </w:rPr>
+        <w:t xml:space="preserve"> Critical </w:t>
+      </w:r>
+      <w:r>
+        <w:rPr>
+          <w:sz w:val="22"/>
+          <w:b/>
+        </w:rPr>
+        <w:t xml:space="preserve">Gateways:</w:t>
+      </w:r>
+      <w:r>
+        <w:rPr>
+          <w:sz w:val="22"/>
+        </w:rPr>
+        <w:t xml:space="preserve"> all — seen on IPG and SnapPay </w:t>
+      </w:r>
+      <w:r>
+        <w:rPr>
+          <w:sz w:val="22"/>
+          <w:b/>
+        </w:rPr>
+        <w:t xml:space="preserve">Date observed:</w:t>
+      </w:r>
+      <w:r>
+        <w:rPr>
+          <w:sz w:val="22"/>
+        </w:rPr>
+        <w:t xml:space="preserve"> 14 September 2026, re-confirmed 23 September 2026</w:t>
+      </w:r>
+    </w:p>
+    <w:p>
+      <w:pPr>
+        <w:spacing w:before="280" w:after="120"/>
+        <w:rPr>
+          <w:sz w:val="28"/>
+          <w:b/>
+        </w:rPr>
+      </w:pPr>
+      <w:r>
+        <w:rPr>
+          <w:sz w:val="28"/>
+          <w:b/>
+        </w:rPr>
+        <w:t xml:space="preserve">Summary</w:t>
+      </w:r>
+    </w:p>
+    <w:p>
+      <w:pPr>
+        <w:spacing w:before="0" w:after="120"/>
+        <w:rPr>
+          <w:sz w:val="22"/>
+        </w:rPr>
+      </w:pPr>
+      <w:r>
+        <w:rPr>
+          <w:sz w:val="22"/>
+        </w:rPr>
+        <w:t xml:space="preserve">Reaching Payment Stats through the sidebar works normally. Pressing F5 on that same page re-sends the request with an </w:t>
+      </w:r>
+      <w:r>
+        <w:rPr>
+          <w:sz w:val="22"/>
+          <w:b/>
+        </w:rPr>
+        <w:t xml:space="preserve">empty</w:t>
+      </w:r>
+      <w:r>
+        <w:rPr>
+          <w:sz w:val="22"/>
+        </w:rPr>
+        <w:t xml:space="preserve"> </w:t>
+      </w:r>
+      <w:r>
+        <w:rPr>
+          <w:sz w:val="22"/>
+          <w:rFonts w:ascii="Consolas" w:hAnsi="Consolas"/>
+          <w:sz w:val="20"/>
+        </w:rPr>
+        <w:t xml:space="preserve">sub_merchant_id</w:t>
+      </w:r>
+      <w:r>
+        <w:rPr>
+          <w:sz w:val="22"/>
+        </w:rPr>
+        <w:t xml:space="preserve">, the server rejects it, and the table empties.</w:t>
+      </w:r>
+    </w:p>
+    <w:p>
+      <w:pPr>
+        <w:spacing w:before="0" w:after="120"/>
+        <w:rPr>
+          <w:sz w:val="22"/>
+        </w:rPr>
+      </w:pPr>
+      <w:r>
+        <w:rPr>
+          <w:sz w:val="22"/>
+        </w:rPr>
+        <w:t xml:space="preserve">The merchant has done nothing unusual. Refreshing a page is the most ordinary action there is, and here it wipes the screen.</w:t>
+      </w:r>
+    </w:p>
+    <w:p>
+      <w:pPr>
+        <w:spacing w:before="280" w:after="120"/>
+        <w:rPr>
+          <w:sz w:val="28"/>
+          <w:b/>
+        </w:rPr>
+      </w:pPr>
+      <w:r>
+        <w:rPr>
+          <w:sz w:val="28"/>
+          <w:b/>
+        </w:rPr>
+        <w:t xml:space="preserve">Steps to reproduce</w:t>
+      </w:r>
+    </w:p>
+    <w:p>
+      <w:pPr>
+        <w:spacing w:before="0" w:after="120"/>
+        <w:rPr>
+          <w:sz w:val="22"/>
+        </w:rPr>
+      </w:pPr>
+      <w:r>
+        <w:rPr>
+          <w:sz w:val="22"/>
+        </w:rPr>
+        <w:t xml:space="preserve">1. Sign in on any gateway. 2. Go to </w:t>
+      </w:r>
+      <w:r>
+        <w:rPr>
+          <w:sz w:val="22"/>
+          <w:b/>
+        </w:rPr>
+        <w:t xml:space="preserve">Payment Analytics → Payment Stats</w:t>
+      </w:r>
+      <w:r>
+        <w:rPr>
+          <w:sz w:val="22"/>
+        </w:rPr>
+        <w:t xml:space="preserve"> from the sidebar. The table fills normally. 3. Press </w:t>
+      </w:r>
+      <w:r>
+        <w:rPr>
+          <w:sz w:val="22"/>
+          <w:b/>
+        </w:rPr>
+        <w:t xml:space="preserve">F5</w:t>
+      </w:r>
+      <w:r>
+        <w:rPr>
+          <w:sz w:val="22"/>
+        </w:rPr>
+        <w:t xml:space="preserve"> on that same page. 4. Look at the table. 5. Go back to the page through the sidebar — the data returns.</w:t>
+      </w:r>
+    </w:p>
+    <w:p>
+      <w:pPr>
+        <w:spacing w:before="280" w:after="120"/>
+        <w:rPr>
+          <w:sz w:val="28"/>
+          <w:b/>
+        </w:rPr>
+      </w:pPr>
+      <w:r>
+        <w:rPr>
+          <w:sz w:val="28"/>
+          <w:b/>
+        </w:rPr>
+        <w:t xml:space="preserve">Expected result</w:t>
+      </w:r>
+    </w:p>
+    <w:p>
+      <w:pPr>
+        <w:spacing w:before="0" w:after="120"/>
+        <w:rPr>
+          <w:sz w:val="22"/>
+        </w:rPr>
+      </w:pPr>
+      <w:r>
+        <w:rPr>
+          <w:sz w:val="22"/>
+        </w:rPr>
+        <w:t xml:space="preserve">The page loads its data whichever way it is reached. A refresh shows the same figures as before.</w:t>
+      </w:r>
+    </w:p>
+    <w:p>
+      <w:pPr>
+        <w:spacing w:before="280" w:after="120"/>
+        <w:rPr>
+          <w:sz w:val="28"/>
+          <w:b/>
+        </w:rPr>
+      </w:pPr>
+      <w:r>
+        <w:rPr>
+          <w:sz w:val="28"/>
+          <w:b/>
+        </w:rPr>
+        <w:t xml:space="preserve">Actual result</w:t>
+      </w:r>
+    </w:p>
+    <w:p>
+      <w:pPr>
+        <w:spacing w:before="0" w:after="120"/>
+        <w:rPr>
+          <w:sz w:val="22"/>
+        </w:rPr>
+      </w:pPr>
+      <w:r>
+        <w:rPr>
+          <w:sz w:val="22"/>
+        </w:rPr>
+        <w:t xml:space="preserve">The table empties and reads </w:t>
+      </w:r>
+      <w:r>
+        <w:rPr>
+          <w:sz w:val="22"/>
+          <w:b/>
+        </w:rPr>
+        <w:t xml:space="preserve">No rows</w:t>
+      </w:r>
+      <w:r>
+        <w:rPr>
+          <w:sz w:val="22"/>
+        </w:rPr>
+        <w:t xml:space="preserve">. A red toast appears carrying the server's rejection:</w:t>
+      </w:r>
+    </w:p>
+    <w:p>
+      <w:pPr>
+        <w:spacing w:before="0" w:after="120"/>
+        <w:rPr>
+          <w:sz w:val="22"/>
+        </w:rPr>
+      </w:pPr>
+      <w:r>
+        <w:rPr>
+          <w:sz w:val="22"/>
+          <w:rFonts w:ascii="Consolas" w:hAnsi="Consolas"/>
+          <w:sz w:val="20"/>
+        </w:rPr>
+        <w:t xml:space="preserve"/>
+      </w:r>
+      <w:r>
+        <w:rPr>
+          <w:sz w:val="22"/>
+          <w:rFonts w:ascii="Consolas" w:hAnsi="Consolas"/>
+          <w:sz w:val="20"/>
+        </w:rPr>
+        <w:t xml:space="preserve"> sub_merchant_id is required </w:t>
+      </w:r>
+      <w:r>
+        <w:rPr>
+          <w:sz w:val="22"/>
+          <w:rFonts w:ascii="Consolas" w:hAnsi="Consolas"/>
+          <w:sz w:val="20"/>
+        </w:rPr>
+        <w:t xml:space="preserve"/>
+      </w:r>
+    </w:p>
+    <w:p>
+      <w:pPr>
+        <w:spacing w:before="0" w:after="120"/>
+        <w:rPr>
+          <w:sz w:val="22"/>
+        </w:rPr>
+      </w:pPr>
+      <w:r>
+        <w:rPr>
+          <w:sz w:val="22"/>
+        </w:rPr>
+        <w:t xml:space="preserve">The request that went out had </w:t>
+      </w:r>
+      <w:r>
+        <w:rPr>
+          <w:sz w:val="22"/>
+          <w:rFonts w:ascii="Consolas" w:hAnsi="Consolas"/>
+          <w:sz w:val="20"/>
+        </w:rPr>
+        <w:t xml:space="preserve">sub_merchant_id</w:t>
+      </w:r>
+      <w:r>
+        <w:rPr>
+          <w:sz w:val="22"/>
+        </w:rPr>
+        <w:t xml:space="preserve"> empty, so the server answered 400.</w:t>
+      </w:r>
+    </w:p>
+    <w:p>
+      <w:pPr>
+        <w:spacing w:before="280" w:after="120"/>
+        <w:rPr>
+          <w:sz w:val="28"/>
+          <w:b/>
+        </w:rPr>
+      </w:pPr>
+      <w:r>
+        <w:rPr>
+          <w:sz w:val="28"/>
+          <w:b/>
+        </w:rPr>
+        <w:t xml:space="preserve">Evidence</w:t>
+      </w:r>
+    </w:p>
+    <w:p>
+      <w:pPr>
+        <w:spacing w:before="240" w:after="100"/>
+        <w:rPr>
+          <w:sz w:val="24"/>
+          <w:b/>
+        </w:rPr>
+      </w:pPr>
+      <w:r>
+        <w:rPr>
+          <w:sz w:val="24"/>
+          <w:b/>
+        </w:rPr>
+        <w:t xml:space="preserve">Before the refresh — the table is populated</w:t>
+      </w:r>
+    </w:p>
+    <w:p>
+      <w:pPr>
+        <w:spacing w:before="80" w:after="200"/>
+      </w:pPr>
+      <w:r>
+        <w:drawing>
+          <wp:inline distT="0" distB="0" distL="0" distR="0">
+            <wp:extent cx="5943600" cy="3343275"/>
+            <wp:docPr id="109" name="Picture 109"/>
+            <a:graphic xmlns:a="http://schemas.openxmlformats.org/drawingml/2006/main">
+              <a:graphicData uri="http://schemas.openxmlformats.org/drawingml/2006/picture">
+                <pic:pic xmlns:pic="http://schemas.openxmlformats.org/drawingml/2006/picture">
+                  <pic:nvPicPr>
+                    <pic:cNvPr id="109" name="Picture"/>
+                    <pic:cNvPicPr/>
+                  </pic:nvPicPr>
+                  <pic:blipFill>
+                    <a:blip r:embed="rId109"/>
+                    <a:stretch>
+                      <a:fillRect/>
+                    </a:stretch>
+                  </pic:blipFill>
+                  <pic:spPr>
+                    <a:xfrm>
+                      <a:off x="0" y="0"/>
+                      <a:ext cx="5943600" cy="3343275"/>
+                    </a:xfrm>
+                    <a:prstGeom prst="rect">
+                      <a:avLst/>
+                    </a:prstGeom>
+                  </pic:spPr>
+                </pic:pic>
+              </a:graphicData>
+            </a:graphic>
+          </wp:inline>
+        </w:drawing>
+      </w:r>
+    </w:p>
+    <w:p>
+      <w:pPr>
+        <w:spacing w:before="0" w:after="120"/>
+        <w:rPr>
+          <w:sz w:val="22"/>
+        </w:rPr>
+      </w:pPr>
+      <w:r>
+        <w:rPr>
+          <w:sz w:val="22"/>
+        </w:rPr>
+        <w:t xml:space="preserve">SnapPay, reached through the sidebar. Six CardSale rows with amounts, fees and counts.</w:t>
+      </w:r>
+    </w:p>
+    <w:p>
+      <w:pPr>
+        <w:spacing w:before="240" w:after="100"/>
+        <w:rPr>
+          <w:sz w:val="24"/>
+          <w:b/>
+        </w:rPr>
+      </w:pPr>
+      <w:r>
+        <w:rPr>
+          <w:sz w:val="24"/>
+          <w:b/>
+        </w:rPr>
+        <w:t xml:space="preserve">After pressing F5 — No rows, and the server's rejection</w:t>
+      </w:r>
+    </w:p>
+    <w:p>
+      <w:pPr>
+        <w:spacing w:before="80" w:after="200"/>
+      </w:pPr>
+      <w:r>
+        <w:drawing>
+          <wp:inline distT="0" distB="0" distL="0" distR="0">
+            <wp:extent cx="5943600" cy="3343275"/>
+            <wp:docPr id="110" name="Picture 110"/>
+            <a:graphic xmlns:a="http://schemas.openxmlformats.org/drawingml/2006/main">
+              <a:graphicData uri="http://schemas.openxmlformats.org/drawingml/2006/picture">
+                <pic:pic xmlns:pic="http://schemas.openxmlformats.org/drawingml/2006/picture">
+                  <pic:nvPicPr>
+                    <pic:cNvPr id="110" name="Picture"/>
+                    <pic:cNvPicPr/>
+                  </pic:nvPicPr>
+                  <pic:blipFill>
+                    <a:blip r:embed="rId110"/>
+                    <a:stretch>
+                      <a:fillRect/>
+                    </a:stretch>
+                  </pic:blipFill>
+                  <pic:spPr>
+                    <a:xfrm>
+                      <a:off x="0" y="0"/>
+                      <a:ext cx="5943600" cy="3343275"/>
+                    </a:xfrm>
+                    <a:prstGeom prst="rect">
+                      <a:avLst/>
+                    </a:prstGeom>
+                  </pic:spPr>
+                </pic:pic>
+              </a:graphicData>
+            </a:graphic>
+          </wp:inline>
+        </w:drawing>
+      </w:r>
+    </w:p>
+    <w:p>
+      <w:pPr>
+        <w:spacing w:before="0" w:after="120"/>
+        <w:rPr>
+          <w:sz w:val="22"/>
+        </w:rPr>
+      </w:pPr>
+      <w:r>
+        <w:rPr>
+          <w:sz w:val="22"/>
+        </w:rPr>
+        <w:t xml:space="preserve">The same page seconds later. The column headings remain, the body reads </w:t>
+      </w:r>
+      <w:r>
+        <w:rPr>
+          <w:sz w:val="22"/>
+          <w:b/>
+        </w:rPr>
+        <w:t xml:space="preserve">No rows</w:t>
+      </w:r>
+      <w:r>
+        <w:rPr>
+          <w:sz w:val="22"/>
+        </w:rPr>
+        <w:t xml:space="preserve">, and a red toast carries </w:t>
+      </w:r>
+      <w:r>
+        <w:rPr>
+          <w:sz w:val="22"/>
+          <w:rFonts w:ascii="Consolas" w:hAnsi="Consolas"/>
+          <w:sz w:val="20"/>
+        </w:rPr>
+        <w:t xml:space="preserve">sub_merchant_id is required</w:t>
+      </w:r>
+      <w:r>
+        <w:rPr>
+          <w:sz w:val="22"/>
+        </w:rPr>
+        <w:t xml:space="preserve">. The sub-merchant selector at the top still shows </w:t>
+      </w:r>
+      <w:r>
+        <w:rPr>
+          <w:sz w:val="22"/>
+          <w:rFonts w:ascii="Consolas" w:hAnsi="Consolas"/>
+          <w:sz w:val="20"/>
+        </w:rPr>
+        <w:t xml:space="preserve">989510541880</w:t>
+      </w:r>
+      <w:r>
+        <w:rPr>
+          <w:sz w:val="22"/>
+        </w:rPr>
+        <w:t xml:space="preserve">, so the page knows which sub-merchant it is on — it simply did not send it.</w:t>
+      </w:r>
+    </w:p>
+    <w:p>
+      <w:pPr>
+        <w:spacing w:before="280" w:after="120"/>
+        <w:rPr>
+          <w:sz w:val="28"/>
+          <w:b/>
+        </w:rPr>
+      </w:pPr>
+      <w:r>
+        <w:rPr>
+          <w:sz w:val="28"/>
+          <w:b/>
+        </w:rPr>
+        <w:t xml:space="preserve">Impact</w:t>
+      </w:r>
+    </w:p>
+    <w:p>
+      <w:pPr>
+        <w:spacing w:before="0" w:after="120"/>
+        <w:rPr>
+          <w:sz w:val="22"/>
+        </w:rPr>
+      </w:pPr>
+      <w:r>
+        <w:rPr>
+          <w:sz w:val="22"/>
+        </w:rPr>
+        <w:t xml:space="preserve">Any merchant who refreshes loses their data. There is no reason to expect that, and no obvious way back other than navigating away and returning.</w:t>
+      </w:r>
+    </w:p>
+    <w:p>
+      <w:pPr>
+        <w:spacing w:before="0" w:after="120"/>
+        <w:rPr>
+          <w:sz w:val="22"/>
+        </w:rPr>
+      </w:pPr>
+      <w:r>
+        <w:rPr>
+          <w:sz w:val="22"/>
+        </w:rPr>
+        <w:t xml:space="preserve">The message shown does not help them. </w:t>
+      </w:r>
+      <w:r>
+        <w:rPr>
+          <w:sz w:val="22"/>
+          <w:rFonts w:ascii="Consolas" w:hAnsi="Consolas"/>
+          <w:sz w:val="20"/>
+        </w:rPr>
+        <w:t xml:space="preserve">sub_merchant_id is required</w:t>
+      </w:r>
+      <w:r>
+        <w:rPr>
+          <w:sz w:val="22"/>
+        </w:rPr>
+        <w:t xml:space="preserve"> is the API's internal parameter name — it tells a developer what went wrong and tells a merchant nothing they can act on. It also leaks an internal field name into the customer-facing UI.</w:t>
+      </w:r>
+    </w:p>
+    <w:p>
+      <w:pPr>
+        <w:spacing w:before="0" w:after="120"/>
+        <w:rPr>
+          <w:sz w:val="22"/>
+        </w:rPr>
+      </w:pPr>
+      <w:r>
+        <w:rPr>
+          <w:sz w:val="22"/>
+          <w:b/>
+        </w:rPr>
+        <w:t xml:space="preserve">Workaround:</w:t>
+      </w:r>
+      <w:r>
+        <w:rPr>
+          <w:sz w:val="22"/>
+        </w:rPr>
+        <w:t xml:space="preserve"> navigate to the page from the sidebar instead of refreshing.</w:t>
+      </w:r>
+    </w:p>
+    <w:p>
+      <w:pPr>
+        <w:spacing w:before="280" w:after="120"/>
+        <w:rPr>
+          <w:sz w:val="28"/>
+          <w:b/>
+        </w:rPr>
+      </w:pPr>
+      <w:r>
+        <w:rPr>
+          <w:sz w:val="28"/>
+          <w:b/>
+        </w:rPr>
+        <w:t xml:space="preserve">Notes for the developer</w:t>
+      </w:r>
+    </w:p>
+    <w:p>
+      <w:pPr>
+        <w:spacing w:before="0" w:after="80"/>
+        <w:ind w:left="360"/>
+        <w:rPr>
+          <w:sz w:val="22"/>
+        </w:rPr>
+      </w:pPr>
+      <w:r>
+        <w:rPr>
+          <w:sz w:val="22"/>
+        </w:rPr>
+        <w:t xml:space="preserve">• The sub-merchant is known at the point of the refresh — the selector still displays it — so the value exists and is simply not included in the request that follows a reload.</w:t>
+      </w:r>
+    </w:p>
+    <w:p>
+      <w:pPr>
+        <w:spacing w:before="0" w:after="80"/>
+        <w:ind w:left="360"/>
+        <w:rPr>
+          <w:sz w:val="22"/>
+        </w:rPr>
+      </w:pPr>
+      <w:r>
+        <w:rPr>
+          <w:sz w:val="22"/>
+        </w:rPr>
+        <w:t xml:space="preserve">• The same request built from sidebar navigation carries it correctly. Comparing those two paths is the shortest route to the cause.</w:t>
+      </w:r>
+    </w:p>
+    <w:p>
+      <w:pPr>
+        <w:spacing w:before="0" w:after="80"/>
+        <w:ind w:left="360"/>
+        <w:rPr>
+          <w:sz w:val="22"/>
+        </w:rPr>
+      </w:pPr>
+      <w:r>
+        <w:rPr>
+          <w:sz w:val="22"/>
+        </w:rPr>
+        <w:t xml:space="preserve">• Worth reviewing what the merchant is shown when the server rejects a request. Passing the API's message straight through exposes parameter names and gives no guidance.</w:t>
+      </w:r>
+    </w:p>
     <w:sectPr>
       <w:pgSz w:w="12240" w:h="15840"/>
       <w:pgMar w:top="1440" w:right="1440" w:bottom="1440" w:left="1440"/>

</xml_diff>

<commit_message>
Add PS-NEG-02 to the Payment Stats defects document
A failed stats request leaves the previous figures on screen with no message,
so the merchant reads them as the answer to the date range they just asked for.
The two screenshots are the evidence: the tables either side of the failure are
identical while the From Date has changed from 08/25/2026 to 07/24/2026.

The section also records that the failure handler throws three times over, and
that two of those three are logged at info and log level rather than error, so
they are invisible to anyone filtering the console on Errors only. That is
called out explicitly because it hid two of the faults during testing.
</commit_message>
<xml_diff>
--- a/PaymentStats_Bugs.docx
+++ b/PaymentStats_Bugs.docx
@@ -76,7 +76,7 @@
         <w:rPr>
           <w:sz w:val="22"/>
         </w:rPr>
-        <w:t xml:space="preserve"> 23 September 2026</w:t>
+        <w:t xml:space="preserve"> 24 September 2026</w:t>
       </w:r>
     </w:p>
     <w:tbl>
@@ -655,6 +655,88 @@
                 <w:sz w:val="20"/>
               </w:rPr>
               <w:t xml:space="preserve">Critical</w:t>
+            </w:r>
+          </w:p>
+        </w:tc>
+        <w:tc>
+          <w:tcPr>
+            <w:tcW w:w="1872" w:type="dxa"/>
+          </w:tcPr>
+          <w:p>
+            <w:pPr>
+              <w:spacing w:before="40" w:after="40"/>
+            </w:pPr>
+            <w:r>
+              <w:rPr>
+                <w:sz w:val="20"/>
+              </w:rPr>
+              <w:t xml:space="preserve">all gateways</w:t>
+            </w:r>
+          </w:p>
+        </w:tc>
+      </w:tr>
+      <w:tr>
+        <w:tc>
+          <w:tcPr>
+            <w:tcW w:w="1872" w:type="dxa"/>
+          </w:tcPr>
+          <w:p>
+            <w:pPr>
+              <w:spacing w:before="40" w:after="40"/>
+            </w:pPr>
+            <w:r>
+              <w:rPr>
+                <w:sz w:val="20"/>
+              </w:rPr>
+              <w:t xml:space="preserve">7</w:t>
+            </w:r>
+          </w:p>
+        </w:tc>
+        <w:tc>
+          <w:tcPr>
+            <w:tcW w:w="1872" w:type="dxa"/>
+          </w:tcPr>
+          <w:p>
+            <w:pPr>
+              <w:spacing w:before="40" w:after="40"/>
+            </w:pPr>
+            <w:r>
+              <w:rPr>
+                <w:sz w:val="20"/>
+              </w:rPr>
+              <w:t xml:space="preserve">PS-NEG-02</w:t>
+            </w:r>
+          </w:p>
+        </w:tc>
+        <w:tc>
+          <w:tcPr>
+            <w:tcW w:w="1872" w:type="dxa"/>
+          </w:tcPr>
+          <w:p>
+            <w:pPr>
+              <w:spacing w:before="40" w:after="40"/>
+            </w:pPr>
+            <w:r>
+              <w:rPr>
+                <w:sz w:val="20"/>
+              </w:rPr>
+              <w:t xml:space="preserve">A failed request leaves the old figures on screen and says nothing</w:t>
+            </w:r>
+          </w:p>
+        </w:tc>
+        <w:tc>
+          <w:tcPr>
+            <w:tcW w:w="1872" w:type="dxa"/>
+          </w:tcPr>
+          <w:p>
+            <w:pPr>
+              <w:spacing w:before="40" w:after="40"/>
+            </w:pPr>
+            <w:r>
+              <w:rPr>
+                <w:sz w:val="20"/>
+              </w:rPr>
+              <w:t xml:space="preserve">High</w:t>
             </w:r>
           </w:p>
         </w:tc>
@@ -5602,6 +5684,1333 @@
         <w:t xml:space="preserve">• Worth reviewing what the merchant is shown when the server rejects a request. Passing the API's message straight through exposes parameter names and gives no guidance.</w:t>
       </w:r>
     </w:p>
+    <w:p>
+      <w:pPr>
+        <w:spacing w:before="0" w:after="200"/>
+        <w:rPr>
+          <w:sz w:val="36"/>
+          <w:b/>
+        </w:rPr>
+      </w:pPr>
+      <w:r>
+        <w:rPr>
+          <w:sz w:val="36"/>
+          <w:b/>
+        </w:rPr>
+        <w:t xml:space="preserve">7. PS-NEG-02 — a failed request leaves the old figures on screen and says nothing</w:t>
+      </w:r>
+    </w:p>
+    <w:p>
+      <w:pPr>
+        <w:spacing w:before="0" w:after="120"/>
+        <w:rPr>
+          <w:sz w:val="22"/>
+        </w:rPr>
+      </w:pPr>
+      <w:r>
+        <w:rPr>
+          <w:sz w:val="22"/>
+          <w:b/>
+        </w:rPr>
+        <w:t xml:space="preserve">Test case:</w:t>
+      </w:r>
+      <w:r>
+        <w:rPr>
+          <w:sz w:val="22"/>
+        </w:rPr>
+        <w:t xml:space="preserve"> PS-NEG-02 </w:t>
+      </w:r>
+      <w:r>
+        <w:rPr>
+          <w:sz w:val="22"/>
+          <w:b/>
+        </w:rPr>
+        <w:t xml:space="preserve">Priority:</w:t>
+      </w:r>
+      <w:r>
+        <w:rPr>
+          <w:sz w:val="22"/>
+        </w:rPr>
+        <w:t xml:space="preserve"> High </w:t>
+      </w:r>
+      <w:r>
+        <w:rPr>
+          <w:sz w:val="22"/>
+          <w:b/>
+        </w:rPr>
+        <w:t xml:space="preserve">Gateways:</w:t>
+      </w:r>
+      <w:r>
+        <w:rPr>
+          <w:sz w:val="22"/>
+        </w:rPr>
+        <w:t xml:space="preserve"> all — measured on IPG, reproduced on wglUsa </w:t>
+      </w:r>
+      <w:r>
+        <w:rPr>
+          <w:sz w:val="22"/>
+          <w:b/>
+        </w:rPr>
+        <w:t xml:space="preserve">Date observed:</w:t>
+      </w:r>
+      <w:r>
+        <w:rPr>
+          <w:sz w:val="22"/>
+        </w:rPr>
+        <w:t xml:space="preserve"> 24 September 2026</w:t>
+      </w:r>
+    </w:p>
+    <w:p>
+      <w:pPr>
+        <w:spacing w:before="280" w:after="120"/>
+        <w:rPr>
+          <w:sz w:val="28"/>
+          <w:b/>
+        </w:rPr>
+      </w:pPr>
+      <w:r>
+        <w:rPr>
+          <w:sz w:val="28"/>
+          <w:b/>
+        </w:rPr>
+        <w:t xml:space="preserve">Summary</w:t>
+      </w:r>
+    </w:p>
+    <w:p>
+      <w:pPr>
+        <w:spacing w:before="0" w:after="120"/>
+        <w:rPr>
+          <w:sz w:val="22"/>
+        </w:rPr>
+      </w:pPr>
+      <w:r>
+        <w:rPr>
+          <w:sz w:val="22"/>
+        </w:rPr>
+        <w:t xml:space="preserve">When the stats request fails, the page does two things wrong at once.</w:t>
+      </w:r>
+    </w:p>
+    <w:p>
+      <w:pPr>
+        <w:spacing w:before="0" w:after="120"/>
+        <w:rPr>
+          <w:sz w:val="22"/>
+        </w:rPr>
+      </w:pPr>
+      <w:r>
+        <w:rPr>
+          <w:sz w:val="22"/>
+        </w:rPr>
+        <w:t xml:space="preserve">On screen, it keeps showing the </w:t>
+      </w:r>
+      <w:r>
+        <w:rPr>
+          <w:sz w:val="22"/>
+          <w:b/>
+        </w:rPr>
+        <w:t xml:space="preserve">previous</w:t>
+      </w:r>
+      <w:r>
+        <w:rPr>
+          <w:sz w:val="22"/>
+        </w:rPr>
+        <w:t xml:space="preserve"> results and gives no message. The merchant picked a new date range, pressed Submit, and is now looking at figures that answer the old one. Nothing on the page suggests anything went wrong.</w:t>
+      </w:r>
+    </w:p>
+    <w:p>
+      <w:pPr>
+        <w:spacing w:before="0" w:after="120"/>
+        <w:rPr>
+          <w:sz w:val="22"/>
+        </w:rPr>
+      </w:pPr>
+      <w:r>
+        <w:rPr>
+          <w:sz w:val="22"/>
+        </w:rPr>
+        <w:t xml:space="preserve">Behind that, the code meant to report the failure crashes three times over. It reads fields off a response that was never received.</w:t>
+      </w:r>
+    </w:p>
+    <w:p>
+      <w:pPr>
+        <w:spacing w:before="0" w:after="120"/>
+        <w:rPr>
+          <w:sz w:val="22"/>
+        </w:rPr>
+      </w:pPr>
+      <w:r>
+        <w:rPr>
+          <w:sz w:val="22"/>
+        </w:rPr>
+        <w:t xml:space="preserve">The first problem is the one a merchant will hit. The second is what stops the first from being fixed quickly.</w:t>
+      </w:r>
+    </w:p>
+    <w:p>
+      <w:pPr>
+        <w:spacing w:before="280" w:after="120"/>
+        <w:rPr>
+          <w:sz w:val="28"/>
+          <w:b/>
+        </w:rPr>
+      </w:pPr>
+      <w:r>
+        <w:rPr>
+          <w:sz w:val="28"/>
+          <w:b/>
+        </w:rPr>
+        <w:t xml:space="preserve">Steps to reproduce</w:t>
+      </w:r>
+    </w:p>
+    <w:p>
+      <w:pPr>
+        <w:spacing w:before="0" w:after="120"/>
+        <w:rPr>
+          <w:sz w:val="22"/>
+        </w:rPr>
+      </w:pPr>
+      <w:r>
+        <w:rPr>
+          <w:sz w:val="22"/>
+        </w:rPr>
+        <w:t xml:space="preserve">1. Sign in on any gateway and open </w:t>
+      </w:r>
+      <w:r>
+        <w:rPr>
+          <w:sz w:val="22"/>
+          <w:b/>
+        </w:rPr>
+        <w:t xml:space="preserve">Payment Analytics → Payment Stats</w:t>
+      </w:r>
+      <w:r>
+        <w:rPr>
+          <w:sz w:val="22"/>
+        </w:rPr>
+        <w:t xml:space="preserve">. Let the table fill. 2. Open </w:t>
+      </w:r>
+      <w:r>
+        <w:rPr>
+          <w:sz w:val="22"/>
+          <w:b/>
+        </w:rPr>
+        <w:t xml:space="preserve">DevTools</w:t>
+      </w:r>
+      <w:r>
+        <w:rPr>
+          <w:sz w:val="22"/>
+        </w:rPr>
+        <w:t xml:space="preserve"> and select the </w:t>
+      </w:r>
+      <w:r>
+        <w:rPr>
+          <w:sz w:val="22"/>
+          <w:b/>
+        </w:rPr>
+        <w:t xml:space="preserve">Console</w:t>
+      </w:r>
+      <w:r>
+        <w:rPr>
+          <w:sz w:val="22"/>
+        </w:rPr>
+        <w:t xml:space="preserve"> tab. Leave the level filter on </w:t>
+      </w:r>
+      <w:r>
+        <w:rPr>
+          <w:sz w:val="22"/>
+          <w:b/>
+        </w:rPr>
+        <w:t xml:space="preserve">Default levels</w:t>
+      </w:r>
+      <w:r>
+        <w:rPr>
+          <w:sz w:val="22"/>
+        </w:rPr>
+        <w:t xml:space="preserve"> — see the note below, because this matters. 3. Note the figures currently in the table. 4. Go to the </w:t>
+      </w:r>
+      <w:r>
+        <w:rPr>
+          <w:sz w:val="22"/>
+          <w:b/>
+        </w:rPr>
+        <w:t xml:space="preserve">Network</w:t>
+      </w:r>
+      <w:r>
+        <w:rPr>
+          <w:sz w:val="22"/>
+        </w:rPr>
+        <w:t xml:space="preserve"> tab and set the throttling dropdown from </w:t>
+      </w:r>
+      <w:r>
+        <w:rPr>
+          <w:sz w:val="22"/>
+          <w:b/>
+        </w:rPr>
+        <w:t xml:space="preserve">No throttling</w:t>
+      </w:r>
+      <w:r>
+        <w:rPr>
+          <w:sz w:val="22"/>
+        </w:rPr>
+        <w:t xml:space="preserve"> to </w:t>
+      </w:r>
+      <w:r>
+        <w:rPr>
+          <w:sz w:val="22"/>
+          <w:b/>
+        </w:rPr>
+        <w:t xml:space="preserve">Offline</w:t>
+      </w:r>
+      <w:r>
+        <w:rPr>
+          <w:sz w:val="22"/>
+        </w:rPr>
+        <w:t xml:space="preserve">. 5. Return to the page, change </w:t>
+      </w:r>
+      <w:r>
+        <w:rPr>
+          <w:sz w:val="22"/>
+          <w:b/>
+        </w:rPr>
+        <w:t xml:space="preserve">From Date</w:t>
+      </w:r>
+      <w:r>
+        <w:rPr>
+          <w:sz w:val="22"/>
+        </w:rPr>
+        <w:t xml:space="preserve"> to a different month, and press </w:t>
+      </w:r>
+      <w:r>
+        <w:rPr>
+          <w:sz w:val="22"/>
+          <w:b/>
+        </w:rPr>
+        <w:t xml:space="preserve">Submit</w:t>
+      </w:r>
+      <w:r>
+        <w:rPr>
+          <w:sz w:val="22"/>
+        </w:rPr>
+        <w:t xml:space="preserve">. 6. Watch the table. Then read the console.</w:t>
+      </w:r>
+    </w:p>
+    <w:p>
+      <w:pPr>
+        <w:spacing w:before="280" w:after="120"/>
+        <w:rPr>
+          <w:sz w:val="28"/>
+          <w:b/>
+        </w:rPr>
+      </w:pPr>
+      <w:r>
+        <w:rPr>
+          <w:sz w:val="28"/>
+          <w:b/>
+        </w:rPr>
+        <w:t xml:space="preserve">Expected result</w:t>
+      </w:r>
+    </w:p>
+    <w:p>
+      <w:pPr>
+        <w:spacing w:before="0" w:after="120"/>
+        <w:rPr>
+          <w:sz w:val="22"/>
+        </w:rPr>
+      </w:pPr>
+      <w:r>
+        <w:rPr>
+          <w:sz w:val="22"/>
+        </w:rPr>
+        <w:t xml:space="preserve">The merchant is told the figures could not be fetched. Either the table clears or it is marked as out of date — whichever is chosen, the screen must not present stale numbers as the answer to the range that was just requested.</w:t>
+      </w:r>
+    </w:p>
+    <w:p>
+      <w:pPr>
+        <w:spacing w:before="0" w:after="120"/>
+        <w:rPr>
+          <w:sz w:val="22"/>
+        </w:rPr>
+      </w:pPr>
+      <w:r>
+        <w:rPr>
+          <w:sz w:val="22"/>
+        </w:rPr>
+        <w:t xml:space="preserve">The console carries the network failure and nothing else. Handling a failed request is ordinary work and should not itself throw.</w:t>
+      </w:r>
+    </w:p>
+    <w:p>
+      <w:pPr>
+        <w:spacing w:before="280" w:after="120"/>
+        <w:rPr>
+          <w:sz w:val="28"/>
+          <w:b/>
+        </w:rPr>
+      </w:pPr>
+      <w:r>
+        <w:rPr>
+          <w:sz w:val="28"/>
+          <w:b/>
+        </w:rPr>
+        <w:t xml:space="preserve">Actual result</w:t>
+      </w:r>
+    </w:p>
+    <w:p>
+      <w:pPr>
+        <w:spacing w:before="0" w:after="120"/>
+        <w:rPr>
+          <w:sz w:val="22"/>
+        </w:rPr>
+      </w:pPr>
+      <w:r>
+        <w:rPr>
+          <w:sz w:val="22"/>
+          <w:b/>
+        </w:rPr>
+        <w:t xml:space="preserve">On screen: nothing happens.</w:t>
+      </w:r>
+      <w:r>
+        <w:rPr>
+          <w:sz w:val="22"/>
+        </w:rPr>
+        <w:t xml:space="preserve"> The table still lists the same rows. No toast, no banner, no inline message, no empty state. The only visible change is the date in the From Date box.</w:t>
+      </w:r>
+    </w:p>
+    <w:p>
+      <w:pPr>
+        <w:spacing w:before="0" w:after="120"/>
+        <w:rPr>
+          <w:sz w:val="22"/>
+        </w:rPr>
+      </w:pPr>
+      <w:r>
+        <w:rPr>
+          <w:sz w:val="22"/>
+          <w:b/>
+        </w:rPr>
+        <w:t xml:space="preserve">In the console:</w:t>
+      </w:r>
+      <w:r>
+        <w:rPr>
+          <w:sz w:val="22"/>
+        </w:rPr>
+        <w:t xml:space="preserve"> the browser logs the failed request, and then the failure handler adds three faults of its own.</w:t>
+      </w:r>
+    </w:p>
+    <w:p>
+      <w:pPr>
+        <w:spacing w:before="0" w:after="120"/>
+        <w:rPr>
+          <w:sz w:val="22"/>
+        </w:rPr>
+      </w:pPr>
+      <w:r>
+        <w:rPr>
+          <w:sz w:val="22"/>
+        </w:rPr>
+        <w:t xml:space="preserve">``` GET .../v2/payment/payment_stats_us?merchant_id=... net::ERR_INTERNET_DISCONNECTED</w:t>
+      </w:r>
+    </w:p>
+    <w:p>
+      <w:pPr>
+        <w:spacing w:before="0" w:after="120"/>
+        <w:rPr>
+          <w:sz w:val="22"/>
+        </w:rPr>
+      </w:pPr>
+      <w:r>
+        <w:rPr>
+          <w:sz w:val="22"/>
+        </w:rPr>
+        <w:t xml:space="preserve">err:  TypeError: Cannot convert undefined or null to object at Object.keys (&lt;anonymous&gt;)</w:t>
+      </w:r>
+    </w:p>
+    <w:p>
+      <w:pPr>
+        <w:spacing w:before="0" w:after="120"/>
+        <w:rPr>
+          <w:sz w:val="22"/>
+        </w:rPr>
+      </w:pPr>
+      <w:r>
+        <w:rPr>
+          <w:sz w:val="22"/>
+        </w:rPr>
+        <w:t xml:space="preserve">err:  TypeError: Cannot read properties of undefined (reading 'error_code')</w:t>
+      </w:r>
+    </w:p>
+    <w:p>
+      <w:pPr>
+        <w:spacing w:before="0" w:after="120"/>
+        <w:rPr>
+          <w:sz w:val="22"/>
+        </w:rPr>
+      </w:pPr>
+      <w:r>
+        <w:rPr>
+          <w:sz w:val="22"/>
+        </w:rPr>
+        <w:t xml:space="preserve">Uncaught (in promise) ReferenceError: err is not defined ```</w:t>
+      </w:r>
+    </w:p>
+    <w:p>
+      <w:pPr>
+        <w:spacing w:before="280" w:after="120"/>
+        <w:rPr>
+          <w:sz w:val="28"/>
+          <w:b/>
+        </w:rPr>
+      </w:pPr>
+      <w:r>
+        <w:rPr>
+          <w:sz w:val="28"/>
+          <w:b/>
+        </w:rPr>
+        <w:t xml:space="preserve">Evidence</w:t>
+      </w:r>
+    </w:p>
+    <w:p>
+      <w:pPr>
+        <w:spacing w:before="240" w:after="100"/>
+        <w:rPr>
+          <w:sz w:val="24"/>
+          <w:b/>
+        </w:rPr>
+      </w:pPr>
+      <w:r>
+        <w:rPr>
+          <w:sz w:val="24"/>
+          <w:b/>
+        </w:rPr>
+        <w:t xml:space="preserve">Before the failure — a healthy page</w:t>
+      </w:r>
+    </w:p>
+    <w:p>
+      <w:pPr>
+        <w:spacing w:before="80" w:after="200"/>
+      </w:pPr>
+      <w:r>
+        <w:drawing>
+          <wp:inline distT="0" distB="0" distL="0" distR="0">
+            <wp:extent cx="5943600" cy="3343275"/>
+            <wp:docPr id="111" name="Picture 111"/>
+            <a:graphic xmlns:a="http://schemas.openxmlformats.org/drawingml/2006/main">
+              <a:graphicData uri="http://schemas.openxmlformats.org/drawingml/2006/picture">
+                <pic:pic xmlns:pic="http://schemas.openxmlformats.org/drawingml/2006/picture">
+                  <pic:nvPicPr>
+                    <pic:cNvPr id="111" name="Picture"/>
+                    <pic:cNvPicPr/>
+                  </pic:nvPicPr>
+                  <pic:blipFill>
+                    <a:blip r:embed="rId111"/>
+                    <a:stretch>
+                      <a:fillRect/>
+                    </a:stretch>
+                  </pic:blipFill>
+                  <pic:spPr>
+                    <a:xfrm>
+                      <a:off x="0" y="0"/>
+                      <a:ext cx="5943600" cy="3343275"/>
+                    </a:xfrm>
+                    <a:prstGeom prst="rect">
+                      <a:avLst/>
+                    </a:prstGeom>
+                  </pic:spPr>
+                </pic:pic>
+              </a:graphicData>
+            </a:graphic>
+          </wp:inline>
+        </w:drawing>
+      </w:r>
+    </w:p>
+    <w:p>
+      <w:pPr>
+        <w:spacing w:before="0" w:after="120"/>
+        <w:rPr>
+          <w:sz w:val="22"/>
+        </w:rPr>
+      </w:pPr>
+      <w:r>
+        <w:rPr>
+          <w:sz w:val="22"/>
+        </w:rPr>
+        <w:t xml:space="preserve">From Date reads </w:t>
+      </w:r>
+      <w:r>
+        <w:rPr>
+          <w:sz w:val="22"/>
+          <w:b/>
+        </w:rPr>
+        <w:t xml:space="preserve">08/25/2026</w:t>
+      </w:r>
+      <w:r>
+        <w:rPr>
+          <w:sz w:val="22"/>
+        </w:rPr>
+        <w:t xml:space="preserve"> and the table lists ACH / CheckSale, DISCOVER / CreditSale, MASTERCARD / CreditSale and MASTERCARD / DebitSale, all on SmartPay.</w:t>
+      </w:r>
+    </w:p>
+    <w:p>
+      <w:pPr>
+        <w:spacing w:before="0" w:after="120"/>
+        <w:rPr>
+          <w:sz w:val="22"/>
+        </w:rPr>
+      </w:pPr>
+      <w:r>
+        <w:rPr>
+          <w:sz w:val="22"/>
+        </w:rPr>
+        <w:t xml:space="preserve">The console holds two unrelated entries and </w:t>
+      </w:r>
+      <w:r>
+        <w:rPr>
+          <w:sz w:val="22"/>
+          <w:b/>
+        </w:rPr>
+        <w:t xml:space="preserve">none of the three faults</w:t>
+      </w:r>
+      <w:r>
+        <w:rPr>
+          <w:sz w:val="22"/>
+        </w:rPr>
+        <w:t xml:space="preserve">. This is the control: whatever appears next was caused by the failure and was not already there.</w:t>
+      </w:r>
+    </w:p>
+    <w:p>
+      <w:pPr>
+        <w:spacing w:before="240" w:after="100"/>
+        <w:rPr>
+          <w:sz w:val="24"/>
+          <w:b/>
+        </w:rPr>
+      </w:pPr>
+      <w:r>
+        <w:rPr>
+          <w:sz w:val="24"/>
+          <w:b/>
+        </w:rPr>
+        <w:t xml:space="preserve">After the failure — same table, three new faults</w:t>
+      </w:r>
+    </w:p>
+    <w:p>
+      <w:pPr>
+        <w:spacing w:before="80" w:after="200"/>
+      </w:pPr>
+      <w:r>
+        <w:drawing>
+          <wp:inline distT="0" distB="0" distL="0" distR="0">
+            <wp:extent cx="5943600" cy="3343275"/>
+            <wp:docPr id="112" name="Picture 112"/>
+            <a:graphic xmlns:a="http://schemas.openxmlformats.org/drawingml/2006/main">
+              <a:graphicData uri="http://schemas.openxmlformats.org/drawingml/2006/picture">
+                <pic:pic xmlns:pic="http://schemas.openxmlformats.org/drawingml/2006/picture">
+                  <pic:nvPicPr>
+                    <pic:cNvPr id="112" name="Picture"/>
+                    <pic:cNvPicPr/>
+                  </pic:nvPicPr>
+                  <pic:blipFill>
+                    <a:blip r:embed="rId112"/>
+                    <a:stretch>
+                      <a:fillRect/>
+                    </a:stretch>
+                  </pic:blipFill>
+                  <pic:spPr>
+                    <a:xfrm>
+                      <a:off x="0" y="0"/>
+                      <a:ext cx="5943600" cy="3343275"/>
+                    </a:xfrm>
+                    <a:prstGeom prst="rect">
+                      <a:avLst/>
+                    </a:prstGeom>
+                  </pic:spPr>
+                </pic:pic>
+              </a:graphicData>
+            </a:graphic>
+          </wp:inline>
+        </w:drawing>
+      </w:r>
+    </w:p>
+    <w:p>
+      <w:pPr>
+        <w:spacing w:before="0" w:after="120"/>
+        <w:rPr>
+          <w:sz w:val="22"/>
+        </w:rPr>
+      </w:pPr>
+      <w:r>
+        <w:rPr>
+          <w:sz w:val="22"/>
+        </w:rPr>
+        <w:t xml:space="preserve">From Date now reads </w:t>
+      </w:r>
+      <w:r>
+        <w:rPr>
+          <w:sz w:val="22"/>
+          <w:b/>
+        </w:rPr>
+        <w:t xml:space="preserve">07/24/2026</w:t>
+      </w:r>
+      <w:r>
+        <w:rPr>
+          <w:sz w:val="22"/>
+        </w:rPr>
+        <w:t xml:space="preserve">. Submit has been pressed and the request has failed.</w:t>
+      </w:r>
+    </w:p>
+    <w:p>
+      <w:pPr>
+        <w:spacing w:before="0" w:after="120"/>
+        <w:rPr>
+          <w:sz w:val="22"/>
+        </w:rPr>
+      </w:pPr>
+      <w:r>
+        <w:rPr>
+          <w:sz w:val="22"/>
+          <w:b/>
+        </w:rPr>
+        <w:t xml:space="preserve">Compare the two tables. They are identical</w:t>
+      </w:r>
+      <w:r>
+        <w:rPr>
+          <w:sz w:val="22"/>
+        </w:rPr>
+        <w:t xml:space="preserve"> — the same four rows in the same order. A different date range was requested and the screen still shows the previous answer, with nothing to indicate that.</w:t>
+      </w:r>
+    </w:p>
+    <w:p>
+      <w:pPr>
+        <w:spacing w:before="0" w:after="120"/>
+        <w:rPr>
+          <w:sz w:val="22"/>
+        </w:rPr>
+      </w:pPr>
+      <w:r>
+        <w:rPr>
+          <w:sz w:val="22"/>
+        </w:rPr>
+        <w:t xml:space="preserve">In the console, below the </w:t>
+      </w:r>
+      <w:r>
+        <w:rPr>
+          <w:sz w:val="22"/>
+          <w:rFonts w:ascii="Consolas" w:hAnsi="Consolas"/>
+          <w:sz w:val="20"/>
+        </w:rPr>
+        <w:t xml:space="preserve">ERR_INTERNET_DISCONNECTED</w:t>
+      </w:r>
+      <w:r>
+        <w:rPr>
+          <w:sz w:val="22"/>
+        </w:rPr>
+        <w:t xml:space="preserve"> line for </w:t>
+      </w:r>
+      <w:r>
+        <w:rPr>
+          <w:sz w:val="22"/>
+          <w:rFonts w:ascii="Consolas" w:hAnsi="Consolas"/>
+          <w:sz w:val="20"/>
+        </w:rPr>
+        <w:t xml:space="preserve">payment_stats_us</w:t>
+      </w:r>
+      <w:r>
+        <w:rPr>
+          <w:sz w:val="22"/>
+        </w:rPr>
+        <w:t xml:space="preserve">, sit all three faults: </w:t>
+      </w:r>
+      <w:r>
+        <w:rPr>
+          <w:sz w:val="22"/>
+          <w:rFonts w:ascii="Consolas" w:hAnsi="Consolas"/>
+          <w:sz w:val="20"/>
+        </w:rPr>
+        <w:t xml:space="preserve">Cannot convert undefined or null to object</w:t>
+      </w:r>
+      <w:r>
+        <w:rPr>
+          <w:sz w:val="22"/>
+        </w:rPr>
+        <w:t xml:space="preserve">, </w:t>
+      </w:r>
+      <w:r>
+        <w:rPr>
+          <w:sz w:val="22"/>
+          <w:rFonts w:ascii="Consolas" w:hAnsi="Consolas"/>
+          <w:sz w:val="20"/>
+        </w:rPr>
+        <w:t xml:space="preserve">Cannot read properties of undefined (reading 'error_code')</w:t>
+      </w:r>
+      <w:r>
+        <w:rPr>
+          <w:sz w:val="22"/>
+        </w:rPr>
+        <w:t xml:space="preserve">, and </w:t>
+      </w:r>
+      <w:r>
+        <w:rPr>
+          <w:sz w:val="22"/>
+          <w:rFonts w:ascii="Consolas" w:hAnsi="Consolas"/>
+          <w:sz w:val="20"/>
+        </w:rPr>
+        <w:t xml:space="preserve">ReferenceError: err is not defined</w:t>
+      </w:r>
+      <w:r>
+        <w:rPr>
+          <w:sz w:val="22"/>
+        </w:rPr>
+        <w:t xml:space="preserve">.</w:t>
+      </w:r>
+    </w:p>
+    <w:p>
+      <w:pPr>
+        <w:spacing w:before="240" w:after="100"/>
+        <w:rPr>
+          <w:sz w:val="24"/>
+          <w:b/>
+        </w:rPr>
+      </w:pPr>
+      <w:r>
+        <w:rPr>
+          <w:sz w:val="24"/>
+          <w:b/>
+        </w:rPr>
+        <w:t xml:space="preserve">A note for whoever reproduces this</w:t>
+      </w:r>
+    </w:p>
+    <w:p>
+      <w:pPr>
+        <w:spacing w:before="0" w:after="120"/>
+        <w:rPr>
+          <w:sz w:val="22"/>
+        </w:rPr>
+      </w:pPr>
+      <w:r>
+        <w:rPr>
+          <w:sz w:val="22"/>
+        </w:rPr>
+        <w:t xml:space="preserve">Look at the icons beside the two </w:t>
+      </w:r>
+      <w:r>
+        <w:rPr>
+          <w:sz w:val="22"/>
+          <w:rFonts w:ascii="Consolas" w:hAnsi="Consolas"/>
+          <w:sz w:val="20"/>
+        </w:rPr>
+        <w:t xml:space="preserve">err:</w:t>
+      </w:r>
+      <w:r>
+        <w:rPr>
+          <w:sz w:val="22"/>
+        </w:rPr>
+        <w:t xml:space="preserve"> lines in that screenshot. </w:t>
+      </w:r>
+      <w:r>
+        <w:rPr>
+          <w:sz w:val="22"/>
+          <w:b/>
+        </w:rPr>
+        <w:t xml:space="preserve">They have no red error icon</w:t>
+      </w:r>
+      <w:r>
+        <w:rPr>
+          <w:sz w:val="22"/>
+        </w:rPr>
+        <w:t xml:space="preserve"> — the page logs those two through </w:t>
+      </w:r>
+      <w:r>
+        <w:rPr>
+          <w:sz w:val="22"/>
+          <w:rFonts w:ascii="Consolas" w:hAnsi="Consolas"/>
+          <w:sz w:val="20"/>
+        </w:rPr>
+        <w:t xml:space="preserve">console.log</w:t>
+      </w:r>
+      <w:r>
+        <w:rPr>
+          <w:sz w:val="22"/>
+        </w:rPr>
+        <w:t xml:space="preserve"> and </w:t>
+      </w:r>
+      <w:r>
+        <w:rPr>
+          <w:sz w:val="22"/>
+          <w:rFonts w:ascii="Consolas" w:hAnsi="Consolas"/>
+          <w:sz w:val="20"/>
+        </w:rPr>
+        <w:t xml:space="preserve">console.info</w:t>
+      </w:r>
+      <w:r>
+        <w:rPr>
+          <w:sz w:val="22"/>
+        </w:rPr>
+        <w:t xml:space="preserve">, not </w:t>
+      </w:r>
+      <w:r>
+        <w:rPr>
+          <w:sz w:val="22"/>
+          <w:rFonts w:ascii="Consolas" w:hAnsi="Consolas"/>
+          <w:sz w:val="20"/>
+        </w:rPr>
+        <w:t xml:space="preserve">console.error</w:t>
+      </w:r>
+      <w:r>
+        <w:rPr>
+          <w:sz w:val="22"/>
+        </w:rPr>
+        <w:t xml:space="preserve">.</w:t>
+      </w:r>
+    </w:p>
+    <w:p>
+      <w:pPr>
+        <w:spacing w:before="0" w:after="120"/>
+        <w:rPr>
+          <w:sz w:val="22"/>
+        </w:rPr>
+      </w:pPr>
+      <w:r>
+        <w:rPr>
+          <w:sz w:val="22"/>
+        </w:rPr>
+        <w:t xml:space="preserve">If the console filter is set to </w:t>
+      </w:r>
+      <w:r>
+        <w:rPr>
+          <w:sz w:val="22"/>
+          <w:b/>
+        </w:rPr>
+        <w:t xml:space="preserve">Errors</w:t>
+      </w:r>
+      <w:r>
+        <w:rPr>
+          <w:sz w:val="22"/>
+        </w:rPr>
+        <w:t xml:space="preserve"> only, those two lines do not appear and the defect looks smaller than it is. Leave the filter on </w:t>
+      </w:r>
+      <w:r>
+        <w:rPr>
+          <w:sz w:val="22"/>
+          <w:b/>
+        </w:rPr>
+        <w:t xml:space="preserve">Default levels</w:t>
+      </w:r>
+      <w:r>
+        <w:rPr>
+          <w:sz w:val="22"/>
+        </w:rPr>
+        <w:t xml:space="preserve">.</w:t>
+      </w:r>
+    </w:p>
+    <w:p>
+      <w:pPr>
+        <w:spacing w:before="0" w:after="120"/>
+        <w:rPr>
+          <w:sz w:val="22"/>
+        </w:rPr>
+      </w:pPr>
+      <w:r>
+        <w:rPr>
+          <w:sz w:val="22"/>
+        </w:rPr>
+        <w:t xml:space="preserve">This is worth stating plainly because it also caught the automation. A listener watching only </w:t>
+      </w:r>
+      <w:r>
+        <w:rPr>
+          <w:sz w:val="22"/>
+          <w:rFonts w:ascii="Consolas" w:hAnsi="Consolas"/>
+          <w:sz w:val="20"/>
+        </w:rPr>
+        <w:t xml:space="preserve">console.error</w:t>
+      </w:r>
+      <w:r>
+        <w:rPr>
+          <w:sz w:val="22"/>
+        </w:rPr>
+        <w:t xml:space="preserve"> saw one fault instead of three.</w:t>
+      </w:r>
+    </w:p>
+    <w:p>
+      <w:pPr>
+        <w:spacing w:before="280" w:after="120"/>
+        <w:rPr>
+          <w:sz w:val="28"/>
+          <w:b/>
+        </w:rPr>
+      </w:pPr>
+      <w:r>
+        <w:rPr>
+          <w:sz w:val="28"/>
+          <w:b/>
+        </w:rPr>
+        <w:t xml:space="preserve">What pins the cause</w:t>
+      </w:r>
+    </w:p>
+    <w:p>
+      <w:pPr>
+        <w:spacing w:before="0" w:after="120"/>
+        <w:rPr>
+          <w:sz w:val="22"/>
+        </w:rPr>
+      </w:pPr>
+      <w:r>
+        <w:rPr>
+          <w:sz w:val="22"/>
+        </w:rPr>
+        <w:t xml:space="preserve">The failure handler reads the response body before checking whether there is one.</w:t>
+      </w:r>
+    </w:p>
+    <w:p>
+      <w:pPr>
+        <w:spacing w:before="0" w:after="80"/>
+        <w:ind w:left="360"/>
+        <w:rPr>
+          <w:sz w:val="22"/>
+        </w:rPr>
+      </w:pPr>
+      <w:r>
+        <w:rPr>
+          <w:sz w:val="22"/>
+        </w:rPr>
+        <w:t xml:space="preserve">• </w:t>
+      </w:r>
+      <w:r>
+        <w:rPr>
+          <w:sz w:val="22"/>
+          <w:rFonts w:ascii="Consolas" w:hAnsi="Consolas"/>
+          <w:sz w:val="20"/>
+        </w:rPr>
+        <w:t xml:space="preserve">Cannot convert undefined or null to object</w:t>
+      </w:r>
+      <w:r>
+        <w:rPr>
+          <w:sz w:val="22"/>
+        </w:rPr>
+        <w:t xml:space="preserve"> at </w:t>
+      </w:r>
+      <w:r>
+        <w:rPr>
+          <w:sz w:val="22"/>
+          <w:rFonts w:ascii="Consolas" w:hAnsi="Consolas"/>
+          <w:sz w:val="20"/>
+        </w:rPr>
+        <w:t xml:space="preserve">Object.keys</w:t>
+      </w:r>
+      <w:r>
+        <w:rPr>
+          <w:sz w:val="22"/>
+        </w:rPr>
+        <w:t xml:space="preserve"> — something calls </w:t>
+      </w:r>
+      <w:r>
+        <w:rPr>
+          <w:sz w:val="22"/>
+          <w:rFonts w:ascii="Consolas" w:hAnsi="Consolas"/>
+          <w:sz w:val="20"/>
+        </w:rPr>
+        <w:t xml:space="preserve">Object.keys</w:t>
+      </w:r>
+      <w:r>
+        <w:rPr>
+          <w:sz w:val="22"/>
+        </w:rPr>
+        <w:t xml:space="preserve"> on the response, which is </w:t>
+      </w:r>
+      <w:r>
+        <w:rPr>
+          <w:sz w:val="22"/>
+          <w:rFonts w:ascii="Consolas" w:hAnsi="Consolas"/>
+          <w:sz w:val="20"/>
+        </w:rPr>
+        <w:t xml:space="preserve">undefined</w:t>
+      </w:r>
+      <w:r>
+        <w:rPr>
+          <w:sz w:val="22"/>
+        </w:rPr>
+        <w:t xml:space="preserve"> because the request never completed.</w:t>
+      </w:r>
+    </w:p>
+    <w:p>
+      <w:pPr>
+        <w:spacing w:before="0" w:after="80"/>
+        <w:ind w:left="360"/>
+        <w:rPr>
+          <w:sz w:val="22"/>
+        </w:rPr>
+      </w:pPr>
+      <w:r>
+        <w:rPr>
+          <w:sz w:val="22"/>
+        </w:rPr>
+        <w:t xml:space="preserve">• </w:t>
+      </w:r>
+      <w:r>
+        <w:rPr>
+          <w:sz w:val="22"/>
+          <w:rFonts w:ascii="Consolas" w:hAnsi="Consolas"/>
+          <w:sz w:val="20"/>
+        </w:rPr>
+        <w:t xml:space="preserve">Cannot read properties of undefined (reading 'error_code')</w:t>
+      </w:r>
+      <w:r>
+        <w:rPr>
+          <w:sz w:val="22"/>
+        </w:rPr>
+        <w:t xml:space="preserve"> — the same object is then read for an error code.</w:t>
+      </w:r>
+    </w:p>
+    <w:p>
+      <w:pPr>
+        <w:spacing w:before="0" w:after="80"/>
+        <w:ind w:left="360"/>
+        <w:rPr>
+          <w:sz w:val="22"/>
+        </w:rPr>
+      </w:pPr>
+      <w:r>
+        <w:rPr>
+          <w:sz w:val="22"/>
+        </w:rPr>
+        <w:t xml:space="preserve">• </w:t>
+      </w:r>
+      <w:r>
+        <w:rPr>
+          <w:sz w:val="22"/>
+          <w:rFonts w:ascii="Consolas" w:hAnsi="Consolas"/>
+          <w:sz w:val="20"/>
+        </w:rPr>
+        <w:t xml:space="preserve">ReferenceError: err is not defined</w:t>
+      </w:r>
+      <w:r>
+        <w:rPr>
+          <w:sz w:val="22"/>
+        </w:rPr>
+        <w:t xml:space="preserve"> — a </w:t>
+      </w:r>
+      <w:r>
+        <w:rPr>
+          <w:sz w:val="22"/>
+          <w:rFonts w:ascii="Consolas" w:hAnsi="Consolas"/>
+          <w:sz w:val="20"/>
+        </w:rPr>
+        <w:t xml:space="preserve">catch</w:t>
+      </w:r>
+      <w:r>
+        <w:rPr>
+          <w:sz w:val="22"/>
+        </w:rPr>
+        <w:t xml:space="preserve"> block refers to a variable that is not in scope, so the handler throws before it can report anything.</w:t>
+      </w:r>
+    </w:p>
+    <w:p>
+      <w:pPr>
+        <w:spacing w:before="0" w:after="120"/>
+        <w:rPr>
+          <w:sz w:val="22"/>
+        </w:rPr>
+      </w:pPr>
+      <w:r>
+        <w:rPr>
+          <w:sz w:val="22"/>
+        </w:rPr>
+        <w:t xml:space="preserve">That third one explains the silent screen. The handler never reaches whatever would have shown the message, because it throws on the way there.</w:t>
+      </w:r>
+    </w:p>
+    <w:p>
+      <w:pPr>
+        <w:spacing w:before="280" w:after="120"/>
+        <w:rPr>
+          <w:sz w:val="28"/>
+          <w:b/>
+        </w:rPr>
+      </w:pPr>
+      <w:r>
+        <w:rPr>
+          <w:sz w:val="28"/>
+          <w:b/>
+        </w:rPr>
+        <w:t xml:space="preserve">Impact</w:t>
+      </w:r>
+    </w:p>
+    <w:p>
+      <w:pPr>
+        <w:spacing w:before="0" w:after="120"/>
+        <w:rPr>
+          <w:sz w:val="22"/>
+        </w:rPr>
+      </w:pPr>
+      <w:r>
+        <w:rPr>
+          <w:sz w:val="22"/>
+        </w:rPr>
+        <w:t xml:space="preserve">A merchant on a dropped connection, a VPN blip or a brief server outage sees old figures presented as current ones. They have no way to know. If they act on those numbers — reconciliation, a report, a decision about a date range — they are acting on the wrong data.</w:t>
+      </w:r>
+    </w:p>
+    <w:p>
+      <w:pPr>
+        <w:spacing w:before="0" w:after="120"/>
+        <w:rPr>
+          <w:sz w:val="22"/>
+        </w:rPr>
+      </w:pPr>
+      <w:r>
+        <w:rPr>
+          <w:sz w:val="22"/>
+        </w:rPr>
+        <w:t xml:space="preserve">Staleness with no warning is worse than an error message. An error tells the merchant to try again; this tells them nothing and looks like a successful result.</w:t>
+      </w:r>
+    </w:p>
+    <w:p>
+      <w:pPr>
+        <w:spacing w:before="0" w:after="120"/>
+        <w:rPr>
+          <w:sz w:val="22"/>
+        </w:rPr>
+      </w:pPr>
+      <w:r>
+        <w:rPr>
+          <w:sz w:val="22"/>
+        </w:rPr>
+        <w:t xml:space="preserve">For whoever is diagnosing a support call, the console carries five errors, three of which come from the code that was supposed to be handling the problem. The real cause — </w:t>
+      </w:r>
+      <w:r>
+        <w:rPr>
+          <w:sz w:val="22"/>
+          <w:rFonts w:ascii="Consolas" w:hAnsi="Consolas"/>
+          <w:sz w:val="20"/>
+        </w:rPr>
+        <w:t xml:space="preserve">ERR_INTERNET_DISCONNECTED</w:t>
+      </w:r>
+      <w:r>
+        <w:rPr>
+          <w:sz w:val="22"/>
+        </w:rPr>
+        <w:t xml:space="preserve"> — is present, but it is buried among the handler's own noise.</w:t>
+      </w:r>
+    </w:p>
+    <w:p>
+      <w:pPr>
+        <w:spacing w:before="0" w:after="120"/>
+        <w:rPr>
+          <w:sz w:val="22"/>
+        </w:rPr>
+      </w:pPr>
+      <w:r>
+        <w:rPr>
+          <w:sz w:val="22"/>
+          <w:b/>
+        </w:rPr>
+        <w:t xml:space="preserve">Workaround:</w:t>
+      </w:r>
+      <w:r>
+        <w:rPr>
+          <w:sz w:val="22"/>
+        </w:rPr>
+        <w:t xml:space="preserve"> none for the merchant, because there is nothing to notice. Re-submitting once the connection returns gives the correct figures.</w:t>
+      </w:r>
+    </w:p>
+    <w:p>
+      <w:pPr>
+        <w:spacing w:before="280" w:after="120"/>
+        <w:rPr>
+          <w:sz w:val="28"/>
+          <w:b/>
+        </w:rPr>
+      </w:pPr>
+      <w:r>
+        <w:rPr>
+          <w:sz w:val="28"/>
+          <w:b/>
+        </w:rPr>
+        <w:t xml:space="preserve">Notes for the developer</w:t>
+      </w:r>
+    </w:p>
+    <w:p>
+      <w:pPr>
+        <w:spacing w:before="0" w:after="80"/>
+        <w:ind w:left="360"/>
+        <w:rPr>
+          <w:sz w:val="22"/>
+        </w:rPr>
+      </w:pPr>
+      <w:r>
+        <w:rPr>
+          <w:sz w:val="22"/>
+        </w:rPr>
+        <w:t xml:space="preserve">• Guard the response before reading it. Both TypeErrors come from touching a body that does not exist on a failed request.</w:t>
+      </w:r>
+    </w:p>
+    <w:p>
+      <w:pPr>
+        <w:spacing w:before="0" w:after="80"/>
+        <w:ind w:left="360"/>
+        <w:rPr>
+          <w:sz w:val="22"/>
+        </w:rPr>
+      </w:pPr>
+      <w:r>
+        <w:rPr>
+          <w:sz w:val="22"/>
+        </w:rPr>
+        <w:t xml:space="preserve">• Fix the </w:t>
+      </w:r>
+      <w:r>
+        <w:rPr>
+          <w:sz w:val="22"/>
+          <w:rFonts w:ascii="Consolas" w:hAnsi="Consolas"/>
+          <w:sz w:val="20"/>
+        </w:rPr>
+        <w:t xml:space="preserve">err is not defined</w:t>
+      </w:r>
+      <w:r>
+        <w:rPr>
+          <w:sz w:val="22"/>
+        </w:rPr>
+        <w:t xml:space="preserve"> reference first. Until the handler stops throwing, no message can reach the screen, so the silent-failure symptom cannot be fixed without it.</w:t>
+      </w:r>
+    </w:p>
+    <w:p>
+      <w:pPr>
+        <w:spacing w:before="0" w:after="80"/>
+        <w:ind w:left="360"/>
+        <w:rPr>
+          <w:sz w:val="22"/>
+        </w:rPr>
+      </w:pPr>
+      <w:r>
+        <w:rPr>
+          <w:sz w:val="22"/>
+        </w:rPr>
+        <w:t xml:space="preserve">• Decide what the merchant should see. Clearing the table is honest but abrupt; marking it as stale keeps the context. Either is better than leaving old figures unlabelled.</w:t>
+      </w:r>
+    </w:p>
+    <w:p>
+      <w:pPr>
+        <w:spacing w:before="0" w:after="80"/>
+        <w:ind w:left="360"/>
+        <w:rPr>
+          <w:sz w:val="22"/>
+        </w:rPr>
+      </w:pPr>
+      <w:r>
+        <w:rPr>
+          <w:sz w:val="22"/>
+        </w:rPr>
+        <w:t xml:space="preserve">• Log the two </w:t>
+      </w:r>
+      <w:r>
+        <w:rPr>
+          <w:sz w:val="22"/>
+          <w:rFonts w:ascii="Consolas" w:hAnsi="Consolas"/>
+          <w:sz w:val="20"/>
+        </w:rPr>
+        <w:t xml:space="preserve">err:</w:t>
+      </w:r>
+      <w:r>
+        <w:rPr>
+          <w:sz w:val="22"/>
+        </w:rPr>
+        <w:t xml:space="preserve"> lines at error level if they are kept. Logging a failure at info level hides it from anyone filtering the console normally.</w:t>
+      </w:r>
+    </w:p>
     <w:sectPr>
       <w:pgSz w:w="12240" w:h="15840"/>
       <w:pgMar w:top="1440" w:right="1440" w:bottom="1440" w:left="1440"/>

</xml_diff>

<commit_message>
Mark the errors on the PS-NEG-02 screenshots and simplify the wording
The screenshots were unmarked, so a reader had to find three faults among nine
console entries themselves. The real cause is now boxed in blue and labelled
CAUSE, the three faults the handler adds are boxed in red and numbered 1 to 3,
and the table that did not change is boxed in orange in both pictures so the two
can be compared at a glance.

Added a close-up of the console at full size. It also shows why two of the
faults are easy to miss: boxes 1 and 2 sit on a white background with no error
icon, because the page logs them through console.log and console.info rather
than console.error.

Rewrote the section in shorter sentences and put the four console entries in a
table, one row each, saying what each one is.
</commit_message>
<xml_diff>
--- a/PaymentStats_Bugs.docx
+++ b/PaymentStats_Bugs.docx
@@ -5787,62 +5787,48 @@
         <w:rPr>
           <w:sz w:val="22"/>
         </w:rPr>
-        <w:t xml:space="preserve">When the stats request fails, the page does two things wrong at once.</w:t>
-      </w:r>
-    </w:p>
-    <w:p>
-      <w:pPr>
-        <w:spacing w:before="0" w:after="120"/>
-        <w:rPr>
-          <w:sz w:val="22"/>
-        </w:rPr>
-      </w:pPr>
-      <w:r>
-        <w:rPr>
-          <w:sz w:val="22"/>
-        </w:rPr>
-        <w:t xml:space="preserve">On screen, it keeps showing the </w:t>
-      </w:r>
-      <w:r>
-        <w:rPr>
-          <w:sz w:val="22"/>
-          <w:b/>
-        </w:rPr>
-        <w:t xml:space="preserve">previous</w:t>
-      </w:r>
-      <w:r>
-        <w:rPr>
-          <w:sz w:val="22"/>
-        </w:rPr>
-        <w:t xml:space="preserve"> results and gives no message. The merchant picked a new date range, pressed Submit, and is now looking at figures that answer the old one. Nothing on the page suggests anything went wrong.</w:t>
-      </w:r>
-    </w:p>
-    <w:p>
-      <w:pPr>
-        <w:spacing w:before="0" w:after="120"/>
-        <w:rPr>
-          <w:sz w:val="22"/>
-        </w:rPr>
-      </w:pPr>
-      <w:r>
-        <w:rPr>
-          <w:sz w:val="22"/>
-        </w:rPr>
-        <w:t xml:space="preserve">Behind that, the code meant to report the failure crashes three times over. It reads fields off a response that was never received.</w:t>
-      </w:r>
-    </w:p>
-    <w:p>
-      <w:pPr>
-        <w:spacing w:before="0" w:after="120"/>
-        <w:rPr>
-          <w:sz w:val="22"/>
-        </w:rPr>
-      </w:pPr>
-      <w:r>
-        <w:rPr>
-          <w:sz w:val="22"/>
-        </w:rPr>
-        <w:t xml:space="preserve">The first problem is the one a merchant will hit. The second is what stops the first from being fixed quickly.</w:t>
+        <w:t xml:space="preserve">The merchant picks a new date range and presses Submit. The request fails. The page keeps showing the </w:t>
+      </w:r>
+      <w:r>
+        <w:rPr>
+          <w:sz w:val="22"/>
+          <w:b/>
+        </w:rPr>
+        <w:t xml:space="preserve">old</w:t>
+      </w:r>
+      <w:r>
+        <w:rPr>
+          <w:sz w:val="22"/>
+        </w:rPr>
+        <w:t xml:space="preserve"> figures and says nothing at all.</w:t>
+      </w:r>
+    </w:p>
+    <w:p>
+      <w:pPr>
+        <w:spacing w:before="0" w:after="120"/>
+        <w:rPr>
+          <w:sz w:val="22"/>
+        </w:rPr>
+      </w:pPr>
+      <w:r>
+        <w:rPr>
+          <w:sz w:val="22"/>
+        </w:rPr>
+        <w:t xml:space="preserve">There is no message. No toast, no banner, nothing. The merchant has no way to know the numbers in front of them are the wrong ones.</w:t>
+      </w:r>
+    </w:p>
+    <w:p>
+      <w:pPr>
+        <w:spacing w:before="0" w:after="120"/>
+        <w:rPr>
+          <w:sz w:val="22"/>
+        </w:rPr>
+      </w:pPr>
+      <w:r>
+        <w:rPr>
+          <w:sz w:val="22"/>
+        </w:rPr>
+        <w:t xml:space="preserve">The reason it says nothing is that the code meant to report the failure crashes first. It crashes three times over, because it tries to read a reply that never arrived.</w:t>
       </w:r>
     </w:p>
     <w:p>
@@ -5872,7 +5858,7 @@
         <w:rPr>
           <w:sz w:val="22"/>
         </w:rPr>
-        <w:t xml:space="preserve">1. Sign in on any gateway and open </w:t>
+        <w:t xml:space="preserve">1. Sign in on any gateway. Open </w:t>
       </w:r>
       <w:r>
         <w:rPr>
@@ -5885,7 +5871,7 @@
         <w:rPr>
           <w:sz w:val="22"/>
         </w:rPr>
-        <w:t xml:space="preserve">. Let the table fill. 2. Open </w:t>
+        <w:t xml:space="preserve">. Wait for the table to fill. 2. Open </w:t>
       </w:r>
       <w:r>
         <w:rPr>
@@ -5898,7 +5884,7 @@
         <w:rPr>
           <w:sz w:val="22"/>
         </w:rPr>
-        <w:t xml:space="preserve"> and select the </w:t>
+        <w:t xml:space="preserve"> and click the </w:t>
       </w:r>
       <w:r>
         <w:rPr>
@@ -5924,7 +5910,7 @@
         <w:rPr>
           <w:sz w:val="22"/>
         </w:rPr>
-        <w:t xml:space="preserve"> — see the note below, because this matters. 3. Note the figures currently in the table. 4. Go to the </w:t>
+        <w:t xml:space="preserve">. This matters — see the warning below. 3. Write down the rows you can see in the table. 4. Click the </w:t>
       </w:r>
       <w:r>
         <w:rPr>
@@ -5937,7 +5923,7 @@
         <w:rPr>
           <w:sz w:val="22"/>
         </w:rPr>
-        <w:t xml:space="preserve"> tab and set the throttling dropdown from </w:t>
+        <w:t xml:space="preserve"> tab. Change the throttling dropdown from </w:t>
       </w:r>
       <w:r>
         <w:rPr>
@@ -5963,7 +5949,7 @@
         <w:rPr>
           <w:sz w:val="22"/>
         </w:rPr>
-        <w:t xml:space="preserve">. 5. Return to the page, change </w:t>
+        <w:t xml:space="preserve">. 5. Go back to the page. Change </w:t>
       </w:r>
       <w:r>
         <w:rPr>
@@ -5976,7 +5962,7 @@
         <w:rPr>
           <w:sz w:val="22"/>
         </w:rPr>
-        <w:t xml:space="preserve"> to a different month, and press </w:t>
+        <w:t xml:space="preserve"> to a different month. Press </w:t>
       </w:r>
       <w:r>
         <w:rPr>
@@ -5989,7 +5975,7 @@
         <w:rPr>
           <w:sz w:val="22"/>
         </w:rPr>
-        <w:t xml:space="preserve">. 6. Watch the table. Then read the console.</w:t>
+        <w:t xml:space="preserve">. 6. Look at the table. Then look at the console.</w:t>
       </w:r>
     </w:p>
     <w:p>
@@ -6019,21 +6005,35 @@
         <w:rPr>
           <w:sz w:val="22"/>
         </w:rPr>
-        <w:t xml:space="preserve">The merchant is told the figures could not be fetched. Either the table clears or it is marked as out of date — whichever is chosen, the screen must not present stale numbers as the answer to the range that was just requested.</w:t>
-      </w:r>
-    </w:p>
-    <w:p>
-      <w:pPr>
-        <w:spacing w:before="0" w:after="120"/>
-        <w:rPr>
-          <w:sz w:val="22"/>
-        </w:rPr>
-      </w:pPr>
-      <w:r>
-        <w:rPr>
-          <w:sz w:val="22"/>
-        </w:rPr>
-        <w:t xml:space="preserve">The console carries the network failure and nothing else. Handling a failed request is ordinary work and should not itself throw.</w:t>
+        <w:t xml:space="preserve">The merchant is told the figures could not be fetched.</w:t>
+      </w:r>
+    </w:p>
+    <w:p>
+      <w:pPr>
+        <w:spacing w:before="0" w:after="120"/>
+        <w:rPr>
+          <w:sz w:val="22"/>
+        </w:rPr>
+      </w:pPr>
+      <w:r>
+        <w:rPr>
+          <w:sz w:val="22"/>
+        </w:rPr>
+        <w:t xml:space="preserve">The screen must not keep showing old numbers as if they answered the new date range. Either clear the table or mark it as out of date. Either is fine. Showing stale figures with no warning is not.</w:t>
+      </w:r>
+    </w:p>
+    <w:p>
+      <w:pPr>
+        <w:spacing w:before="0" w:after="120"/>
+        <w:rPr>
+          <w:sz w:val="22"/>
+        </w:rPr>
+      </w:pPr>
+      <w:r>
+        <w:rPr>
+          <w:sz w:val="22"/>
+        </w:rPr>
+        <w:t xml:space="preserve">The console should carry the network failure and nothing else. Handling a failed request is normal work. It should not crash.</w:t>
       </w:r>
     </w:p>
     <w:p>
@@ -6070,84 +6070,329 @@
         <w:rPr>
           <w:sz w:val="22"/>
         </w:rPr>
-        <w:t xml:space="preserve"> The table still lists the same rows. No toast, no banner, no inline message, no empty state. The only visible change is the date in the From Date box.</w:t>
-      </w:r>
-    </w:p>
-    <w:p>
-      <w:pPr>
-        <w:spacing w:before="0" w:after="120"/>
-        <w:rPr>
-          <w:sz w:val="22"/>
-        </w:rPr>
-      </w:pPr>
-      <w:r>
-        <w:rPr>
-          <w:sz w:val="22"/>
-          <w:b/>
-        </w:rPr>
-        <w:t xml:space="preserve">In the console:</w:t>
-      </w:r>
-      <w:r>
-        <w:rPr>
-          <w:sz w:val="22"/>
-        </w:rPr>
-        <w:t xml:space="preserve"> the browser logs the failed request, and then the failure handler adds three faults of its own.</w:t>
-      </w:r>
-    </w:p>
-    <w:p>
-      <w:pPr>
-        <w:spacing w:before="0" w:after="120"/>
-        <w:rPr>
-          <w:sz w:val="22"/>
-        </w:rPr>
-      </w:pPr>
-      <w:r>
-        <w:rPr>
-          <w:sz w:val="22"/>
-        </w:rPr>
-        <w:t xml:space="preserve">``` GET .../v2/payment/payment_stats_us?merchant_id=... net::ERR_INTERNET_DISCONNECTED</w:t>
-      </w:r>
-    </w:p>
-    <w:p>
-      <w:pPr>
-        <w:spacing w:before="0" w:after="120"/>
-        <w:rPr>
-          <w:sz w:val="22"/>
-        </w:rPr>
-      </w:pPr>
-      <w:r>
-        <w:rPr>
-          <w:sz w:val="22"/>
-        </w:rPr>
-        <w:t xml:space="preserve">err:  TypeError: Cannot convert undefined or null to object at Object.keys (&lt;anonymous&gt;)</w:t>
-      </w:r>
-    </w:p>
-    <w:p>
-      <w:pPr>
-        <w:spacing w:before="0" w:after="120"/>
-        <w:rPr>
-          <w:sz w:val="22"/>
-        </w:rPr>
-      </w:pPr>
-      <w:r>
-        <w:rPr>
-          <w:sz w:val="22"/>
-        </w:rPr>
-        <w:t xml:space="preserve">err:  TypeError: Cannot read properties of undefined (reading 'error_code')</w:t>
-      </w:r>
-    </w:p>
-    <w:p>
-      <w:pPr>
-        <w:spacing w:before="0" w:after="120"/>
-        <w:rPr>
-          <w:sz w:val="22"/>
-        </w:rPr>
-      </w:pPr>
-      <w:r>
-        <w:rPr>
-          <w:sz w:val="22"/>
-        </w:rPr>
-        <w:t xml:space="preserve">Uncaught (in promise) ReferenceError: err is not defined ```</w:t>
+        <w:t xml:space="preserve"> The table shows the same rows as before. Only the date in the box has changed.</w:t>
+      </w:r>
+    </w:p>
+    <w:p>
+      <w:pPr>
+        <w:spacing w:before="0" w:after="120"/>
+        <w:rPr>
+          <w:sz w:val="22"/>
+        </w:rPr>
+      </w:pPr>
+      <w:r>
+        <w:rPr>
+          <w:sz w:val="22"/>
+          <w:b/>
+        </w:rPr>
+        <w:t xml:space="preserve">In the console: four things appear.</w:t>
+      </w:r>
+      <w:r>
+        <w:rPr>
+          <w:sz w:val="22"/>
+        </w:rPr>
+        <w:t xml:space="preserve"> One is the real cause. The other three are the handler crashing.</w:t>
+      </w:r>
+    </w:p>
+    <w:tbl>
+      <w:tblPr>
+        <w:tblW w:w="9360" w:type="dxa"/>
+        <w:tblBorders>
+          <w:top w:val="single" w:sz="4" w:space="0" w:color="BFBFBF"/>
+          <w:left w:val="single" w:sz="4" w:space="0" w:color="BFBFBF"/>
+          <w:bottom w:val="single" w:sz="4" w:space="0" w:color="BFBFBF"/>
+          <w:right w:val="single" w:sz="4" w:space="0" w:color="BFBFBF"/>
+          <w:insideH w:val="single" w:sz="4" w:space="0" w:color="BFBFBF"/>
+          <w:insideV w:val="single" w:sz="4" w:space="0" w:color="BFBFBF"/>
+        </w:tblBorders>
+      </w:tblPr>
+      <w:tr>
+        <w:tc>
+          <w:tcPr>
+            <w:tcW w:w="3120" w:type="dxa"/>
+            <w:shd w:val="clear" w:fill="F2F2F2"/>
+          </w:tcPr>
+          <w:p>
+            <w:pPr>
+              <w:spacing w:before="40" w:after="40"/>
+            </w:pPr>
+            <w:r>
+              <w:rPr>
+                <w:sz w:val="20"/>
+                <w:b/>
+              </w:rPr>
+              <w:t xml:space="preserve">Marked</w:t>
+            </w:r>
+          </w:p>
+        </w:tc>
+        <w:tc>
+          <w:tcPr>
+            <w:tcW w:w="3120" w:type="dxa"/>
+            <w:shd w:val="clear" w:fill="F2F2F2"/>
+          </w:tcPr>
+          <w:p>
+            <w:pPr>
+              <w:spacing w:before="40" w:after="40"/>
+            </w:pPr>
+            <w:r>
+              <w:rPr>
+                <w:sz w:val="20"/>
+                <w:b/>
+              </w:rPr>
+              <w:t xml:space="preserve">Console line</w:t>
+            </w:r>
+          </w:p>
+        </w:tc>
+        <w:tc>
+          <w:tcPr>
+            <w:tcW w:w="3120" w:type="dxa"/>
+            <w:shd w:val="clear" w:fill="F2F2F2"/>
+          </w:tcPr>
+          <w:p>
+            <w:pPr>
+              <w:spacing w:before="40" w:after="40"/>
+            </w:pPr>
+            <w:r>
+              <w:rPr>
+                <w:sz w:val="20"/>
+                <w:b/>
+              </w:rPr>
+              <w:t xml:space="preserve">What it is</w:t>
+            </w:r>
+          </w:p>
+        </w:tc>
+      </w:tr>
+      <w:tr>
+        <w:tc>
+          <w:tcPr>
+            <w:tcW w:w="3120" w:type="dxa"/>
+          </w:tcPr>
+          <w:p>
+            <w:pPr>
+              <w:spacing w:before="40" w:after="40"/>
+            </w:pPr>
+            <w:r>
+              <w:rPr>
+                <w:sz w:val="20"/>
+              </w:rPr>
+              <w:t xml:space="preserve">CAUSE</w:t>
+            </w:r>
+          </w:p>
+        </w:tc>
+        <w:tc>
+          <w:tcPr>
+            <w:tcW w:w="3120" w:type="dxa"/>
+          </w:tcPr>
+          <w:p>
+            <w:pPr>
+              <w:spacing w:before="40" w:after="40"/>
+            </w:pPr>
+            <w:r>
+              <w:rPr>
+                <w:sz w:val="20"/>
+              </w:rPr>
+              <w:t xml:space="preserve">payment_stats_us ... net::ERR_INTERNET_DISCONNECTED</w:t>
+            </w:r>
+          </w:p>
+        </w:tc>
+        <w:tc>
+          <w:tcPr>
+            <w:tcW w:w="3120" w:type="dxa"/>
+          </w:tcPr>
+          <w:p>
+            <w:pPr>
+              <w:spacing w:before="40" w:after="40"/>
+            </w:pPr>
+            <w:r>
+              <w:rPr>
+                <w:sz w:val="20"/>
+              </w:rPr>
+              <w:t xml:space="preserve">The stats request never completed. This is the real problem.</w:t>
+            </w:r>
+          </w:p>
+        </w:tc>
+      </w:tr>
+      <w:tr>
+        <w:tc>
+          <w:tcPr>
+            <w:tcW w:w="3120" w:type="dxa"/>
+          </w:tcPr>
+          <w:p>
+            <w:pPr>
+              <w:spacing w:before="40" w:after="40"/>
+            </w:pPr>
+            <w:r>
+              <w:rPr>
+                <w:sz w:val="20"/>
+              </w:rPr>
+              <w:t xml:space="preserve">1</w:t>
+            </w:r>
+          </w:p>
+        </w:tc>
+        <w:tc>
+          <w:tcPr>
+            <w:tcW w:w="3120" w:type="dxa"/>
+          </w:tcPr>
+          <w:p>
+            <w:pPr>
+              <w:spacing w:before="40" w:after="40"/>
+            </w:pPr>
+            <w:r>
+              <w:rPr>
+                <w:sz w:val="20"/>
+              </w:rPr>
+              <w:t xml:space="preserve">err: TypeError: Cannot convert undefined or null to object</w:t>
+            </w:r>
+          </w:p>
+        </w:tc>
+        <w:tc>
+          <w:tcPr>
+            <w:tcW w:w="3120" w:type="dxa"/>
+          </w:tcPr>
+          <w:p>
+            <w:pPr>
+              <w:spacing w:before="40" w:after="40"/>
+            </w:pPr>
+            <w:r>
+              <w:rPr>
+                <w:sz w:val="20"/>
+              </w:rPr>
+              <w:t xml:space="preserve">The handler runs Object.keys on a reply that does not exist.</w:t>
+            </w:r>
+          </w:p>
+        </w:tc>
+      </w:tr>
+      <w:tr>
+        <w:tc>
+          <w:tcPr>
+            <w:tcW w:w="3120" w:type="dxa"/>
+          </w:tcPr>
+          <w:p>
+            <w:pPr>
+              <w:spacing w:before="40" w:after="40"/>
+            </w:pPr>
+            <w:r>
+              <w:rPr>
+                <w:sz w:val="20"/>
+              </w:rPr>
+              <w:t xml:space="preserve">2</w:t>
+            </w:r>
+          </w:p>
+        </w:tc>
+        <w:tc>
+          <w:tcPr>
+            <w:tcW w:w="3120" w:type="dxa"/>
+          </w:tcPr>
+          <w:p>
+            <w:pPr>
+              <w:spacing w:before="40" w:after="40"/>
+            </w:pPr>
+            <w:r>
+              <w:rPr>
+                <w:sz w:val="20"/>
+              </w:rPr>
+              <w:t xml:space="preserve">err: TypeError: Cannot read properties of undefined (reading 'error_code')</w:t>
+            </w:r>
+          </w:p>
+        </w:tc>
+        <w:tc>
+          <w:tcPr>
+            <w:tcW w:w="3120" w:type="dxa"/>
+          </w:tcPr>
+          <w:p>
+            <w:pPr>
+              <w:spacing w:before="40" w:after="40"/>
+            </w:pPr>
+            <w:r>
+              <w:rPr>
+                <w:sz w:val="20"/>
+              </w:rPr>
+              <w:t xml:space="preserve">The handler then reads an error code off that same missing reply.</w:t>
+            </w:r>
+          </w:p>
+        </w:tc>
+      </w:tr>
+      <w:tr>
+        <w:tc>
+          <w:tcPr>
+            <w:tcW w:w="3120" w:type="dxa"/>
+          </w:tcPr>
+          <w:p>
+            <w:pPr>
+              <w:spacing w:before="40" w:after="40"/>
+            </w:pPr>
+            <w:r>
+              <w:rPr>
+                <w:sz w:val="20"/>
+              </w:rPr>
+              <w:t xml:space="preserve">3</w:t>
+            </w:r>
+          </w:p>
+        </w:tc>
+        <w:tc>
+          <w:tcPr>
+            <w:tcW w:w="3120" w:type="dxa"/>
+          </w:tcPr>
+          <w:p>
+            <w:pPr>
+              <w:spacing w:before="40" w:after="40"/>
+            </w:pPr>
+            <w:r>
+              <w:rPr>
+                <w:sz w:val="20"/>
+              </w:rPr>
+              <w:t xml:space="preserve">Uncaught (in promise) ReferenceError: err is not defined</w:t>
+            </w:r>
+          </w:p>
+        </w:tc>
+        <w:tc>
+          <w:tcPr>
+            <w:tcW w:w="3120" w:type="dxa"/>
+          </w:tcPr>
+          <w:p>
+            <w:pPr>
+              <w:spacing w:before="40" w:after="40"/>
+            </w:pPr>
+            <w:r>
+              <w:rPr>
+                <w:sz w:val="20"/>
+              </w:rPr>
+              <w:t xml:space="preserve">The catch block uses a variable that is not there, so it throws.</w:t>
+            </w:r>
+          </w:p>
+        </w:tc>
+      </w:tr>
+    </w:tbl>
+    <w:p>
+      <w:pPr>
+        <w:spacing w:after="120"/>
+      </w:pPr>
+    </w:p>
+    <w:p>
+      <w:pPr>
+        <w:spacing w:before="0" w:after="120"/>
+        <w:rPr>
+          <w:sz w:val="22"/>
+        </w:rPr>
+      </w:pPr>
+      <w:r>
+        <w:rPr>
+          <w:sz w:val="22"/>
+        </w:rPr>
+        <w:t xml:space="preserve">Fault </w:t>
+      </w:r>
+      <w:r>
+        <w:rPr>
+          <w:sz w:val="22"/>
+          <w:b/>
+        </w:rPr>
+        <w:t xml:space="preserve">3</w:t>
+      </w:r>
+      <w:r>
+        <w:rPr>
+          <w:sz w:val="22"/>
+        </w:rPr>
+        <w:t xml:space="preserve"> is why the screen stays silent. The handler throws before it reaches the code that would have shown a message.</w:t>
       </w:r>
     </w:p>
     <w:p>
@@ -6168,6 +6413,20 @@
     </w:p>
     <w:p>
       <w:pPr>
+        <w:spacing w:before="0" w:after="120"/>
+        <w:rPr>
+          <w:sz w:val="22"/>
+        </w:rPr>
+      </w:pPr>
+      <w:r>
+        <w:rPr>
+          <w:sz w:val="22"/>
+        </w:rPr>
+        <w:t xml:space="preserve">The three faults and the real cause are boxed and numbered in the pictures below.</w:t>
+      </w:r>
+    </w:p>
+    <w:p>
+      <w:pPr>
         <w:spacing w:before="240" w:after="100"/>
         <w:rPr>
           <w:sz w:val="24"/>
@@ -6179,7 +6438,7 @@
           <w:sz w:val="24"/>
           <w:b/>
         </w:rPr>
-        <w:t xml:space="preserve">Before the failure — a healthy page</w:t>
+        <w:t xml:space="preserve">Before the failure — the control</w:t>
       </w:r>
     </w:p>
     <w:p>
@@ -6244,34 +6503,48 @@
         <w:rPr>
           <w:sz w:val="22"/>
         </w:rPr>
-        <w:t xml:space="preserve"> and the table lists ACH / CheckSale, DISCOVER / CreditSale, MASTERCARD / CreditSale and MASTERCARD / DebitSale, all on SmartPay.</w:t>
-      </w:r>
-    </w:p>
-    <w:p>
-      <w:pPr>
-        <w:spacing w:before="0" w:after="120"/>
-        <w:rPr>
-          <w:sz w:val="22"/>
-        </w:rPr>
-      </w:pPr>
-      <w:r>
-        <w:rPr>
-          <w:sz w:val="22"/>
-        </w:rPr>
-        <w:t xml:space="preserve">The console holds two unrelated entries and </w:t>
-      </w:r>
-      <w:r>
-        <w:rPr>
-          <w:sz w:val="22"/>
-          <w:b/>
-        </w:rPr>
-        <w:t xml:space="preserve">none of the three faults</w:t>
-      </w:r>
-      <w:r>
-        <w:rPr>
-          <w:sz w:val="22"/>
-        </w:rPr>
-        <w:t xml:space="preserve">. This is the control: whatever appears next was caused by the failure and was not already there.</w:t>
+        <w:t xml:space="preserve">. The table lists four rows: ACH / CheckSale, DISCOVER / CreditSale, MASTERCARD / CreditSale, MASTERCARD / DebitSale.</w:t>
+      </w:r>
+    </w:p>
+    <w:p>
+      <w:pPr>
+        <w:spacing w:before="0" w:after="120"/>
+        <w:rPr>
+          <w:sz w:val="22"/>
+        </w:rPr>
+      </w:pPr>
+      <w:r>
+        <w:rPr>
+          <w:sz w:val="22"/>
+        </w:rPr>
+        <w:t xml:space="preserve">The green box marks the whole console. </w:t>
+      </w:r>
+      <w:r>
+        <w:rPr>
+          <w:sz w:val="22"/>
+          <w:b/>
+        </w:rPr>
+        <w:t xml:space="preserve">None of the three faults are in it.</w:t>
+      </w:r>
+      <w:r>
+        <w:rPr>
+          <w:sz w:val="22"/>
+        </w:rPr>
+        <w:t xml:space="preserve"> The two entries there are unrelated and were already on the page.</w:t>
+      </w:r>
+    </w:p>
+    <w:p>
+      <w:pPr>
+        <w:spacing w:before="0" w:after="120"/>
+        <w:rPr>
+          <w:sz w:val="22"/>
+        </w:rPr>
+      </w:pPr>
+      <w:r>
+        <w:rPr>
+          <w:sz w:val="22"/>
+        </w:rPr>
+        <w:t xml:space="preserve">This picture matters. It proves the faults in the next picture were caused by the failure and were not sitting there beforehand.</w:t>
       </w:r>
     </w:p>
     <w:p>
@@ -6287,7 +6560,7 @@
           <w:sz w:val="24"/>
           <w:b/>
         </w:rPr>
-        <w:t xml:space="preserve">After the failure — same table, three new faults</w:t>
+        <w:t xml:space="preserve">After the failure — the same table, three new faults</w:t>
       </w:r>
     </w:p>
     <w:p>
@@ -6352,42 +6625,324 @@
         <w:rPr>
           <w:sz w:val="22"/>
         </w:rPr>
-        <w:t xml:space="preserve">. Submit has been pressed and the request has failed.</w:t>
-      </w:r>
-    </w:p>
-    <w:p>
-      <w:pPr>
-        <w:spacing w:before="0" w:after="120"/>
-        <w:rPr>
-          <w:sz w:val="22"/>
-        </w:rPr>
-      </w:pPr>
-      <w:r>
-        <w:rPr>
-          <w:sz w:val="22"/>
-          <w:b/>
-        </w:rPr>
-        <w:t xml:space="preserve">Compare the two tables. They are identical</w:t>
-      </w:r>
-      <w:r>
-        <w:rPr>
-          <w:sz w:val="22"/>
-        </w:rPr>
-        <w:t xml:space="preserve"> — the same four rows in the same order. A different date range was requested and the screen still shows the previous answer, with nothing to indicate that.</w:t>
-      </w:r>
-    </w:p>
-    <w:p>
-      <w:pPr>
-        <w:spacing w:before="0" w:after="120"/>
-        <w:rPr>
-          <w:sz w:val="22"/>
-        </w:rPr>
-      </w:pPr>
-      <w:r>
-        <w:rPr>
-          <w:sz w:val="22"/>
-        </w:rPr>
-        <w:t xml:space="preserve">In the console, below the </w:t>
+        <w:t xml:space="preserve">. Submit has been pressed. The request has failed.</w:t>
+      </w:r>
+    </w:p>
+    <w:p>
+      <w:pPr>
+        <w:spacing w:before="0" w:after="120"/>
+        <w:rPr>
+          <w:sz w:val="22"/>
+        </w:rPr>
+      </w:pPr>
+      <w:r>
+        <w:rPr>
+          <w:sz w:val="22"/>
+          <w:b/>
+        </w:rPr>
+        <w:t xml:space="preserve">Look at the orange box round the table. It holds the same four rows as the picture before.</w:t>
+      </w:r>
+      <w:r>
+        <w:rPr>
+          <w:sz w:val="22"/>
+        </w:rPr>
+        <w:t xml:space="preserve"> Nothing on the page has changed except the date. That is the defect.</w:t>
+      </w:r>
+    </w:p>
+    <w:p>
+      <w:pPr>
+        <w:spacing w:before="0" w:after="120"/>
+        <w:rPr>
+          <w:sz w:val="22"/>
+        </w:rPr>
+      </w:pPr>
+      <w:r>
+        <w:rPr>
+          <w:sz w:val="22"/>
+        </w:rPr>
+        <w:t xml:space="preserve">In the console, the blue </w:t>
+      </w:r>
+      <w:r>
+        <w:rPr>
+          <w:sz w:val="22"/>
+          <w:b/>
+        </w:rPr>
+        <w:t xml:space="preserve">CAUSE</w:t>
+      </w:r>
+      <w:r>
+        <w:rPr>
+          <w:sz w:val="22"/>
+        </w:rPr>
+        <w:t xml:space="preserve"> box is the stats request failing. The three red boxes — </w:t>
+      </w:r>
+      <w:r>
+        <w:rPr>
+          <w:sz w:val="22"/>
+          <w:b/>
+        </w:rPr>
+        <w:t xml:space="preserve">1</w:t>
+      </w:r>
+      <w:r>
+        <w:rPr>
+          <w:sz w:val="22"/>
+        </w:rPr>
+        <w:t xml:space="preserve">, </w:t>
+      </w:r>
+      <w:r>
+        <w:rPr>
+          <w:sz w:val="22"/>
+          <w:b/>
+        </w:rPr>
+        <w:t xml:space="preserve">2</w:t>
+      </w:r>
+      <w:r>
+        <w:rPr>
+          <w:sz w:val="22"/>
+        </w:rPr>
+        <w:t xml:space="preserve"> and </w:t>
+      </w:r>
+      <w:r>
+        <w:rPr>
+          <w:sz w:val="22"/>
+          <w:b/>
+        </w:rPr>
+        <w:t xml:space="preserve">3</w:t>
+      </w:r>
+      <w:r>
+        <w:rPr>
+          <w:sz w:val="22"/>
+        </w:rPr>
+        <w:t xml:space="preserve"> — are the handler crashing afterwards.</w:t>
+      </w:r>
+    </w:p>
+    <w:p>
+      <w:pPr>
+        <w:spacing w:before="240" w:after="100"/>
+        <w:rPr>
+          <w:sz w:val="24"/>
+          <w:b/>
+        </w:rPr>
+      </w:pPr>
+      <w:r>
+        <w:rPr>
+          <w:sz w:val="24"/>
+          <w:b/>
+        </w:rPr>
+        <w:t xml:space="preserve">The console, close up</w:t>
+      </w:r>
+    </w:p>
+    <w:p>
+      <w:pPr>
+        <w:spacing w:before="80" w:after="200"/>
+      </w:pPr>
+      <w:r>
+        <w:drawing>
+          <wp:inline distT="0" distB="0" distL="0" distR="0">
+            <wp:extent cx="5943600" cy="2557130"/>
+            <wp:docPr id="113" name="Picture 113"/>
+            <a:graphic xmlns:a="http://schemas.openxmlformats.org/drawingml/2006/main">
+              <a:graphicData uri="http://schemas.openxmlformats.org/drawingml/2006/picture">
+                <pic:pic xmlns:pic="http://schemas.openxmlformats.org/drawingml/2006/picture">
+                  <pic:nvPicPr>
+                    <pic:cNvPr id="113" name="Picture"/>
+                    <pic:cNvPicPr/>
+                  </pic:nvPicPr>
+                  <pic:blipFill>
+                    <a:blip r:embed="rId113"/>
+                    <a:stretch>
+                      <a:fillRect/>
+                    </a:stretch>
+                  </pic:blipFill>
+                  <pic:spPr>
+                    <a:xfrm>
+                      <a:off x="0" y="0"/>
+                      <a:ext cx="5943600" cy="2557130"/>
+                    </a:xfrm>
+                    <a:prstGeom prst="rect">
+                      <a:avLst/>
+                    </a:prstGeom>
+                  </pic:spPr>
+                </pic:pic>
+              </a:graphicData>
+            </a:graphic>
+          </wp:inline>
+        </w:drawing>
+      </w:r>
+    </w:p>
+    <w:p>
+      <w:pPr>
+        <w:spacing w:before="0" w:after="120"/>
+        <w:rPr>
+          <w:sz w:val="22"/>
+        </w:rPr>
+      </w:pPr>
+      <w:r>
+        <w:rPr>
+          <w:sz w:val="22"/>
+        </w:rPr>
+        <w:t xml:space="preserve">The same four entries, enlarged so the text can be read.</w:t>
+      </w:r>
+    </w:p>
+    <w:p>
+      <w:pPr>
+        <w:spacing w:before="0" w:after="120"/>
+        <w:rPr>
+          <w:sz w:val="22"/>
+        </w:rPr>
+      </w:pPr>
+      <w:r>
+        <w:rPr>
+          <w:sz w:val="22"/>
+        </w:rPr>
+        <w:t xml:space="preserve">Notice the background colour. Boxes </w:t>
+      </w:r>
+      <w:r>
+        <w:rPr>
+          <w:sz w:val="22"/>
+          <w:b/>
+        </w:rPr>
+        <w:t xml:space="preserve">1</w:t>
+      </w:r>
+      <w:r>
+        <w:rPr>
+          <w:sz w:val="22"/>
+        </w:rPr>
+        <w:t xml:space="preserve"> and </w:t>
+      </w:r>
+      <w:r>
+        <w:rPr>
+          <w:sz w:val="22"/>
+          <w:b/>
+        </w:rPr>
+        <w:t xml:space="preserve">2</w:t>
+      </w:r>
+      <w:r>
+        <w:rPr>
+          <w:sz w:val="22"/>
+        </w:rPr>
+        <w:t xml:space="preserve"> sit on </w:t>
+      </w:r>
+      <w:r>
+        <w:rPr>
+          <w:sz w:val="22"/>
+          <w:b/>
+        </w:rPr>
+        <w:t xml:space="preserve">white</w:t>
+      </w:r>
+      <w:r>
+        <w:rPr>
+          <w:sz w:val="22"/>
+        </w:rPr>
+        <w:t xml:space="preserve">, with no red ✗ icon. The </w:t>
+      </w:r>
+      <w:r>
+        <w:rPr>
+          <w:sz w:val="22"/>
+          <w:b/>
+        </w:rPr>
+        <w:t xml:space="preserve">CAUSE</w:t>
+      </w:r>
+      <w:r>
+        <w:rPr>
+          <w:sz w:val="22"/>
+        </w:rPr>
+        <w:t xml:space="preserve"> box and box </w:t>
+      </w:r>
+      <w:r>
+        <w:rPr>
+          <w:sz w:val="22"/>
+          <w:b/>
+        </w:rPr>
+        <w:t xml:space="preserve">3</w:t>
+      </w:r>
+      <w:r>
+        <w:rPr>
+          <w:sz w:val="22"/>
+        </w:rPr>
+        <w:t xml:space="preserve"> sit on </w:t>
+      </w:r>
+      <w:r>
+        <w:rPr>
+          <w:sz w:val="22"/>
+          <w:b/>
+        </w:rPr>
+        <w:t xml:space="preserve">pink</w:t>
+      </w:r>
+      <w:r>
+        <w:rPr>
+          <w:sz w:val="22"/>
+        </w:rPr>
+        <w:t xml:space="preserve">, with the icon.</w:t>
+      </w:r>
+    </w:p>
+    <w:p>
+      <w:pPr>
+        <w:spacing w:before="0" w:after="120"/>
+        <w:rPr>
+          <w:sz w:val="22"/>
+        </w:rPr>
+      </w:pPr>
+      <w:r>
+        <w:rPr>
+          <w:sz w:val="22"/>
+        </w:rPr>
+        <w:t xml:space="preserve">That difference is not cosmetic. It is the warning below.</w:t>
+      </w:r>
+    </w:p>
+    <w:p>
+      <w:pPr>
+        <w:spacing w:before="240" w:after="100"/>
+        <w:rPr>
+          <w:sz w:val="24"/>
+          <w:b/>
+        </w:rPr>
+      </w:pPr>
+      <w:r>
+        <w:rPr>
+          <w:sz w:val="24"/>
+          <w:b/>
+        </w:rPr>
+        <w:t xml:space="preserve">Warning — two of the faults are easy to miss</w:t>
+      </w:r>
+    </w:p>
+    <w:p>
+      <w:pPr>
+        <w:spacing w:before="0" w:after="120"/>
+        <w:rPr>
+          <w:sz w:val="22"/>
+        </w:rPr>
+      </w:pPr>
+      <w:r>
+        <w:rPr>
+          <w:sz w:val="22"/>
+        </w:rPr>
+        <w:t xml:space="preserve">The page logs faults </w:t>
+      </w:r>
+      <w:r>
+        <w:rPr>
+          <w:sz w:val="22"/>
+          <w:b/>
+        </w:rPr>
+        <w:t xml:space="preserve">1</w:t>
+      </w:r>
+      <w:r>
+        <w:rPr>
+          <w:sz w:val="22"/>
+        </w:rPr>
+        <w:t xml:space="preserve"> and </w:t>
+      </w:r>
+      <w:r>
+        <w:rPr>
+          <w:sz w:val="22"/>
+          <w:b/>
+        </w:rPr>
+        <w:t xml:space="preserve">2</w:t>
+      </w:r>
+      <w:r>
+        <w:rPr>
+          <w:sz w:val="22"/>
+        </w:rPr>
+        <w:t xml:space="preserve"> through </w:t>
       </w:r>
       <w:r>
         <w:rPr>
@@ -6395,13 +6950,13 @@
           <w:rFonts w:ascii="Consolas" w:hAnsi="Consolas"/>
           <w:sz w:val="20"/>
         </w:rPr>
-        <w:t xml:space="preserve">ERR_INTERNET_DISCONNECTED</w:t>
-      </w:r>
-      <w:r>
-        <w:rPr>
-          <w:sz w:val="22"/>
-        </w:rPr>
-        <w:t xml:space="preserve"> line for </w:t>
+        <w:t xml:space="preserve">console.log</w:t>
+      </w:r>
+      <w:r>
+        <w:rPr>
+          <w:sz w:val="22"/>
+        </w:rPr>
+        <w:t xml:space="preserve"> and </w:t>
       </w:r>
       <w:r>
         <w:rPr>
@@ -6409,13 +6964,80 @@
           <w:rFonts w:ascii="Consolas" w:hAnsi="Consolas"/>
           <w:sz w:val="20"/>
         </w:rPr>
-        <w:t xml:space="preserve">payment_stats_us</w:t>
-      </w:r>
-      <w:r>
-        <w:rPr>
-          <w:sz w:val="22"/>
-        </w:rPr>
-        <w:t xml:space="preserve">, sit all three faults: </w:t>
+        <w:t xml:space="preserve">console.info</w:t>
+      </w:r>
+      <w:r>
+        <w:rPr>
+          <w:sz w:val="22"/>
+        </w:rPr>
+        <w:t xml:space="preserve">. It does not log them as errors.</w:t>
+      </w:r>
+    </w:p>
+    <w:p>
+      <w:pPr>
+        <w:spacing w:before="0" w:after="120"/>
+        <w:rPr>
+          <w:sz w:val="22"/>
+        </w:rPr>
+      </w:pPr>
+      <w:r>
+        <w:rPr>
+          <w:sz w:val="22"/>
+        </w:rPr>
+        <w:t xml:space="preserve">So if the console filter is set to </w:t>
+      </w:r>
+      <w:r>
+        <w:rPr>
+          <w:sz w:val="22"/>
+          <w:b/>
+        </w:rPr>
+        <w:t xml:space="preserve">Errors</w:t>
+      </w:r>
+      <w:r>
+        <w:rPr>
+          <w:sz w:val="22"/>
+        </w:rPr>
+        <w:t xml:space="preserve">, those two lines </w:t>
+      </w:r>
+      <w:r>
+        <w:rPr>
+          <w:sz w:val="22"/>
+          <w:b/>
+        </w:rPr>
+        <w:t xml:space="preserve">do not appear</w:t>
+      </w:r>
+      <w:r>
+        <w:rPr>
+          <w:sz w:val="22"/>
+        </w:rPr>
+        <w:t xml:space="preserve">. The bug looks smaller than it is. Leave the filter on </w:t>
+      </w:r>
+      <w:r>
+        <w:rPr>
+          <w:sz w:val="22"/>
+          <w:b/>
+        </w:rPr>
+        <w:t xml:space="preserve">Default levels</w:t>
+      </w:r>
+      <w:r>
+        <w:rPr>
+          <w:sz w:val="22"/>
+        </w:rPr>
+        <w:t xml:space="preserve">.</w:t>
+      </w:r>
+    </w:p>
+    <w:p>
+      <w:pPr>
+        <w:spacing w:before="0" w:after="120"/>
+        <w:rPr>
+          <w:sz w:val="22"/>
+        </w:rPr>
+      </w:pPr>
+      <w:r>
+        <w:rPr>
+          <w:sz w:val="22"/>
+        </w:rPr>
+        <w:t xml:space="preserve">This is worth saying plainly because it caught the automated test too. A listener watching only </w:t>
       </w:r>
       <w:r>
         <w:rPr>
@@ -6423,13 +7045,138 @@
           <w:rFonts w:ascii="Consolas" w:hAnsi="Consolas"/>
           <w:sz w:val="20"/>
         </w:rPr>
-        <w:t xml:space="preserve">Cannot convert undefined or null to object</w:t>
-      </w:r>
-      <w:r>
-        <w:rPr>
-          <w:sz w:val="22"/>
-        </w:rPr>
-        <w:t xml:space="preserve">, </w:t>
+        <w:t xml:space="preserve">console.error</w:t>
+      </w:r>
+      <w:r>
+        <w:rPr>
+          <w:sz w:val="22"/>
+        </w:rPr>
+        <w:t xml:space="preserve"> found one fault instead of three.</w:t>
+      </w:r>
+    </w:p>
+    <w:p>
+      <w:pPr>
+        <w:spacing w:before="280" w:after="120"/>
+        <w:rPr>
+          <w:sz w:val="28"/>
+          <w:b/>
+        </w:rPr>
+      </w:pPr>
+      <w:r>
+        <w:rPr>
+          <w:sz w:val="28"/>
+          <w:b/>
+        </w:rPr>
+        <w:t xml:space="preserve">Impact</w:t>
+      </w:r>
+    </w:p>
+    <w:p>
+      <w:pPr>
+        <w:spacing w:before="0" w:after="120"/>
+        <w:rPr>
+          <w:sz w:val="22"/>
+        </w:rPr>
+      </w:pPr>
+      <w:r>
+        <w:rPr>
+          <w:sz w:val="22"/>
+        </w:rPr>
+        <w:t xml:space="preserve">A merchant on a dropped connection, a VPN blip or a short outage sees old figures shown as current ones. They cannot tell. If they use those numbers for reconciliation, a report or a decision about a date range, they are using the wrong data.</w:t>
+      </w:r>
+    </w:p>
+    <w:p>
+      <w:pPr>
+        <w:spacing w:before="0" w:after="120"/>
+        <w:rPr>
+          <w:sz w:val="22"/>
+        </w:rPr>
+      </w:pPr>
+      <w:r>
+        <w:rPr>
+          <w:sz w:val="22"/>
+        </w:rPr>
+        <w:t xml:space="preserve">This is worse than an error message. An error tells the merchant to try again. Silence looks like success.</w:t>
+      </w:r>
+    </w:p>
+    <w:p>
+      <w:pPr>
+        <w:spacing w:before="0" w:after="120"/>
+        <w:rPr>
+          <w:sz w:val="22"/>
+        </w:rPr>
+      </w:pPr>
+      <w:r>
+        <w:rPr>
+          <w:sz w:val="22"/>
+        </w:rPr>
+        <w:t xml:space="preserve">For anyone handling a support call, the console holds five errors. Three of them come from the code that was supposed to handle the problem. The real cause is in there, but it is buried.</w:t>
+      </w:r>
+    </w:p>
+    <w:p>
+      <w:pPr>
+        <w:spacing w:before="0" w:after="120"/>
+        <w:rPr>
+          <w:sz w:val="22"/>
+        </w:rPr>
+      </w:pPr>
+      <w:r>
+        <w:rPr>
+          <w:sz w:val="22"/>
+          <w:b/>
+        </w:rPr>
+        <w:t xml:space="preserve">Workaround:</w:t>
+      </w:r>
+      <w:r>
+        <w:rPr>
+          <w:sz w:val="22"/>
+        </w:rPr>
+        <w:t xml:space="preserve"> none for the merchant, because there is nothing to notice. Submitting again once the connection is back gives the right figures.</w:t>
+      </w:r>
+    </w:p>
+    <w:p>
+      <w:pPr>
+        <w:spacing w:before="280" w:after="120"/>
+        <w:rPr>
+          <w:sz w:val="28"/>
+          <w:b/>
+        </w:rPr>
+      </w:pPr>
+      <w:r>
+        <w:rPr>
+          <w:sz w:val="28"/>
+          <w:b/>
+        </w:rPr>
+        <w:t xml:space="preserve">Notes for the developer</w:t>
+      </w:r>
+    </w:p>
+    <w:p>
+      <w:pPr>
+        <w:spacing w:before="0" w:after="80"/>
+        <w:ind w:left="360"/>
+        <w:rPr>
+          <w:sz w:val="22"/>
+        </w:rPr>
+      </w:pPr>
+      <w:r>
+        <w:rPr>
+          <w:sz w:val="22"/>
+        </w:rPr>
+        <w:t xml:space="preserve">• Check the reply exists before reading it. Both TypeErrors come from touching a body that is not there on a failed request.</w:t>
+      </w:r>
+    </w:p>
+    <w:p>
+      <w:pPr>
+        <w:spacing w:before="0" w:after="80"/>
+        <w:ind w:left="360"/>
+        <w:rPr>
+          <w:sz w:val="22"/>
+        </w:rPr>
+      </w:pPr>
+      <w:r>
+        <w:rPr>
+          <w:sz w:val="22"/>
+        </w:rPr>
+        <w:t xml:space="preserve">• Fix </w:t>
       </w:r>
       <w:r>
         <w:rPr>
@@ -6437,13 +7184,43 @@
           <w:rFonts w:ascii="Consolas" w:hAnsi="Consolas"/>
           <w:sz w:val="20"/>
         </w:rPr>
-        <w:t xml:space="preserve">Cannot read properties of undefined (reading 'error_code')</w:t>
-      </w:r>
-      <w:r>
-        <w:rPr>
-          <w:sz w:val="22"/>
-        </w:rPr>
-        <w:t xml:space="preserve">, and </w:t>
+        <w:t xml:space="preserve">err is not defined</w:t>
+      </w:r>
+      <w:r>
+        <w:rPr>
+          <w:sz w:val="22"/>
+        </w:rPr>
+        <w:t xml:space="preserve"> first. Until the handler stops throwing, no message can reach the screen. The silent-failure symptom cannot be fixed without it.</w:t>
+      </w:r>
+    </w:p>
+    <w:p>
+      <w:pPr>
+        <w:spacing w:before="0" w:after="80"/>
+        <w:ind w:left="360"/>
+        <w:rPr>
+          <w:sz w:val="22"/>
+        </w:rPr>
+      </w:pPr>
+      <w:r>
+        <w:rPr>
+          <w:sz w:val="22"/>
+        </w:rPr>
+        <w:t xml:space="preserve">• Decide what the merchant should see. Clearing the table is blunt but honest. Marking it out of date keeps the context. Either beats leaving old figures unlabelled.</w:t>
+      </w:r>
+    </w:p>
+    <w:p>
+      <w:pPr>
+        <w:spacing w:before="0" w:after="80"/>
+        <w:ind w:left="360"/>
+        <w:rPr>
+          <w:sz w:val="22"/>
+        </w:rPr>
+      </w:pPr>
+      <w:r>
+        <w:rPr>
+          <w:sz w:val="22"/>
+        </w:rPr>
+        <w:t xml:space="preserve">• If the two </w:t>
       </w:r>
       <w:r>
         <w:rPr>
@@ -6451,564 +7228,13 @@
           <w:rFonts w:ascii="Consolas" w:hAnsi="Consolas"/>
           <w:sz w:val="20"/>
         </w:rPr>
-        <w:t xml:space="preserve">ReferenceError: err is not defined</w:t>
-      </w:r>
-      <w:r>
-        <w:rPr>
-          <w:sz w:val="22"/>
-        </w:rPr>
-        <w:t xml:space="preserve">.</w:t>
-      </w:r>
-    </w:p>
-    <w:p>
-      <w:pPr>
-        <w:spacing w:before="240" w:after="100"/>
-        <w:rPr>
-          <w:sz w:val="24"/>
-          <w:b/>
-        </w:rPr>
-      </w:pPr>
-      <w:r>
-        <w:rPr>
-          <w:sz w:val="24"/>
-          <w:b/>
-        </w:rPr>
-        <w:t xml:space="preserve">A note for whoever reproduces this</w:t>
-      </w:r>
-    </w:p>
-    <w:p>
-      <w:pPr>
-        <w:spacing w:before="0" w:after="120"/>
-        <w:rPr>
-          <w:sz w:val="22"/>
-        </w:rPr>
-      </w:pPr>
-      <w:r>
-        <w:rPr>
-          <w:sz w:val="22"/>
-        </w:rPr>
-        <w:t xml:space="preserve">Look at the icons beside the two </w:t>
-      </w:r>
-      <w:r>
-        <w:rPr>
-          <w:sz w:val="22"/>
-          <w:rFonts w:ascii="Consolas" w:hAnsi="Consolas"/>
-          <w:sz w:val="20"/>
-        </w:rPr>
         <w:t xml:space="preserve">err:</w:t>
       </w:r>
       <w:r>
         <w:rPr>
           <w:sz w:val="22"/>
         </w:rPr>
-        <w:t xml:space="preserve"> lines in that screenshot. </w:t>
-      </w:r>
-      <w:r>
-        <w:rPr>
-          <w:sz w:val="22"/>
-          <w:b/>
-        </w:rPr>
-        <w:t xml:space="preserve">They have no red error icon</w:t>
-      </w:r>
-      <w:r>
-        <w:rPr>
-          <w:sz w:val="22"/>
-        </w:rPr>
-        <w:t xml:space="preserve"> — the page logs those two through </w:t>
-      </w:r>
-      <w:r>
-        <w:rPr>
-          <w:sz w:val="22"/>
-          <w:rFonts w:ascii="Consolas" w:hAnsi="Consolas"/>
-          <w:sz w:val="20"/>
-        </w:rPr>
-        <w:t xml:space="preserve">console.log</w:t>
-      </w:r>
-      <w:r>
-        <w:rPr>
-          <w:sz w:val="22"/>
-        </w:rPr>
-        <w:t xml:space="preserve"> and </w:t>
-      </w:r>
-      <w:r>
-        <w:rPr>
-          <w:sz w:val="22"/>
-          <w:rFonts w:ascii="Consolas" w:hAnsi="Consolas"/>
-          <w:sz w:val="20"/>
-        </w:rPr>
-        <w:t xml:space="preserve">console.info</w:t>
-      </w:r>
-      <w:r>
-        <w:rPr>
-          <w:sz w:val="22"/>
-        </w:rPr>
-        <w:t xml:space="preserve">, not </w:t>
-      </w:r>
-      <w:r>
-        <w:rPr>
-          <w:sz w:val="22"/>
-          <w:rFonts w:ascii="Consolas" w:hAnsi="Consolas"/>
-          <w:sz w:val="20"/>
-        </w:rPr>
-        <w:t xml:space="preserve">console.error</w:t>
-      </w:r>
-      <w:r>
-        <w:rPr>
-          <w:sz w:val="22"/>
-        </w:rPr>
-        <w:t xml:space="preserve">.</w:t>
-      </w:r>
-    </w:p>
-    <w:p>
-      <w:pPr>
-        <w:spacing w:before="0" w:after="120"/>
-        <w:rPr>
-          <w:sz w:val="22"/>
-        </w:rPr>
-      </w:pPr>
-      <w:r>
-        <w:rPr>
-          <w:sz w:val="22"/>
-        </w:rPr>
-        <w:t xml:space="preserve">If the console filter is set to </w:t>
-      </w:r>
-      <w:r>
-        <w:rPr>
-          <w:sz w:val="22"/>
-          <w:b/>
-        </w:rPr>
-        <w:t xml:space="preserve">Errors</w:t>
-      </w:r>
-      <w:r>
-        <w:rPr>
-          <w:sz w:val="22"/>
-        </w:rPr>
-        <w:t xml:space="preserve"> only, those two lines do not appear and the defect looks smaller than it is. Leave the filter on </w:t>
-      </w:r>
-      <w:r>
-        <w:rPr>
-          <w:sz w:val="22"/>
-          <w:b/>
-        </w:rPr>
-        <w:t xml:space="preserve">Default levels</w:t>
-      </w:r>
-      <w:r>
-        <w:rPr>
-          <w:sz w:val="22"/>
-        </w:rPr>
-        <w:t xml:space="preserve">.</w:t>
-      </w:r>
-    </w:p>
-    <w:p>
-      <w:pPr>
-        <w:spacing w:before="0" w:after="120"/>
-        <w:rPr>
-          <w:sz w:val="22"/>
-        </w:rPr>
-      </w:pPr>
-      <w:r>
-        <w:rPr>
-          <w:sz w:val="22"/>
-        </w:rPr>
-        <w:t xml:space="preserve">This is worth stating plainly because it also caught the automation. A listener watching only </w:t>
-      </w:r>
-      <w:r>
-        <w:rPr>
-          <w:sz w:val="22"/>
-          <w:rFonts w:ascii="Consolas" w:hAnsi="Consolas"/>
-          <w:sz w:val="20"/>
-        </w:rPr>
-        <w:t xml:space="preserve">console.error</w:t>
-      </w:r>
-      <w:r>
-        <w:rPr>
-          <w:sz w:val="22"/>
-        </w:rPr>
-        <w:t xml:space="preserve"> saw one fault instead of three.</w:t>
-      </w:r>
-    </w:p>
-    <w:p>
-      <w:pPr>
-        <w:spacing w:before="280" w:after="120"/>
-        <w:rPr>
-          <w:sz w:val="28"/>
-          <w:b/>
-        </w:rPr>
-      </w:pPr>
-      <w:r>
-        <w:rPr>
-          <w:sz w:val="28"/>
-          <w:b/>
-        </w:rPr>
-        <w:t xml:space="preserve">What pins the cause</w:t>
-      </w:r>
-    </w:p>
-    <w:p>
-      <w:pPr>
-        <w:spacing w:before="0" w:after="120"/>
-        <w:rPr>
-          <w:sz w:val="22"/>
-        </w:rPr>
-      </w:pPr>
-      <w:r>
-        <w:rPr>
-          <w:sz w:val="22"/>
-        </w:rPr>
-        <w:t xml:space="preserve">The failure handler reads the response body before checking whether there is one.</w:t>
-      </w:r>
-    </w:p>
-    <w:p>
-      <w:pPr>
-        <w:spacing w:before="0" w:after="80"/>
-        <w:ind w:left="360"/>
-        <w:rPr>
-          <w:sz w:val="22"/>
-        </w:rPr>
-      </w:pPr>
-      <w:r>
-        <w:rPr>
-          <w:sz w:val="22"/>
-        </w:rPr>
-        <w:t xml:space="preserve">• </w:t>
-      </w:r>
-      <w:r>
-        <w:rPr>
-          <w:sz w:val="22"/>
-          <w:rFonts w:ascii="Consolas" w:hAnsi="Consolas"/>
-          <w:sz w:val="20"/>
-        </w:rPr>
-        <w:t xml:space="preserve">Cannot convert undefined or null to object</w:t>
-      </w:r>
-      <w:r>
-        <w:rPr>
-          <w:sz w:val="22"/>
-        </w:rPr>
-        <w:t xml:space="preserve"> at </w:t>
-      </w:r>
-      <w:r>
-        <w:rPr>
-          <w:sz w:val="22"/>
-          <w:rFonts w:ascii="Consolas" w:hAnsi="Consolas"/>
-          <w:sz w:val="20"/>
-        </w:rPr>
-        <w:t xml:space="preserve">Object.keys</w:t>
-      </w:r>
-      <w:r>
-        <w:rPr>
-          <w:sz w:val="22"/>
-        </w:rPr>
-        <w:t xml:space="preserve"> — something calls </w:t>
-      </w:r>
-      <w:r>
-        <w:rPr>
-          <w:sz w:val="22"/>
-          <w:rFonts w:ascii="Consolas" w:hAnsi="Consolas"/>
-          <w:sz w:val="20"/>
-        </w:rPr>
-        <w:t xml:space="preserve">Object.keys</w:t>
-      </w:r>
-      <w:r>
-        <w:rPr>
-          <w:sz w:val="22"/>
-        </w:rPr>
-        <w:t xml:space="preserve"> on the response, which is </w:t>
-      </w:r>
-      <w:r>
-        <w:rPr>
-          <w:sz w:val="22"/>
-          <w:rFonts w:ascii="Consolas" w:hAnsi="Consolas"/>
-          <w:sz w:val="20"/>
-        </w:rPr>
-        <w:t xml:space="preserve">undefined</w:t>
-      </w:r>
-      <w:r>
-        <w:rPr>
-          <w:sz w:val="22"/>
-        </w:rPr>
-        <w:t xml:space="preserve"> because the request never completed.</w:t>
-      </w:r>
-    </w:p>
-    <w:p>
-      <w:pPr>
-        <w:spacing w:before="0" w:after="80"/>
-        <w:ind w:left="360"/>
-        <w:rPr>
-          <w:sz w:val="22"/>
-        </w:rPr>
-      </w:pPr>
-      <w:r>
-        <w:rPr>
-          <w:sz w:val="22"/>
-        </w:rPr>
-        <w:t xml:space="preserve">• </w:t>
-      </w:r>
-      <w:r>
-        <w:rPr>
-          <w:sz w:val="22"/>
-          <w:rFonts w:ascii="Consolas" w:hAnsi="Consolas"/>
-          <w:sz w:val="20"/>
-        </w:rPr>
-        <w:t xml:space="preserve">Cannot read properties of undefined (reading 'error_code')</w:t>
-      </w:r>
-      <w:r>
-        <w:rPr>
-          <w:sz w:val="22"/>
-        </w:rPr>
-        <w:t xml:space="preserve"> — the same object is then read for an error code.</w:t>
-      </w:r>
-    </w:p>
-    <w:p>
-      <w:pPr>
-        <w:spacing w:before="0" w:after="80"/>
-        <w:ind w:left="360"/>
-        <w:rPr>
-          <w:sz w:val="22"/>
-        </w:rPr>
-      </w:pPr>
-      <w:r>
-        <w:rPr>
-          <w:sz w:val="22"/>
-        </w:rPr>
-        <w:t xml:space="preserve">• </w:t>
-      </w:r>
-      <w:r>
-        <w:rPr>
-          <w:sz w:val="22"/>
-          <w:rFonts w:ascii="Consolas" w:hAnsi="Consolas"/>
-          <w:sz w:val="20"/>
-        </w:rPr>
-        <w:t xml:space="preserve">ReferenceError: err is not defined</w:t>
-      </w:r>
-      <w:r>
-        <w:rPr>
-          <w:sz w:val="22"/>
-        </w:rPr>
-        <w:t xml:space="preserve"> — a </w:t>
-      </w:r>
-      <w:r>
-        <w:rPr>
-          <w:sz w:val="22"/>
-          <w:rFonts w:ascii="Consolas" w:hAnsi="Consolas"/>
-          <w:sz w:val="20"/>
-        </w:rPr>
-        <w:t xml:space="preserve">catch</w:t>
-      </w:r>
-      <w:r>
-        <w:rPr>
-          <w:sz w:val="22"/>
-        </w:rPr>
-        <w:t xml:space="preserve"> block refers to a variable that is not in scope, so the handler throws before it can report anything.</w:t>
-      </w:r>
-    </w:p>
-    <w:p>
-      <w:pPr>
-        <w:spacing w:before="0" w:after="120"/>
-        <w:rPr>
-          <w:sz w:val="22"/>
-        </w:rPr>
-      </w:pPr>
-      <w:r>
-        <w:rPr>
-          <w:sz w:val="22"/>
-        </w:rPr>
-        <w:t xml:space="preserve">That third one explains the silent screen. The handler never reaches whatever would have shown the message, because it throws on the way there.</w:t>
-      </w:r>
-    </w:p>
-    <w:p>
-      <w:pPr>
-        <w:spacing w:before="280" w:after="120"/>
-        <w:rPr>
-          <w:sz w:val="28"/>
-          <w:b/>
-        </w:rPr>
-      </w:pPr>
-      <w:r>
-        <w:rPr>
-          <w:sz w:val="28"/>
-          <w:b/>
-        </w:rPr>
-        <w:t xml:space="preserve">Impact</w:t>
-      </w:r>
-    </w:p>
-    <w:p>
-      <w:pPr>
-        <w:spacing w:before="0" w:after="120"/>
-        <w:rPr>
-          <w:sz w:val="22"/>
-        </w:rPr>
-      </w:pPr>
-      <w:r>
-        <w:rPr>
-          <w:sz w:val="22"/>
-        </w:rPr>
-        <w:t xml:space="preserve">A merchant on a dropped connection, a VPN blip or a brief server outage sees old figures presented as current ones. They have no way to know. If they act on those numbers — reconciliation, a report, a decision about a date range — they are acting on the wrong data.</w:t>
-      </w:r>
-    </w:p>
-    <w:p>
-      <w:pPr>
-        <w:spacing w:before="0" w:after="120"/>
-        <w:rPr>
-          <w:sz w:val="22"/>
-        </w:rPr>
-      </w:pPr>
-      <w:r>
-        <w:rPr>
-          <w:sz w:val="22"/>
-        </w:rPr>
-        <w:t xml:space="preserve">Staleness with no warning is worse than an error message. An error tells the merchant to try again; this tells them nothing and looks like a successful result.</w:t>
-      </w:r>
-    </w:p>
-    <w:p>
-      <w:pPr>
-        <w:spacing w:before="0" w:after="120"/>
-        <w:rPr>
-          <w:sz w:val="22"/>
-        </w:rPr>
-      </w:pPr>
-      <w:r>
-        <w:rPr>
-          <w:sz w:val="22"/>
-        </w:rPr>
-        <w:t xml:space="preserve">For whoever is diagnosing a support call, the console carries five errors, three of which come from the code that was supposed to be handling the problem. The real cause — </w:t>
-      </w:r>
-      <w:r>
-        <w:rPr>
-          <w:sz w:val="22"/>
-          <w:rFonts w:ascii="Consolas" w:hAnsi="Consolas"/>
-          <w:sz w:val="20"/>
-        </w:rPr>
-        <w:t xml:space="preserve">ERR_INTERNET_DISCONNECTED</w:t>
-      </w:r>
-      <w:r>
-        <w:rPr>
-          <w:sz w:val="22"/>
-        </w:rPr>
-        <w:t xml:space="preserve"> — is present, but it is buried among the handler's own noise.</w:t>
-      </w:r>
-    </w:p>
-    <w:p>
-      <w:pPr>
-        <w:spacing w:before="0" w:after="120"/>
-        <w:rPr>
-          <w:sz w:val="22"/>
-        </w:rPr>
-      </w:pPr>
-      <w:r>
-        <w:rPr>
-          <w:sz w:val="22"/>
-          <w:b/>
-        </w:rPr>
-        <w:t xml:space="preserve">Workaround:</w:t>
-      </w:r>
-      <w:r>
-        <w:rPr>
-          <w:sz w:val="22"/>
-        </w:rPr>
-        <w:t xml:space="preserve"> none for the merchant, because there is nothing to notice. Re-submitting once the connection returns gives the correct figures.</w:t>
-      </w:r>
-    </w:p>
-    <w:p>
-      <w:pPr>
-        <w:spacing w:before="280" w:after="120"/>
-        <w:rPr>
-          <w:sz w:val="28"/>
-          <w:b/>
-        </w:rPr>
-      </w:pPr>
-      <w:r>
-        <w:rPr>
-          <w:sz w:val="28"/>
-          <w:b/>
-        </w:rPr>
-        <w:t xml:space="preserve">Notes for the developer</w:t>
-      </w:r>
-    </w:p>
-    <w:p>
-      <w:pPr>
-        <w:spacing w:before="0" w:after="80"/>
-        <w:ind w:left="360"/>
-        <w:rPr>
-          <w:sz w:val="22"/>
-        </w:rPr>
-      </w:pPr>
-      <w:r>
-        <w:rPr>
-          <w:sz w:val="22"/>
-        </w:rPr>
-        <w:t xml:space="preserve">• Guard the response before reading it. Both TypeErrors come from touching a body that does not exist on a failed request.</w:t>
-      </w:r>
-    </w:p>
-    <w:p>
-      <w:pPr>
-        <w:spacing w:before="0" w:after="80"/>
-        <w:ind w:left="360"/>
-        <w:rPr>
-          <w:sz w:val="22"/>
-        </w:rPr>
-      </w:pPr>
-      <w:r>
-        <w:rPr>
-          <w:sz w:val="22"/>
-        </w:rPr>
-        <w:t xml:space="preserve">• Fix the </w:t>
-      </w:r>
-      <w:r>
-        <w:rPr>
-          <w:sz w:val="22"/>
-          <w:rFonts w:ascii="Consolas" w:hAnsi="Consolas"/>
-          <w:sz w:val="20"/>
-        </w:rPr>
-        <w:t xml:space="preserve">err is not defined</w:t>
-      </w:r>
-      <w:r>
-        <w:rPr>
-          <w:sz w:val="22"/>
-        </w:rPr>
-        <w:t xml:space="preserve"> reference first. Until the handler stops throwing, no message can reach the screen, so the silent-failure symptom cannot be fixed without it.</w:t>
-      </w:r>
-    </w:p>
-    <w:p>
-      <w:pPr>
-        <w:spacing w:before="0" w:after="80"/>
-        <w:ind w:left="360"/>
-        <w:rPr>
-          <w:sz w:val="22"/>
-        </w:rPr>
-      </w:pPr>
-      <w:r>
-        <w:rPr>
-          <w:sz w:val="22"/>
-        </w:rPr>
-        <w:t xml:space="preserve">• Decide what the merchant should see. Clearing the table is honest but abrupt; marking it as stale keeps the context. Either is better than leaving old figures unlabelled.</w:t>
-      </w:r>
-    </w:p>
-    <w:p>
-      <w:pPr>
-        <w:spacing w:before="0" w:after="80"/>
-        <w:ind w:left="360"/>
-        <w:rPr>
-          <w:sz w:val="22"/>
-        </w:rPr>
-      </w:pPr>
-      <w:r>
-        <w:rPr>
-          <w:sz w:val="22"/>
-        </w:rPr>
-        <w:t xml:space="preserve">• Log the two </w:t>
-      </w:r>
-      <w:r>
-        <w:rPr>
-          <w:sz w:val="22"/>
-          <w:rFonts w:ascii="Consolas" w:hAnsi="Consolas"/>
-          <w:sz w:val="20"/>
-        </w:rPr>
-        <w:t xml:space="preserve">err:</w:t>
-      </w:r>
-      <w:r>
-        <w:rPr>
-          <w:sz w:val="22"/>
-        </w:rPr>
-        <w:t xml:space="preserve"> lines at error level if they are kept. Logging a failure at info level hides it from anyone filtering the console normally.</w:t>
+        <w:t xml:space="preserve"> lines are kept, log them at error level. A failure logged at info level is hidden from anyone filtering the console normally.</w:t>
       </w:r>
     </w:p>
     <w:sectPr>

</xml_diff>

<commit_message>
Add PS-GR-06 to the defects document, confirmed by hand over a 90-day range
The graph and the query table disagree about the same payments. Grouping by
Funding Method alone gives ACH 95, DISCOVER 21, MASTERCARD 45, PULSE 2, VISA 49
- 95 ACH against 117 card, a 44.81% ACH share. The graph draws 45.45%, which
works back to 114 card payments, three fewer than the table counts.

The gap is exactly three, and the breakdown holds one AppleSale payment and two
PULSE payments. That is recorded as a lead for the developer to check first, not
as a proven cause.

Also records that the defect does not appear over the default 30-day range,
where the two views agree to the decimal. Without that note anyone reproducing
it would conclude there is nothing wrong.

Screenshots carry the arithmetic: the ACH count, the card counts and the graph
percentages are boxed, and the working is printed beside them.
</commit_message>
<xml_diff>
--- a/PaymentStats_Bugs.docx
+++ b/PaymentStats_Bugs.docx
@@ -753,6 +753,88 @@
                 <w:sz w:val="20"/>
               </w:rPr>
               <w:t xml:space="preserve">all gateways</w:t>
+            </w:r>
+          </w:p>
+        </w:tc>
+      </w:tr>
+      <w:tr>
+        <w:tc>
+          <w:tcPr>
+            <w:tcW w:w="1872" w:type="dxa"/>
+          </w:tcPr>
+          <w:p>
+            <w:pPr>
+              <w:spacing w:before="40" w:after="40"/>
+            </w:pPr>
+            <w:r>
+              <w:rPr>
+                <w:sz w:val="20"/>
+              </w:rPr>
+              <w:t xml:space="preserve">8</w:t>
+            </w:r>
+          </w:p>
+        </w:tc>
+        <w:tc>
+          <w:tcPr>
+            <w:tcW w:w="1872" w:type="dxa"/>
+          </w:tcPr>
+          <w:p>
+            <w:pPr>
+              <w:spacing w:before="40" w:after="40"/>
+            </w:pPr>
+            <w:r>
+              <w:rPr>
+                <w:sz w:val="20"/>
+              </w:rPr>
+              <w:t xml:space="preserve">PS-GR-06</w:t>
+            </w:r>
+          </w:p>
+        </w:tc>
+        <w:tc>
+          <w:tcPr>
+            <w:tcW w:w="1872" w:type="dxa"/>
+          </w:tcPr>
+          <w:p>
+            <w:pPr>
+              <w:spacing w:before="40" w:after="40"/>
+            </w:pPr>
+            <w:r>
+              <w:rPr>
+                <w:sz w:val="20"/>
+              </w:rPr>
+              <w:t xml:space="preserve">The graph counts fewer card payments than the query table</w:t>
+            </w:r>
+          </w:p>
+        </w:tc>
+        <w:tc>
+          <w:tcPr>
+            <w:tcW w:w="1872" w:type="dxa"/>
+          </w:tcPr>
+          <w:p>
+            <w:pPr>
+              <w:spacing w:before="40" w:after="40"/>
+            </w:pPr>
+            <w:r>
+              <w:rPr>
+                <w:sz w:val="20"/>
+              </w:rPr>
+              <w:t xml:space="preserve">High</w:t>
+            </w:r>
+          </w:p>
+        </w:tc>
+        <w:tc>
+          <w:tcPr>
+            <w:tcW w:w="1872" w:type="dxa"/>
+          </w:tcPr>
+          <w:p>
+            <w:pPr>
+              <w:spacing w:before="40" w:after="40"/>
+            </w:pPr>
+            <w:r>
+              <w:rPr>
+                <w:sz w:val="20"/>
+              </w:rPr>
+              <w:t xml:space="preserve">BillPay</w:t>
             </w:r>
           </w:p>
         </w:tc>
@@ -7237,6 +7319,1429 @@
         <w:t xml:space="preserve"> lines are kept, log them at error level. A failure logged at info level is hidden from anyone filtering the console normally.</w:t>
       </w:r>
     </w:p>
+    <w:p>
+      <w:pPr>
+        <w:spacing w:before="0" w:after="200"/>
+        <w:rPr>
+          <w:sz w:val="36"/>
+          <w:b/>
+        </w:rPr>
+      </w:pPr>
+      <w:r>
+        <w:rPr>
+          <w:sz w:val="36"/>
+          <w:b/>
+        </w:rPr>
+        <w:t xml:space="preserve">8. PS-GR-06 — the graph counts fewer card payments than the query table</w:t>
+      </w:r>
+    </w:p>
+    <w:p>
+      <w:pPr>
+        <w:spacing w:before="0" w:after="120"/>
+        <w:rPr>
+          <w:sz w:val="22"/>
+        </w:rPr>
+      </w:pPr>
+      <w:r>
+        <w:rPr>
+          <w:sz w:val="22"/>
+          <w:b/>
+        </w:rPr>
+        <w:t xml:space="preserve">Test case:</w:t>
+      </w:r>
+      <w:r>
+        <w:rPr>
+          <w:sz w:val="22"/>
+        </w:rPr>
+        <w:t xml:space="preserve"> PS-GR-06 </w:t>
+      </w:r>
+      <w:r>
+        <w:rPr>
+          <w:sz w:val="22"/>
+          <w:b/>
+        </w:rPr>
+        <w:t xml:space="preserve">Priority:</w:t>
+      </w:r>
+      <w:r>
+        <w:rPr>
+          <w:sz w:val="22"/>
+        </w:rPr>
+        <w:t xml:space="preserve"> High </w:t>
+      </w:r>
+      <w:r>
+        <w:rPr>
+          <w:sz w:val="22"/>
+          <w:b/>
+        </w:rPr>
+        <w:t xml:space="preserve">Gateways:</w:t>
+      </w:r>
+      <w:r>
+        <w:rPr>
+          <w:sz w:val="22"/>
+        </w:rPr>
+        <w:t xml:space="preserve"> BillPay (the only gateway that can run this check) </w:t>
+      </w:r>
+      <w:r>
+        <w:rPr>
+          <w:sz w:val="22"/>
+          <w:b/>
+        </w:rPr>
+        <w:t xml:space="preserve">Date observed:</w:t>
+      </w:r>
+      <w:r>
+        <w:rPr>
+          <w:sz w:val="22"/>
+        </w:rPr>
+        <w:t xml:space="preserve"> 21 September 2026, re-confirmed by hand 24 September 2026</w:t>
+      </w:r>
+    </w:p>
+    <w:p>
+      <w:pPr>
+        <w:spacing w:before="280" w:after="120"/>
+        <w:rPr>
+          <w:sz w:val="28"/>
+          <w:b/>
+        </w:rPr>
+      </w:pPr>
+      <w:r>
+        <w:rPr>
+          <w:sz w:val="28"/>
+          <w:b/>
+        </w:rPr>
+        <w:t xml:space="preserve">Summary</w:t>
+      </w:r>
+    </w:p>
+    <w:p>
+      <w:pPr>
+        <w:spacing w:before="0" w:after="120"/>
+        <w:rPr>
+          <w:sz w:val="22"/>
+        </w:rPr>
+      </w:pPr>
+      <w:r>
+        <w:rPr>
+          <w:sz w:val="22"/>
+        </w:rPr>
+        <w:t xml:space="preserve">The Payment Statistics graph and the query table describe the same payments over the same dates. They give different numbers.</w:t>
+      </w:r>
+    </w:p>
+    <w:p>
+      <w:pPr>
+        <w:spacing w:before="0" w:after="120"/>
+        <w:rPr>
+          <w:sz w:val="22"/>
+        </w:rPr>
+      </w:pPr>
+      <w:r>
+        <w:rPr>
+          <w:sz w:val="22"/>
+        </w:rPr>
+        <w:t xml:space="preserve">The ACH figure agrees. The card figure does not. The graph draws fewer card payments than the table counts.</w:t>
+      </w:r>
+    </w:p>
+    <w:p>
+      <w:pPr>
+        <w:spacing w:before="0" w:after="120"/>
+        <w:rPr>
+          <w:sz w:val="22"/>
+        </w:rPr>
+      </w:pPr>
+      <w:r>
+        <w:rPr>
+          <w:sz w:val="22"/>
+        </w:rPr>
+        <w:t xml:space="preserve">On the run below the table counts 117 card payments. The graph is drawing 114. Three payments are missing from the graph.</w:t>
+      </w:r>
+    </w:p>
+    <w:p>
+      <w:pPr>
+        <w:spacing w:before="280" w:after="120"/>
+        <w:rPr>
+          <w:sz w:val="28"/>
+          <w:b/>
+        </w:rPr>
+      </w:pPr>
+      <w:r>
+        <w:rPr>
+          <w:sz w:val="28"/>
+          <w:b/>
+        </w:rPr>
+        <w:t xml:space="preserve">Steps to reproduce</w:t>
+      </w:r>
+    </w:p>
+    <w:p>
+      <w:pPr>
+        <w:spacing w:before="0" w:after="120"/>
+        <w:rPr>
+          <w:sz w:val="22"/>
+        </w:rPr>
+      </w:pPr>
+      <w:r>
+        <w:rPr>
+          <w:sz w:val="22"/>
+        </w:rPr>
+        <w:t xml:space="preserve">1. Sign in as the </w:t>
+      </w:r>
+      <w:r>
+        <w:rPr>
+          <w:sz w:val="22"/>
+          <w:b/>
+        </w:rPr>
+        <w:t xml:space="preserve">BillPay</w:t>
+      </w:r>
+      <w:r>
+        <w:rPr>
+          <w:sz w:val="22"/>
+        </w:rPr>
+        <w:t xml:space="preserve"> merchant. Open </w:t>
+      </w:r>
+      <w:r>
+        <w:rPr>
+          <w:sz w:val="22"/>
+          <w:b/>
+        </w:rPr>
+        <w:t xml:space="preserve">Payment Analytics → Payment Stats</w:t>
+      </w:r>
+      <w:r>
+        <w:rPr>
+          <w:sz w:val="22"/>
+        </w:rPr>
+        <w:t xml:space="preserve">. 2. Set </w:t>
+      </w:r>
+      <w:r>
+        <w:rPr>
+          <w:sz w:val="22"/>
+          <w:b/>
+        </w:rPr>
+        <w:t xml:space="preserve">From Date</w:t>
+      </w:r>
+      <w:r>
+        <w:rPr>
+          <w:sz w:val="22"/>
+        </w:rPr>
+        <w:t xml:space="preserve"> to </w:t>
+      </w:r>
+      <w:r>
+        <w:rPr>
+          <w:sz w:val="22"/>
+          <w:rFonts w:ascii="Consolas" w:hAnsi="Consolas"/>
+          <w:sz w:val="20"/>
+        </w:rPr>
+        <w:t xml:space="preserve">06/26/2026 12:00 AM</w:t>
+      </w:r>
+      <w:r>
+        <w:rPr>
+          <w:sz w:val="22"/>
+        </w:rPr>
+        <w:t xml:space="preserve"> and </w:t>
+      </w:r>
+      <w:r>
+        <w:rPr>
+          <w:sz w:val="22"/>
+          <w:b/>
+        </w:rPr>
+        <w:t xml:space="preserve">To Date</w:t>
+      </w:r>
+      <w:r>
+        <w:rPr>
+          <w:sz w:val="22"/>
+        </w:rPr>
+        <w:t xml:space="preserve"> to today at </w:t>
+      </w:r>
+      <w:r>
+        <w:rPr>
+          <w:sz w:val="22"/>
+          <w:rFonts w:ascii="Consolas" w:hAnsi="Consolas"/>
+          <w:sz w:val="20"/>
+        </w:rPr>
+        <w:t xml:space="preserve">11:59 PM</w:t>
+      </w:r>
+      <w:r>
+        <w:rPr>
+          <w:sz w:val="22"/>
+        </w:rPr>
+        <w:t xml:space="preserve">. A 90-day range is needed. See the note below about shorter ranges. 3. Press </w:t>
+      </w:r>
+      <w:r>
+        <w:rPr>
+          <w:sz w:val="22"/>
+          <w:b/>
+        </w:rPr>
+        <w:t xml:space="preserve">Submit</w:t>
+      </w:r>
+      <w:r>
+        <w:rPr>
+          <w:sz w:val="22"/>
+        </w:rPr>
+        <w:t xml:space="preserve"> and wait for the table. 4. Expand </w:t>
+      </w:r>
+      <w:r>
+        <w:rPr>
+          <w:sz w:val="22"/>
+          <w:b/>
+        </w:rPr>
+        <w:t xml:space="preserve">Prepare Query</w:t>
+      </w:r>
+      <w:r>
+        <w:rPr>
+          <w:sz w:val="22"/>
+        </w:rPr>
+        <w:t xml:space="preserve">. 5. In </w:t>
+      </w:r>
+      <w:r>
+        <w:rPr>
+          <w:sz w:val="22"/>
+          <w:b/>
+        </w:rPr>
+        <w:t xml:space="preserve">Select</w:t>
+      </w:r>
+      <w:r>
+        <w:rPr>
+          <w:sz w:val="22"/>
+        </w:rPr>
+        <w:t xml:space="preserve">, remove every chip except </w:t>
+      </w:r>
+      <w:r>
+        <w:rPr>
+          <w:sz w:val="22"/>
+          <w:b/>
+        </w:rPr>
+        <w:t xml:space="preserve">Funding Method</w:t>
+      </w:r>
+      <w:r>
+        <w:rPr>
+          <w:sz w:val="22"/>
+        </w:rPr>
+        <w:t xml:space="preserve">. Do the same in </w:t>
+      </w:r>
+      <w:r>
+        <w:rPr>
+          <w:sz w:val="22"/>
+          <w:b/>
+        </w:rPr>
+        <w:t xml:space="preserve">Group</w:t>
+      </w:r>
+      <w:r>
+        <w:rPr>
+          <w:sz w:val="22"/>
+        </w:rPr>
+        <w:t xml:space="preserve">. This collapses the breakdown into one row per funding method, so the counts can be read directly instead of being added up across dozens of rows. 6. Press </w:t>
+      </w:r>
+      <w:r>
+        <w:rPr>
+          <w:sz w:val="22"/>
+          <w:b/>
+        </w:rPr>
+        <w:t xml:space="preserve">Execute</w:t>
+      </w:r>
+      <w:r>
+        <w:rPr>
+          <w:sz w:val="22"/>
+        </w:rPr>
+        <w:t xml:space="preserve">. 7. Add the Count column: the ACH row on its own, and every other row together. 8. Scroll down to </w:t>
+      </w:r>
+      <w:r>
+        <w:rPr>
+          <w:sz w:val="22"/>
+          <w:b/>
+        </w:rPr>
+        <w:t xml:space="preserve">Payment Statistics</w:t>
+      </w:r>
+      <w:r>
+        <w:rPr>
+          <w:sz w:val="22"/>
+        </w:rPr>
+        <w:t xml:space="preserve"> and read the two percentages. 9. Work out the table's own ACH share and compare it with the graph's.</w:t>
+      </w:r>
+    </w:p>
+    <w:p>
+      <w:pPr>
+        <w:spacing w:before="280" w:after="120"/>
+        <w:rPr>
+          <w:sz w:val="28"/>
+          <w:b/>
+        </w:rPr>
+      </w:pPr>
+      <w:r>
+        <w:rPr>
+          <w:sz w:val="28"/>
+          <w:b/>
+        </w:rPr>
+        <w:t xml:space="preserve">Expected result</w:t>
+      </w:r>
+    </w:p>
+    <w:p>
+      <w:pPr>
+        <w:spacing w:before="0" w:after="120"/>
+        <w:rPr>
+          <w:sz w:val="22"/>
+        </w:rPr>
+      </w:pPr>
+      <w:r>
+        <w:rPr>
+          <w:sz w:val="22"/>
+        </w:rPr>
+        <w:t xml:space="preserve">Both views describe the same payments over the same range, so they must agree. The share the table works out to is the share the graph draws.</w:t>
+      </w:r>
+    </w:p>
+    <w:p>
+      <w:pPr>
+        <w:spacing w:before="280" w:after="120"/>
+        <w:rPr>
+          <w:sz w:val="28"/>
+          <w:b/>
+        </w:rPr>
+      </w:pPr>
+      <w:r>
+        <w:rPr>
+          <w:sz w:val="28"/>
+          <w:b/>
+        </w:rPr>
+        <w:t xml:space="preserve">Actual result</w:t>
+      </w:r>
+    </w:p>
+    <w:p>
+      <w:pPr>
+        <w:spacing w:before="0" w:after="120"/>
+        <w:rPr>
+          <w:sz w:val="22"/>
+        </w:rPr>
+      </w:pPr>
+      <w:r>
+        <w:rPr>
+          <w:sz w:val="22"/>
+        </w:rPr>
+        <w:t xml:space="preserve">They disagree.</w:t>
+      </w:r>
+    </w:p>
+    <w:tbl>
+      <w:tblPr>
+        <w:tblW w:w="9360" w:type="dxa"/>
+        <w:tblBorders>
+          <w:top w:val="single" w:sz="4" w:space="0" w:color="BFBFBF"/>
+          <w:left w:val="single" w:sz="4" w:space="0" w:color="BFBFBF"/>
+          <w:bottom w:val="single" w:sz="4" w:space="0" w:color="BFBFBF"/>
+          <w:right w:val="single" w:sz="4" w:space="0" w:color="BFBFBF"/>
+          <w:insideH w:val="single" w:sz="4" w:space="0" w:color="BFBFBF"/>
+          <w:insideV w:val="single" w:sz="4" w:space="0" w:color="BFBFBF"/>
+        </w:tblBorders>
+      </w:tblPr>
+      <w:tr>
+        <w:tc>
+          <w:tcPr>
+            <w:tcW w:w="1872" w:type="dxa"/>
+            <w:shd w:val="clear" w:fill="F2F2F2"/>
+          </w:tcPr>
+          <w:p>
+            <w:pPr>
+              <w:spacing w:before="40" w:after="40"/>
+            </w:pPr>
+            <w:r>
+              <w:rPr>
+                <w:sz w:val="20"/>
+                <w:b/>
+              </w:rPr>
+              <w:t xml:space="preserve"/>
+            </w:r>
+          </w:p>
+        </w:tc>
+        <w:tc>
+          <w:tcPr>
+            <w:tcW w:w="1872" w:type="dxa"/>
+            <w:shd w:val="clear" w:fill="F2F2F2"/>
+          </w:tcPr>
+          <w:p>
+            <w:pPr>
+              <w:spacing w:before="40" w:after="40"/>
+            </w:pPr>
+            <w:r>
+              <w:rPr>
+                <w:sz w:val="20"/>
+                <w:b/>
+              </w:rPr>
+              <w:t xml:space="preserve">ACH</w:t>
+            </w:r>
+          </w:p>
+        </w:tc>
+        <w:tc>
+          <w:tcPr>
+            <w:tcW w:w="1872" w:type="dxa"/>
+            <w:shd w:val="clear" w:fill="F2F2F2"/>
+          </w:tcPr>
+          <w:p>
+            <w:pPr>
+              <w:spacing w:before="40" w:after="40"/>
+            </w:pPr>
+            <w:r>
+              <w:rPr>
+                <w:sz w:val="20"/>
+                <w:b/>
+              </w:rPr>
+              <w:t xml:space="preserve">Card</w:t>
+            </w:r>
+          </w:p>
+        </w:tc>
+        <w:tc>
+          <w:tcPr>
+            <w:tcW w:w="1872" w:type="dxa"/>
+            <w:shd w:val="clear" w:fill="F2F2F2"/>
+          </w:tcPr>
+          <w:p>
+            <w:pPr>
+              <w:spacing w:before="40" w:after="40"/>
+            </w:pPr>
+            <w:r>
+              <w:rPr>
+                <w:sz w:val="20"/>
+                <w:b/>
+              </w:rPr>
+              <w:t xml:space="preserve">Total</w:t>
+            </w:r>
+          </w:p>
+        </w:tc>
+        <w:tc>
+          <w:tcPr>
+            <w:tcW w:w="1872" w:type="dxa"/>
+            <w:shd w:val="clear" w:fill="F2F2F2"/>
+          </w:tcPr>
+          <w:p>
+            <w:pPr>
+              <w:spacing w:before="40" w:after="40"/>
+            </w:pPr>
+            <w:r>
+              <w:rPr>
+                <w:sz w:val="20"/>
+                <w:b/>
+              </w:rPr>
+              <w:t xml:space="preserve">ACH share</w:t>
+            </w:r>
+          </w:p>
+        </w:tc>
+      </w:tr>
+      <w:tr>
+        <w:tc>
+          <w:tcPr>
+            <w:tcW w:w="1872" w:type="dxa"/>
+          </w:tcPr>
+          <w:p>
+            <w:pPr>
+              <w:spacing w:before="40" w:after="40"/>
+            </w:pPr>
+            <w:r>
+              <w:rPr>
+                <w:sz w:val="20"/>
+              </w:rPr>
+              <w:t xml:space="preserve">Query table counts</w:t>
+            </w:r>
+          </w:p>
+        </w:tc>
+        <w:tc>
+          <w:tcPr>
+            <w:tcW w:w="1872" w:type="dxa"/>
+          </w:tcPr>
+          <w:p>
+            <w:pPr>
+              <w:spacing w:before="40" w:after="40"/>
+            </w:pPr>
+            <w:r>
+              <w:rPr>
+                <w:sz w:val="20"/>
+              </w:rPr>
+              <w:t xml:space="preserve">95</w:t>
+            </w:r>
+          </w:p>
+        </w:tc>
+        <w:tc>
+          <w:tcPr>
+            <w:tcW w:w="1872" w:type="dxa"/>
+          </w:tcPr>
+          <w:p>
+            <w:pPr>
+              <w:spacing w:before="40" w:after="40"/>
+            </w:pPr>
+            <w:r>
+              <w:rPr>
+                <w:sz w:val="20"/>
+              </w:rPr>
+              <w:t xml:space="preserve">117</w:t>
+            </w:r>
+          </w:p>
+        </w:tc>
+        <w:tc>
+          <w:tcPr>
+            <w:tcW w:w="1872" w:type="dxa"/>
+          </w:tcPr>
+          <w:p>
+            <w:pPr>
+              <w:spacing w:before="40" w:after="40"/>
+            </w:pPr>
+            <w:r>
+              <w:rPr>
+                <w:sz w:val="20"/>
+              </w:rPr>
+              <w:t xml:space="preserve">212</w:t>
+            </w:r>
+          </w:p>
+        </w:tc>
+        <w:tc>
+          <w:tcPr>
+            <w:tcW w:w="1872" w:type="dxa"/>
+          </w:tcPr>
+          <w:p>
+            <w:pPr>
+              <w:spacing w:before="40" w:after="40"/>
+            </w:pPr>
+            <w:r>
+              <w:rPr>
+                <w:sz w:val="20"/>
+              </w:rPr>
+              <w:t xml:space="preserve">44.81 %</w:t>
+            </w:r>
+          </w:p>
+        </w:tc>
+      </w:tr>
+      <w:tr>
+        <w:tc>
+          <w:tcPr>
+            <w:tcW w:w="1872" w:type="dxa"/>
+          </w:tcPr>
+          <w:p>
+            <w:pPr>
+              <w:spacing w:before="40" w:after="40"/>
+            </w:pPr>
+            <w:r>
+              <w:rPr>
+                <w:sz w:val="20"/>
+              </w:rPr>
+              <w:t xml:space="preserve">Graph is drawing</w:t>
+            </w:r>
+          </w:p>
+        </w:tc>
+        <w:tc>
+          <w:tcPr>
+            <w:tcW w:w="1872" w:type="dxa"/>
+          </w:tcPr>
+          <w:p>
+            <w:pPr>
+              <w:spacing w:before="40" w:after="40"/>
+            </w:pPr>
+            <w:r>
+              <w:rPr>
+                <w:sz w:val="20"/>
+              </w:rPr>
+              <w:t xml:space="preserve">95</w:t>
+            </w:r>
+          </w:p>
+        </w:tc>
+        <w:tc>
+          <w:tcPr>
+            <w:tcW w:w="1872" w:type="dxa"/>
+          </w:tcPr>
+          <w:p>
+            <w:pPr>
+              <w:spacing w:before="40" w:after="40"/>
+            </w:pPr>
+            <w:r>
+              <w:rPr>
+                <w:sz w:val="20"/>
+              </w:rPr>
+              <w:t xml:space="preserve">114</w:t>
+            </w:r>
+          </w:p>
+        </w:tc>
+        <w:tc>
+          <w:tcPr>
+            <w:tcW w:w="1872" w:type="dxa"/>
+          </w:tcPr>
+          <w:p>
+            <w:pPr>
+              <w:spacing w:before="40" w:after="40"/>
+            </w:pPr>
+            <w:r>
+              <w:rPr>
+                <w:sz w:val="20"/>
+              </w:rPr>
+              <w:t xml:space="preserve">209</w:t>
+            </w:r>
+          </w:p>
+        </w:tc>
+        <w:tc>
+          <w:tcPr>
+            <w:tcW w:w="1872" w:type="dxa"/>
+          </w:tcPr>
+          <w:p>
+            <w:pPr>
+              <w:spacing w:before="40" w:after="40"/>
+            </w:pPr>
+            <w:r>
+              <w:rPr>
+                <w:sz w:val="20"/>
+              </w:rPr>
+              <w:t xml:space="preserve">45.45 %</w:t>
+            </w:r>
+          </w:p>
+        </w:tc>
+      </w:tr>
+    </w:tbl>
+    <w:p>
+      <w:pPr>
+        <w:spacing w:after="120"/>
+      </w:pPr>
+    </w:p>
+    <w:p>
+      <w:pPr>
+        <w:spacing w:before="0" w:after="120"/>
+        <w:rPr>
+          <w:sz w:val="22"/>
+        </w:rPr>
+      </w:pPr>
+      <w:r>
+        <w:rPr>
+          <w:sz w:val="22"/>
+        </w:rPr>
+        <w:t xml:space="preserve">The ACH count is the same in both. The card count is three lower on the graph.</w:t>
+      </w:r>
+    </w:p>
+    <w:p>
+      <w:pPr>
+        <w:spacing w:before="0" w:after="120"/>
+        <w:rPr>
+          <w:sz w:val="22"/>
+        </w:rPr>
+      </w:pPr>
+      <w:r>
+        <w:rPr>
+          <w:sz w:val="22"/>
+        </w:rPr>
+        <w:t xml:space="preserve">Working back from the graph: it shows ACH at 45.45 %, and 95 ÷ 0.4545 gives 209 payments in total, which leaves 114 card. The table counts 117.</w:t>
+      </w:r>
+    </w:p>
+    <w:p>
+      <w:pPr>
+        <w:spacing w:before="280" w:after="120"/>
+        <w:rPr>
+          <w:sz w:val="28"/>
+          <w:b/>
+        </w:rPr>
+      </w:pPr>
+      <w:r>
+        <w:rPr>
+          <w:sz w:val="28"/>
+          <w:b/>
+        </w:rPr>
+        <w:t xml:space="preserve">Evidence</w:t>
+      </w:r>
+    </w:p>
+    <w:p>
+      <w:pPr>
+        <w:spacing w:before="240" w:after="100"/>
+        <w:rPr>
+          <w:sz w:val="24"/>
+          <w:b/>
+        </w:rPr>
+      </w:pPr>
+      <w:r>
+        <w:rPr>
+          <w:sz w:val="24"/>
+          <w:b/>
+        </w:rPr>
+        <w:t xml:space="preserve">What was run</w:t>
+      </w:r>
+    </w:p>
+    <w:p>
+      <w:pPr>
+        <w:spacing w:before="80" w:after="200"/>
+      </w:pPr>
+      <w:r>
+        <w:drawing>
+          <wp:inline distT="0" distB="0" distL="0" distR="0">
+            <wp:extent cx="5943600" cy="3343275"/>
+            <wp:docPr id="114" name="Picture 114"/>
+            <a:graphic xmlns:a="http://schemas.openxmlformats.org/drawingml/2006/main">
+              <a:graphicData uri="http://schemas.openxmlformats.org/drawingml/2006/picture">
+                <pic:pic xmlns:pic="http://schemas.openxmlformats.org/drawingml/2006/picture">
+                  <pic:nvPicPr>
+                    <pic:cNvPr id="114" name="Picture"/>
+                    <pic:cNvPicPr/>
+                  </pic:nvPicPr>
+                  <pic:blipFill>
+                    <a:blip r:embed="rId114"/>
+                    <a:stretch>
+                      <a:fillRect/>
+                    </a:stretch>
+                  </pic:blipFill>
+                  <pic:spPr>
+                    <a:xfrm>
+                      <a:off x="0" y="0"/>
+                      <a:ext cx="5943600" cy="3343275"/>
+                    </a:xfrm>
+                    <a:prstGeom prst="rect">
+                      <a:avLst/>
+                    </a:prstGeom>
+                  </pic:spPr>
+                </pic:pic>
+              </a:graphicData>
+            </a:graphic>
+          </wp:inline>
+        </w:drawing>
+      </w:r>
+    </w:p>
+    <w:p>
+      <w:pPr>
+        <w:spacing w:before="0" w:after="120"/>
+        <w:rPr>
+          <w:sz w:val="22"/>
+        </w:rPr>
+      </w:pPr>
+      <w:r>
+        <w:rPr>
+          <w:sz w:val="22"/>
+        </w:rPr>
+        <w:t xml:space="preserve">The 90-day range is boxed in orange. Select and Group hold only </w:t>
+      </w:r>
+      <w:r>
+        <w:rPr>
+          <w:sz w:val="22"/>
+          <w:b/>
+        </w:rPr>
+        <w:t xml:space="preserve">Funding Method</w:t>
+      </w:r>
+      <w:r>
+        <w:rPr>
+          <w:sz w:val="22"/>
+        </w:rPr>
+        <w:t xml:space="preserve">, boxed in blue. Having is empty. Nothing is filtered — this is the whole range, grouped one way.</w:t>
+      </w:r>
+    </w:p>
+    <w:p>
+      <w:pPr>
+        <w:spacing w:before="240" w:after="100"/>
+        <w:rPr>
+          <w:sz w:val="24"/>
+          <w:b/>
+        </w:rPr>
+      </w:pPr>
+      <w:r>
+        <w:rPr>
+          <w:sz w:val="24"/>
+          <w:b/>
+        </w:rPr>
+        <w:t xml:space="preserve">The table and the graph, in one picture</w:t>
+      </w:r>
+    </w:p>
+    <w:p>
+      <w:pPr>
+        <w:spacing w:before="80" w:after="200"/>
+      </w:pPr>
+      <w:r>
+        <w:drawing>
+          <wp:inline distT="0" distB="0" distL="0" distR="0">
+            <wp:extent cx="5943600" cy="3343275"/>
+            <wp:docPr id="115" name="Picture 115"/>
+            <a:graphic xmlns:a="http://schemas.openxmlformats.org/drawingml/2006/main">
+              <a:graphicData uri="http://schemas.openxmlformats.org/drawingml/2006/picture">
+                <pic:pic xmlns:pic="http://schemas.openxmlformats.org/drawingml/2006/picture">
+                  <pic:nvPicPr>
+                    <pic:cNvPr id="115" name="Picture"/>
+                    <pic:cNvPicPr/>
+                  </pic:nvPicPr>
+                  <pic:blipFill>
+                    <a:blip r:embed="rId115"/>
+                    <a:stretch>
+                      <a:fillRect/>
+                    </a:stretch>
+                  </pic:blipFill>
+                  <pic:spPr>
+                    <a:xfrm>
+                      <a:off x="0" y="0"/>
+                      <a:ext cx="5943600" cy="3343275"/>
+                    </a:xfrm>
+                    <a:prstGeom prst="rect">
+                      <a:avLst/>
+                    </a:prstGeom>
+                  </pic:spPr>
+                </pic:pic>
+              </a:graphicData>
+            </a:graphic>
+          </wp:inline>
+        </w:drawing>
+      </w:r>
+    </w:p>
+    <w:p>
+      <w:pPr>
+        <w:spacing w:before="0" w:after="120"/>
+        <w:rPr>
+          <w:sz w:val="22"/>
+        </w:rPr>
+      </w:pPr>
+      <w:r>
+        <w:rPr>
+          <w:sz w:val="22"/>
+        </w:rPr>
+        <w:t xml:space="preserve">The green box is the ACH count: </w:t>
+      </w:r>
+      <w:r>
+        <w:rPr>
+          <w:sz w:val="22"/>
+          <w:b/>
+        </w:rPr>
+        <w:t xml:space="preserve">95</w:t>
+      </w:r>
+      <w:r>
+        <w:rPr>
+          <w:sz w:val="22"/>
+        </w:rPr>
+        <w:t xml:space="preserve">.</w:t>
+      </w:r>
+    </w:p>
+    <w:p>
+      <w:pPr>
+        <w:spacing w:before="0" w:after="120"/>
+        <w:rPr>
+          <w:sz w:val="22"/>
+        </w:rPr>
+      </w:pPr>
+      <w:r>
+        <w:rPr>
+          <w:sz w:val="22"/>
+        </w:rPr>
+        <w:t xml:space="preserve">The orange box is every card row: DISCOVER 21, MASTERCARD 45, PULSE 2, VISA 49. That is </w:t>
+      </w:r>
+      <w:r>
+        <w:rPr>
+          <w:sz w:val="22"/>
+          <w:b/>
+        </w:rPr>
+        <w:t xml:space="preserve">117</w:t>
+      </w:r>
+      <w:r>
+        <w:rPr>
+          <w:sz w:val="22"/>
+        </w:rPr>
+        <w:t xml:space="preserve">.</w:t>
+      </w:r>
+    </w:p>
+    <w:p>
+      <w:pPr>
+        <w:spacing w:before="0" w:after="120"/>
+        <w:rPr>
+          <w:sz w:val="22"/>
+        </w:rPr>
+      </w:pPr>
+      <w:r>
+        <w:rPr>
+          <w:sz w:val="22"/>
+        </w:rPr>
+        <w:t xml:space="preserve">So the table holds 212 payments and ACH is 44.81 % of them.</w:t>
+      </w:r>
+    </w:p>
+    <w:p>
+      <w:pPr>
+        <w:spacing w:before="0" w:after="120"/>
+        <w:rPr>
+          <w:sz w:val="22"/>
+        </w:rPr>
+      </w:pPr>
+      <w:r>
+        <w:rPr>
+          <w:sz w:val="22"/>
+        </w:rPr>
+        <w:t xml:space="preserve">The red box at the bottom is the graph. It says ACH is </w:t>
+      </w:r>
+      <w:r>
+        <w:rPr>
+          <w:sz w:val="22"/>
+          <w:b/>
+        </w:rPr>
+        <w:t xml:space="preserve">45.45 %</w:t>
+      </w:r>
+      <w:r>
+        <w:rPr>
+          <w:sz w:val="22"/>
+        </w:rPr>
+        <w:t xml:space="preserve">. For that to be true with 95 ACH payments there would have to be 209 payments in total — which means the graph is only counting 114 card payments, not 117.</w:t>
+      </w:r>
+    </w:p>
+    <w:p>
+      <w:pPr>
+        <w:spacing w:before="0" w:after="120"/>
+        <w:rPr>
+          <w:sz w:val="22"/>
+        </w:rPr>
+      </w:pPr>
+      <w:r>
+        <w:rPr>
+          <w:sz w:val="22"/>
+        </w:rPr>
+        <w:t xml:space="preserve">Both numbers are in the same picture, so there is nothing to line up between screenshots.</w:t>
+      </w:r>
+    </w:p>
+    <w:p>
+      <w:pPr>
+        <w:spacing w:before="280" w:after="120"/>
+        <w:rPr>
+          <w:sz w:val="28"/>
+          <w:b/>
+        </w:rPr>
+      </w:pPr>
+      <w:r>
+        <w:rPr>
+          <w:sz w:val="28"/>
+          <w:b/>
+        </w:rPr>
+        <w:t xml:space="preserve">What pins the cause</w:t>
+      </w:r>
+    </w:p>
+    <w:p>
+      <w:pPr>
+        <w:spacing w:before="0" w:after="120"/>
+        <w:rPr>
+          <w:sz w:val="22"/>
+        </w:rPr>
+      </w:pPr>
+      <w:r>
+        <w:rPr>
+          <w:sz w:val="22"/>
+        </w:rPr>
+        <w:t xml:space="preserve">The gap is exactly </w:t>
+      </w:r>
+      <w:r>
+        <w:rPr>
+          <w:sz w:val="22"/>
+          <w:b/>
+        </w:rPr>
+        <w:t xml:space="preserve">three</w:t>
+      </w:r>
+      <w:r>
+        <w:rPr>
+          <w:sz w:val="22"/>
+        </w:rPr>
+        <w:t xml:space="preserve"> payments. Two rows in the detailed breakdown account for exactly three:</w:t>
+      </w:r>
+    </w:p>
+    <w:p>
+      <w:pPr>
+        <w:spacing w:before="240" w:after="100"/>
+        <w:rPr>
+          <w:sz w:val="24"/>
+          <w:b/>
+        </w:rPr>
+      </w:pPr>
+      <w:r>
+        <w:rPr>
+          <w:sz w:val="24"/>
+          <w:b/>
+        </w:rPr>
+        <w:t xml:space="preserve">A payment recorded as AppleSale</w:t>
+      </w:r>
+    </w:p>
+    <w:p>
+      <w:pPr>
+        <w:spacing w:before="80" w:after="200"/>
+      </w:pPr>
+      <w:r>
+        <w:drawing>
+          <wp:inline distT="0" distB="0" distL="0" distR="0">
+            <wp:extent cx="5943600" cy="3343275"/>
+            <wp:docPr id="116" name="Picture 116"/>
+            <a:graphic xmlns:a="http://schemas.openxmlformats.org/drawingml/2006/main">
+              <a:graphicData uri="http://schemas.openxmlformats.org/drawingml/2006/picture">
+                <pic:pic xmlns:pic="http://schemas.openxmlformats.org/drawingml/2006/picture">
+                  <pic:nvPicPr>
+                    <pic:cNvPr id="116" name="Picture"/>
+                    <pic:cNvPicPr/>
+                  </pic:nvPicPr>
+                  <pic:blipFill>
+                    <a:blip r:embed="rId116"/>
+                    <a:stretch>
+                      <a:fillRect/>
+                    </a:stretch>
+                  </pic:blipFill>
+                  <pic:spPr>
+                    <a:xfrm>
+                      <a:off x="0" y="0"/>
+                      <a:ext cx="5943600" cy="3343275"/>
+                    </a:xfrm>
+                    <a:prstGeom prst="rect">
+                      <a:avLst/>
+                    </a:prstGeom>
+                  </pic:spPr>
+                </pic:pic>
+              </a:graphicData>
+            </a:graphic>
+          </wp:inline>
+        </w:drawing>
+      </w:r>
+    </w:p>
+    <w:p>
+      <w:pPr>
+        <w:spacing w:before="0" w:after="120"/>
+        <w:rPr>
+          <w:sz w:val="22"/>
+        </w:rPr>
+      </w:pPr>
+      <w:r>
+        <w:rPr>
+          <w:sz w:val="22"/>
+        </w:rPr>
+        <w:t xml:space="preserve">One MASTERCARD payment with the category </w:t>
+      </w:r>
+      <w:r>
+        <w:rPr>
+          <w:sz w:val="22"/>
+          <w:b/>
+        </w:rPr>
+        <w:t xml:space="preserve">AppleSale</w:t>
+      </w:r>
+      <w:r>
+        <w:rPr>
+          <w:sz w:val="22"/>
+        </w:rPr>
+        <w:t xml:space="preserve"> rather than CreditSale or DebitSale.</w:t>
+      </w:r>
+    </w:p>
+    <w:p>
+      <w:pPr>
+        <w:spacing w:before="240" w:after="100"/>
+        <w:rPr>
+          <w:sz w:val="24"/>
+          <w:b/>
+        </w:rPr>
+      </w:pPr>
+      <w:r>
+        <w:rPr>
+          <w:sz w:val="24"/>
+          <w:b/>
+        </w:rPr>
+        <w:t xml:space="preserve">Two payments on the PULSE network</w:t>
+      </w:r>
+    </w:p>
+    <w:p>
+      <w:pPr>
+        <w:spacing w:before="80" w:after="200"/>
+      </w:pPr>
+      <w:r>
+        <w:drawing>
+          <wp:inline distT="0" distB="0" distL="0" distR="0">
+            <wp:extent cx="5943600" cy="3343275"/>
+            <wp:docPr id="117" name="Picture 117"/>
+            <a:graphic xmlns:a="http://schemas.openxmlformats.org/drawingml/2006/main">
+              <a:graphicData uri="http://schemas.openxmlformats.org/drawingml/2006/picture">
+                <pic:pic xmlns:pic="http://schemas.openxmlformats.org/drawingml/2006/picture">
+                  <pic:nvPicPr>
+                    <pic:cNvPr id="117" name="Picture"/>
+                    <pic:cNvPicPr/>
+                  </pic:nvPicPr>
+                  <pic:blipFill>
+                    <a:blip r:embed="rId117"/>
+                    <a:stretch>
+                      <a:fillRect/>
+                    </a:stretch>
+                  </pic:blipFill>
+                  <pic:spPr>
+                    <a:xfrm>
+                      <a:off x="0" y="0"/>
+                      <a:ext cx="5943600" cy="3343275"/>
+                    </a:xfrm>
+                    <a:prstGeom prst="rect">
+                      <a:avLst/>
+                    </a:prstGeom>
+                  </pic:spPr>
+                </pic:pic>
+              </a:graphicData>
+            </a:graphic>
+          </wp:inline>
+        </w:drawing>
+      </w:r>
+    </w:p>
+    <w:p>
+      <w:pPr>
+        <w:spacing w:before="0" w:after="120"/>
+        <w:rPr>
+          <w:sz w:val="22"/>
+        </w:rPr>
+      </w:pPr>
+      <w:r>
+        <w:rPr>
+          <w:sz w:val="22"/>
+        </w:rPr>
+        <w:t xml:space="preserve">Two payments with the funding method </w:t>
+      </w:r>
+      <w:r>
+        <w:rPr>
+          <w:sz w:val="22"/>
+          <w:b/>
+        </w:rPr>
+        <w:t xml:space="preserve">PULSE</w:t>
+      </w:r>
+      <w:r>
+        <w:rPr>
+          <w:sz w:val="22"/>
+        </w:rPr>
+        <w:t xml:space="preserve">, a debit network rather than a card brand.</w:t>
+      </w:r>
+    </w:p>
+    <w:p>
+      <w:pPr>
+        <w:spacing w:before="0" w:after="120"/>
+        <w:rPr>
+          <w:sz w:val="22"/>
+        </w:rPr>
+      </w:pPr>
+      <w:r>
+        <w:rPr>
+          <w:sz w:val="22"/>
+          <w:b/>
+        </w:rPr>
+        <w:t xml:space="preserve">1 + 2 = 3</w:t>
+      </w:r>
+      <w:r>
+        <w:rPr>
+          <w:sz w:val="22"/>
+        </w:rPr>
+        <w:t xml:space="preserve">, which is the gap exactly.</w:t>
+      </w:r>
+    </w:p>
+    <w:p>
+      <w:pPr>
+        <w:spacing w:before="0" w:after="120"/>
+        <w:rPr>
+          <w:sz w:val="22"/>
+        </w:rPr>
+      </w:pPr>
+      <w:r>
+        <w:rPr>
+          <w:sz w:val="22"/>
+        </w:rPr>
+        <w:t xml:space="preserve">This is a strong lead, not a proven cause. It suggests the graph decides what counts as a card payment from a fixed list of brands or categories, and anything outside that list is dropped. The query table has no such list — it reports whatever is there.</w:t>
+      </w:r>
+    </w:p>
+    <w:p>
+      <w:pPr>
+        <w:spacing w:before="0" w:after="120"/>
+        <w:rPr>
+          <w:sz w:val="22"/>
+        </w:rPr>
+      </w:pPr>
+      <w:r>
+        <w:rPr>
+          <w:sz w:val="22"/>
+        </w:rPr>
+        <w:t xml:space="preserve">It should be checked before it is believed. The arithmetic below is what is proven; the AppleSale and PULSE explanation is what should be looked at first.</w:t>
+      </w:r>
+    </w:p>
+    <w:p>
+      <w:pPr>
+        <w:spacing w:before="280" w:after="120"/>
+        <w:rPr>
+          <w:sz w:val="28"/>
+          <w:b/>
+        </w:rPr>
+      </w:pPr>
+      <w:r>
+        <w:rPr>
+          <w:sz w:val="28"/>
+          <w:b/>
+        </w:rPr>
+        <w:t xml:space="preserve">Why the range matters</w:t>
+      </w:r>
+    </w:p>
+    <w:p>
+      <w:pPr>
+        <w:spacing w:before="0" w:after="120"/>
+        <w:rPr>
+          <w:sz w:val="22"/>
+        </w:rPr>
+      </w:pPr>
+      <w:r>
+        <w:rPr>
+          <w:sz w:val="22"/>
+        </w:rPr>
+        <w:t xml:space="preserve">On a 30-day range the two views </w:t>
+      </w:r>
+      <w:r>
+        <w:rPr>
+          <w:sz w:val="22"/>
+          <w:b/>
+        </w:rPr>
+        <w:t xml:space="preserve">agree exactly</w:t>
+      </w:r>
+      <w:r>
+        <w:rPr>
+          <w:sz w:val="22"/>
+        </w:rPr>
+        <w:t xml:space="preserve">. Checked by hand on 24 September: the table counted 40 ACH and 46 card, and the graph drew 46.51 % and 53.49 %, matching to the decimal.</w:t>
+      </w:r>
+    </w:p>
+    <w:p>
+      <w:pPr>
+        <w:spacing w:before="0" w:after="120"/>
+        <w:rPr>
+          <w:sz w:val="22"/>
+        </w:rPr>
+      </w:pPr>
+      <w:r>
+        <w:rPr>
+          <w:sz w:val="22"/>
+        </w:rPr>
+        <w:t xml:space="preserve">Anyone reproducing this on the default range will conclude there is no defect. Use 90 days, or any range that contains an AppleSale or PULSE payment.</w:t>
+      </w:r>
+    </w:p>
+    <w:p>
+      <w:pPr>
+        <w:spacing w:before="280" w:after="120"/>
+        <w:rPr>
+          <w:sz w:val="28"/>
+          <w:b/>
+        </w:rPr>
+      </w:pPr>
+      <w:r>
+        <w:rPr>
+          <w:sz w:val="28"/>
+          <w:b/>
+        </w:rPr>
+        <w:t xml:space="preserve">Impact</w:t>
+      </w:r>
+    </w:p>
+    <w:p>
+      <w:pPr>
+        <w:spacing w:before="0" w:after="120"/>
+        <w:rPr>
+          <w:sz w:val="22"/>
+        </w:rPr>
+      </w:pPr>
+      <w:r>
+        <w:rPr>
+          <w:sz w:val="22"/>
+        </w:rPr>
+        <w:t xml:space="preserve">The graph is the first thing on the page a merchant looks at. It is the summary. If it disagrees with the table below it, one of the two is wrong and the merchant has no way to tell which.</w:t>
+      </w:r>
+    </w:p>
+    <w:p>
+      <w:pPr>
+        <w:spacing w:before="0" w:after="120"/>
+        <w:rPr>
+          <w:sz w:val="22"/>
+        </w:rPr>
+      </w:pPr>
+      <w:r>
+        <w:rPr>
+          <w:sz w:val="22"/>
+        </w:rPr>
+        <w:t xml:space="preserve">Here the graph is the wrong one, and it is wrong in a quiet way. Three payments out of 212 shifts the split by less than a percentage point. Nobody notices by eye. It is only caught by adding the table up.</w:t>
+      </w:r>
+    </w:p>
+    <w:p>
+      <w:pPr>
+        <w:spacing w:before="0" w:after="120"/>
+        <w:rPr>
+          <w:sz w:val="22"/>
+        </w:rPr>
+      </w:pPr>
+      <w:r>
+        <w:rPr>
+          <w:sz w:val="22"/>
+        </w:rPr>
+        <w:t xml:space="preserve">The number of missing payments depends on how many unusual payment types fall in the range, so the error grows as those become more common. A merchant taking a lot of Apple Pay would see a bigger gap.</w:t>
+      </w:r>
+    </w:p>
+    <w:p>
+      <w:pPr>
+        <w:spacing w:before="0" w:after="120"/>
+        <w:rPr>
+          <w:sz w:val="22"/>
+        </w:rPr>
+      </w:pPr>
+      <w:r>
+        <w:rPr>
+          <w:sz w:val="22"/>
+          <w:b/>
+        </w:rPr>
+        <w:t xml:space="preserve">Workaround:</w:t>
+      </w:r>
+      <w:r>
+        <w:rPr>
+          <w:sz w:val="22"/>
+        </w:rPr>
+        <w:t xml:space="preserve"> trust the query table, not the graph.</w:t>
+      </w:r>
+    </w:p>
+    <w:p>
+      <w:pPr>
+        <w:spacing w:before="280" w:after="120"/>
+        <w:rPr>
+          <w:sz w:val="28"/>
+          <w:b/>
+        </w:rPr>
+      </w:pPr>
+      <w:r>
+        <w:rPr>
+          <w:sz w:val="28"/>
+          <w:b/>
+        </w:rPr>
+        <w:t xml:space="preserve">Notes for the developer</w:t>
+      </w:r>
+    </w:p>
+    <w:p>
+      <w:pPr>
+        <w:spacing w:before="0" w:after="80"/>
+        <w:ind w:left="360"/>
+        <w:rPr>
+          <w:sz w:val="22"/>
+        </w:rPr>
+      </w:pPr>
+      <w:r>
+        <w:rPr>
+          <w:sz w:val="22"/>
+        </w:rPr>
+        <w:t xml:space="preserve">• Compare how each side decides a payment is a card payment. The table appears to treat anything that is not ACH as card. The graph appears to use a narrower rule.</w:t>
+      </w:r>
+    </w:p>
+    <w:p>
+      <w:pPr>
+        <w:spacing w:before="0" w:after="80"/>
+        <w:ind w:left="360"/>
+        <w:rPr>
+          <w:sz w:val="22"/>
+        </w:rPr>
+      </w:pPr>
+      <w:r>
+        <w:rPr>
+          <w:sz w:val="22"/>
+        </w:rPr>
+        <w:t xml:space="preserve">• Start with AppleSale and PULSE. They account for the gap exactly on this run.</w:t>
+      </w:r>
+    </w:p>
+    <w:p>
+      <w:pPr>
+        <w:spacing w:before="0" w:after="80"/>
+        <w:ind w:left="360"/>
+        <w:rPr>
+          <w:sz w:val="22"/>
+        </w:rPr>
+      </w:pPr>
+      <w:r>
+        <w:rPr>
+          <w:sz w:val="22"/>
+        </w:rPr>
+        <w:t xml:space="preserve">• Whatever the rule is, both views should share it. Two places deciding the same thing separately is how they drifted apart.</w:t>
+      </w:r>
+    </w:p>
+    <w:p>
+      <w:pPr>
+        <w:spacing w:before="0" w:after="80"/>
+        <w:ind w:left="360"/>
+        <w:rPr>
+          <w:sz w:val="22"/>
+        </w:rPr>
+      </w:pPr>
+      <w:r>
+        <w:rPr>
+          <w:sz w:val="22"/>
+        </w:rPr>
+        <w:t xml:space="preserve">• The query side is self-consistent. The default grouping, grouping by Funding Method alone and the two-field grouping all return the same 95 and 117, so the disagreement is between the graph and the query, not within the query.</w:t>
+      </w:r>
+    </w:p>
     <w:sectPr>
       <w:pgSz w:w="12240" w:h="15840"/>
       <w:pgMar w:top="1440" w:right="1440" w:bottom="1440" w:left="1440"/>

</xml_diff>

<commit_message>
Add PS-NEG-12, which starts affecting every merchant on 1 October
The default date range is built with a fixed leading zero before the month, so
October becomes 010 and November 011. The date boxes on screen stay correct
throughout, so nothing looks wrong.

Captured what a merchant actually sees, which the sheet did not record. With the
clock moved to November the same account that shows 708 card payments worth
$44,903.20 reads $0.00 and 0 on every row, and the graph disappears. No toast,
no banner, no empty state. The page looks like it worked.

October is milder than November because only the closing date is malformed, so
the two ends of the range are evidently built in different places. The December
value also loses the leading zero on the day.

Both screenshots are marked, and the section leads with the date this starts
rather than treating it as an ordinary open defect.
</commit_message>
<xml_diff>
--- a/PaymentStats_Bugs.docx
+++ b/PaymentStats_Bugs.docx
@@ -835,6 +835,88 @@
                 <w:sz w:val="20"/>
               </w:rPr>
               <w:t xml:space="preserve">BillPay</w:t>
+            </w:r>
+          </w:p>
+        </w:tc>
+      </w:tr>
+      <w:tr>
+        <w:tc>
+          <w:tcPr>
+            <w:tcW w:w="1872" w:type="dxa"/>
+          </w:tcPr>
+          <w:p>
+            <w:pPr>
+              <w:spacing w:before="40" w:after="40"/>
+            </w:pPr>
+            <w:r>
+              <w:rPr>
+                <w:sz w:val="20"/>
+              </w:rPr>
+              <w:t xml:space="preserve">9</w:t>
+            </w:r>
+          </w:p>
+        </w:tc>
+        <w:tc>
+          <w:tcPr>
+            <w:tcW w:w="1872" w:type="dxa"/>
+          </w:tcPr>
+          <w:p>
+            <w:pPr>
+              <w:spacing w:before="40" w:after="40"/>
+            </w:pPr>
+            <w:r>
+              <w:rPr>
+                <w:sz w:val="20"/>
+              </w:rPr>
+              <w:t xml:space="preserve">PS-NEG-12</w:t>
+            </w:r>
+          </w:p>
+        </w:tc>
+        <w:tc>
+          <w:tcPr>
+            <w:tcW w:w="1872" w:type="dxa"/>
+          </w:tcPr>
+          <w:p>
+            <w:pPr>
+              <w:spacing w:before="40" w:after="40"/>
+            </w:pPr>
+            <w:r>
+              <w:rPr>
+                <w:sz w:val="20"/>
+              </w:rPr>
+              <w:t xml:space="preserve">From 1 October the page shows all zeros, with no warning</w:t>
+            </w:r>
+          </w:p>
+        </w:tc>
+        <w:tc>
+          <w:tcPr>
+            <w:tcW w:w="1872" w:type="dxa"/>
+          </w:tcPr>
+          <w:p>
+            <w:pPr>
+              <w:spacing w:before="40" w:after="40"/>
+            </w:pPr>
+            <w:r>
+              <w:rPr>
+                <w:sz w:val="20"/>
+              </w:rPr>
+              <w:t xml:space="preserve">Critical</w:t>
+            </w:r>
+          </w:p>
+        </w:tc>
+        <w:tc>
+          <w:tcPr>
+            <w:tcW w:w="1872" w:type="dxa"/>
+          </w:tcPr>
+          <w:p>
+            <w:pPr>
+              <w:spacing w:before="40" w:after="40"/>
+            </w:pPr>
+            <w:r>
+              <w:rPr>
+                <w:sz w:val="20"/>
+              </w:rPr>
+              <w:t xml:space="preserve">all gateways</w:t>
             </w:r>
           </w:p>
         </w:tc>
@@ -9315,6 +9397,1252 @@
         <w:t xml:space="preserve">• The query side is self-consistent. The default grouping, grouping by Funding Method alone and the two-field grouping all return the same 95 and 117, so the disagreement is between the graph and the query, not within the query.</w:t>
       </w:r>
     </w:p>
+    <w:p>
+      <w:pPr>
+        <w:spacing w:before="0" w:after="200"/>
+        <w:rPr>
+          <w:sz w:val="36"/>
+          <w:b/>
+        </w:rPr>
+      </w:pPr>
+      <w:r>
+        <w:rPr>
+          <w:sz w:val="36"/>
+          <w:b/>
+        </w:rPr>
+        <w:t xml:space="preserve">9. PS-NEG-12 — from 1 October the page shows all zeros, with no warning</w:t>
+      </w:r>
+    </w:p>
+    <w:p>
+      <w:pPr>
+        <w:spacing w:before="0" w:after="120"/>
+        <w:rPr>
+          <w:sz w:val="22"/>
+        </w:rPr>
+      </w:pPr>
+      <w:r>
+        <w:rPr>
+          <w:sz w:val="22"/>
+          <w:b/>
+        </w:rPr>
+        <w:t xml:space="preserve">Test case:</w:t>
+      </w:r>
+      <w:r>
+        <w:rPr>
+          <w:sz w:val="22"/>
+        </w:rPr>
+        <w:t xml:space="preserve"> PS-NEG-12 </w:t>
+      </w:r>
+      <w:r>
+        <w:rPr>
+          <w:sz w:val="22"/>
+          <w:b/>
+        </w:rPr>
+        <w:t xml:space="preserve">Priority:</w:t>
+      </w:r>
+      <w:r>
+        <w:rPr>
+          <w:sz w:val="22"/>
+        </w:rPr>
+        <w:t xml:space="preserve"> Critical </w:t>
+      </w:r>
+      <w:r>
+        <w:rPr>
+          <w:sz w:val="22"/>
+          <w:b/>
+        </w:rPr>
+        <w:t xml:space="preserve">Gateways:</w:t>
+      </w:r>
+      <w:r>
+        <w:rPr>
+          <w:sz w:val="22"/>
+        </w:rPr>
+        <w:t xml:space="preserve"> all — measured on IPG </w:t>
+      </w:r>
+      <w:r>
+        <w:rPr>
+          <w:sz w:val="22"/>
+          <w:b/>
+        </w:rPr>
+        <w:t xml:space="preserve">Date observed:</w:t>
+      </w:r>
+      <w:r>
+        <w:rPr>
+          <w:sz w:val="22"/>
+        </w:rPr>
+        <w:t xml:space="preserve"> 21 September 2026, impact confirmed 24 September 2026</w:t>
+      </w:r>
+    </w:p>
+    <w:p>
+      <w:pPr>
+        <w:spacing w:before="0" w:after="120"/>
+        <w:rPr>
+          <w:sz w:val="22"/>
+        </w:rPr>
+      </w:pPr>
+      <w:r>
+        <w:rPr>
+          <w:sz w:val="22"/>
+        </w:rPr>
+        <w:t xml:space="preserve">&gt; </w:t>
+      </w:r>
+      <w:r>
+        <w:rPr>
+          <w:sz w:val="22"/>
+          <w:b/>
+        </w:rPr>
+        <w:t xml:space="preserve">This has not happened yet. It starts on 1 October 2026.</w:t>
+      </w:r>
+      <w:r>
+        <w:rPr>
+          <w:sz w:val="22"/>
+        </w:rPr>
+        <w:t xml:space="preserve"> &gt; Nothing needs to go wrong and nobody needs to do anything unusual. It arrives with the &gt; calendar. There are seven days left at the time of writing.</w:t>
+      </w:r>
+    </w:p>
+    <w:p>
+      <w:pPr>
+        <w:spacing w:before="280" w:after="120"/>
+        <w:rPr>
+          <w:sz w:val="28"/>
+          <w:b/>
+        </w:rPr>
+      </w:pPr>
+      <w:r>
+        <w:rPr>
+          <w:sz w:val="28"/>
+          <w:b/>
+        </w:rPr>
+        <w:t xml:space="preserve">Summary</w:t>
+      </w:r>
+    </w:p>
+    <w:p>
+      <w:pPr>
+        <w:spacing w:before="0" w:after="120"/>
+        <w:rPr>
+          <w:sz w:val="22"/>
+        </w:rPr>
+      </w:pPr>
+      <w:r>
+        <w:rPr>
+          <w:sz w:val="22"/>
+        </w:rPr>
+        <w:t xml:space="preserve">The default date range is built by joining text together with a </w:t>
+      </w:r>
+      <w:r>
+        <w:rPr>
+          <w:sz w:val="22"/>
+          <w:b/>
+        </w:rPr>
+        <w:t xml:space="preserve">fixed leading zero</w:t>
+      </w:r>
+      <w:r>
+        <w:rPr>
+          <w:sz w:val="22"/>
+        </w:rPr>
+        <w:t xml:space="preserve"> in front of the month. For months 1 to 9 that is correct — </w:t>
+      </w:r>
+      <w:r>
+        <w:rPr>
+          <w:sz w:val="22"/>
+          <w:rFonts w:ascii="Consolas" w:hAnsi="Consolas"/>
+          <w:sz w:val="20"/>
+        </w:rPr>
+        <w:t xml:space="preserve">09</w:t>
+      </w:r>
+      <w:r>
+        <w:rPr>
+          <w:sz w:val="22"/>
+        </w:rPr>
+        <w:t xml:space="preserve"> is right. From month 10 it is not: October becomes </w:t>
+      </w:r>
+      <w:r>
+        <w:rPr>
+          <w:sz w:val="22"/>
+          <w:rFonts w:ascii="Consolas" w:hAnsi="Consolas"/>
+          <w:sz w:val="20"/>
+        </w:rPr>
+        <w:t xml:space="preserve">010</w:t>
+      </w:r>
+      <w:r>
+        <w:rPr>
+          <w:sz w:val="22"/>
+        </w:rPr>
+        <w:t xml:space="preserve">, November </w:t>
+      </w:r>
+      <w:r>
+        <w:rPr>
+          <w:sz w:val="22"/>
+          <w:rFonts w:ascii="Consolas" w:hAnsi="Consolas"/>
+          <w:sz w:val="20"/>
+        </w:rPr>
+        <w:t xml:space="preserve">011</w:t>
+      </w:r>
+      <w:r>
+        <w:rPr>
+          <w:sz w:val="22"/>
+        </w:rPr>
+        <w:t xml:space="preserve">, December </w:t>
+      </w:r>
+      <w:r>
+        <w:rPr>
+          <w:sz w:val="22"/>
+          <w:rFonts w:ascii="Consolas" w:hAnsi="Consolas"/>
+          <w:sz w:val="20"/>
+        </w:rPr>
+        <w:t xml:space="preserve">012</w:t>
+      </w:r>
+      <w:r>
+        <w:rPr>
+          <w:sz w:val="22"/>
+        </w:rPr>
+        <w:t xml:space="preserve">.</w:t>
+      </w:r>
+    </w:p>
+    <w:p>
+      <w:pPr>
+        <w:spacing w:before="0" w:after="120"/>
+        <w:rPr>
+          <w:sz w:val="22"/>
+        </w:rPr>
+      </w:pPr>
+      <w:r>
+        <w:rPr>
+          <w:sz w:val="22"/>
+        </w:rPr>
+        <w:t xml:space="preserve">The date boxes on screen stay perfectly correct throughout. </w:t>
+      </w:r>
+      <w:r>
+        <w:rPr>
+          <w:sz w:val="22"/>
+          <w:rFonts w:ascii="Consolas" w:hAnsi="Consolas"/>
+          <w:sz w:val="20"/>
+        </w:rPr>
+        <w:t xml:space="preserve">10/21/2026</w:t>
+      </w:r>
+      <w:r>
+        <w:rPr>
+          <w:sz w:val="22"/>
+        </w:rPr>
+        <w:t xml:space="preserve"> and </w:t>
+      </w:r>
+      <w:r>
+        <w:rPr>
+          <w:sz w:val="22"/>
+          <w:rFonts w:ascii="Consolas" w:hAnsi="Consolas"/>
+          <w:sz w:val="20"/>
+        </w:rPr>
+        <w:t xml:space="preserve">11/20/2026</w:t>
+      </w:r>
+      <w:r>
+        <w:rPr>
+          <w:sz w:val="22"/>
+        </w:rPr>
+        <w:t xml:space="preserve"> are what a merchant sees. Only the value the page sends out carries the extra digit.</w:t>
+      </w:r>
+    </w:p>
+    <w:p>
+      <w:pPr>
+        <w:spacing w:before="0" w:after="120"/>
+        <w:rPr>
+          <w:sz w:val="22"/>
+        </w:rPr>
+      </w:pPr>
+      <w:r>
+        <w:rPr>
+          <w:sz w:val="22"/>
+        </w:rPr>
+        <w:t xml:space="preserve">The result is that from October the figures are wrong, and from November the page reads </w:t>
+      </w:r>
+      <w:r>
+        <w:rPr>
+          <w:sz w:val="22"/>
+          <w:b/>
+        </w:rPr>
+        <w:t xml:space="preserve">all zeros</w:t>
+      </w:r>
+      <w:r>
+        <w:rPr>
+          <w:sz w:val="22"/>
+        </w:rPr>
+        <w:t xml:space="preserve">. No error is shown at any point.</w:t>
+      </w:r>
+    </w:p>
+    <w:p>
+      <w:pPr>
+        <w:spacing w:before="280" w:after="120"/>
+        <w:rPr>
+          <w:sz w:val="28"/>
+          <w:b/>
+        </w:rPr>
+      </w:pPr>
+      <w:r>
+        <w:rPr>
+          <w:sz w:val="28"/>
+          <w:b/>
+        </w:rPr>
+        <w:t xml:space="preserve">Steps to reproduce</w:t>
+      </w:r>
+    </w:p>
+    <w:p>
+      <w:pPr>
+        <w:spacing w:before="0" w:after="120"/>
+        <w:rPr>
+          <w:sz w:val="22"/>
+        </w:rPr>
+      </w:pPr>
+      <w:r>
+        <w:rPr>
+          <w:sz w:val="22"/>
+        </w:rPr>
+        <w:t xml:space="preserve">Waiting for October is one way. To see it now:</w:t>
+      </w:r>
+    </w:p>
+    <w:p>
+      <w:pPr>
+        <w:spacing w:before="0" w:after="120"/>
+        <w:rPr>
+          <w:sz w:val="22"/>
+        </w:rPr>
+      </w:pPr>
+      <w:r>
+        <w:rPr>
+          <w:sz w:val="22"/>
+        </w:rPr>
+        <w:t xml:space="preserve">1. Sign in on any gateway and open </w:t>
+      </w:r>
+      <w:r>
+        <w:rPr>
+          <w:sz w:val="22"/>
+          <w:b/>
+        </w:rPr>
+        <w:t xml:space="preserve">Payment Analytics → Payment Stats</w:t>
+      </w:r>
+      <w:r>
+        <w:rPr>
+          <w:sz w:val="22"/>
+        </w:rPr>
+        <w:t xml:space="preserve">. Let the page load with real figures. 2. Change the machine's date to </w:t>
+      </w:r>
+      <w:r>
+        <w:rPr>
+          <w:sz w:val="22"/>
+          <w:b/>
+        </w:rPr>
+        <w:t xml:space="preserve">20 November 2026</w:t>
+      </w:r>
+      <w:r>
+        <w:rPr>
+          <w:sz w:val="22"/>
+        </w:rPr>
+        <w:t xml:space="preserve">. 3. Press the </w:t>
+      </w:r>
+      <w:r>
+        <w:rPr>
+          <w:sz w:val="22"/>
+          <w:b/>
+        </w:rPr>
+        <w:t xml:space="preserve">refresh</w:t>
+      </w:r>
+      <w:r>
+        <w:rPr>
+          <w:sz w:val="22"/>
+        </w:rPr>
+        <w:t xml:space="preserve"> icon beside the Payment Stats heading. Press it </w:t>
+      </w:r>
+      <w:r>
+        <w:rPr>
+          <w:sz w:val="22"/>
+          <w:b/>
+        </w:rPr>
+        <w:t xml:space="preserve">twice</w:t>
+      </w:r>
+      <w:r>
+        <w:rPr>
+          <w:sz w:val="22"/>
+        </w:rPr>
+        <w:t xml:space="preserve"> — the first click after page load is swallowed, which is a separate defect (PS-SUB-03). 4. Read the table, the graph and the two date boxes.</w:t>
+      </w:r>
+    </w:p>
+    <w:p>
+      <w:pPr>
+        <w:spacing w:before="0" w:after="120"/>
+        <w:rPr>
+          <w:sz w:val="22"/>
+        </w:rPr>
+      </w:pPr>
+      <w:r>
+        <w:rPr>
+          <w:sz w:val="22"/>
+        </w:rPr>
+        <w:t xml:space="preserve">The date must be changed </w:t>
+      </w:r>
+      <w:r>
+        <w:rPr>
+          <w:sz w:val="22"/>
+          <w:b/>
+        </w:rPr>
+        <w:t xml:space="preserve">after</w:t>
+      </w:r>
+      <w:r>
+        <w:rPr>
+          <w:sz w:val="22"/>
+        </w:rPr>
+        <w:t xml:space="preserve"> the page is open. Changing it first and then navigating does not rebuild the range.</w:t>
+      </w:r>
+    </w:p>
+    <w:p>
+      <w:pPr>
+        <w:spacing w:before="280" w:after="120"/>
+        <w:rPr>
+          <w:sz w:val="28"/>
+          <w:b/>
+        </w:rPr>
+      </w:pPr>
+      <w:r>
+        <w:rPr>
+          <w:sz w:val="28"/>
+          <w:b/>
+        </w:rPr>
+        <w:t xml:space="preserve">Expected result</w:t>
+      </w:r>
+    </w:p>
+    <w:p>
+      <w:pPr>
+        <w:spacing w:before="0" w:after="120"/>
+        <w:rPr>
+          <w:sz w:val="22"/>
+        </w:rPr>
+      </w:pPr>
+      <w:r>
+        <w:rPr>
+          <w:sz w:val="22"/>
+        </w:rPr>
+        <w:t xml:space="preserve">The default range works the same in every month of the year. December is not special.</w:t>
+      </w:r>
+    </w:p>
+    <w:p>
+      <w:pPr>
+        <w:spacing w:before="280" w:after="120"/>
+        <w:rPr>
+          <w:sz w:val="28"/>
+          <w:b/>
+        </w:rPr>
+      </w:pPr>
+      <w:r>
+        <w:rPr>
+          <w:sz w:val="28"/>
+          <w:b/>
+        </w:rPr>
+        <w:t xml:space="preserve">Actual result</w:t>
+      </w:r>
+    </w:p>
+    <w:p>
+      <w:pPr>
+        <w:spacing w:before="0" w:after="120"/>
+        <w:rPr>
+          <w:sz w:val="22"/>
+        </w:rPr>
+      </w:pPr>
+      <w:r>
+        <w:rPr>
+          <w:sz w:val="22"/>
+        </w:rPr>
+        <w:t xml:space="preserve">Every figure on the page reads zero and the graph disappears. The date boxes still show a sensible range, and nothing tells the merchant anything is wrong.</w:t>
+      </w:r>
+    </w:p>
+    <w:tbl>
+      <w:tblPr>
+        <w:tblW w:w="9360" w:type="dxa"/>
+        <w:tblBorders>
+          <w:top w:val="single" w:sz="4" w:space="0" w:color="BFBFBF"/>
+          <w:left w:val="single" w:sz="4" w:space="0" w:color="BFBFBF"/>
+          <w:bottom w:val="single" w:sz="4" w:space="0" w:color="BFBFBF"/>
+          <w:right w:val="single" w:sz="4" w:space="0" w:color="BFBFBF"/>
+          <w:insideH w:val="single" w:sz="4" w:space="0" w:color="BFBFBF"/>
+          <w:insideV w:val="single" w:sz="4" w:space="0" w:color="BFBFBF"/>
+        </w:tblBorders>
+      </w:tblPr>
+      <w:tr>
+        <w:tc>
+          <w:tcPr>
+            <w:tcW w:w="3120" w:type="dxa"/>
+            <w:shd w:val="clear" w:fill="F2F2F2"/>
+          </w:tcPr>
+          <w:p>
+            <w:pPr>
+              <w:spacing w:before="40" w:after="40"/>
+            </w:pPr>
+            <w:r>
+              <w:rPr>
+                <w:sz w:val="20"/>
+                <w:b/>
+              </w:rPr>
+              <w:t xml:space="preserve">What the page sends</w:t>
+            </w:r>
+          </w:p>
+        </w:tc>
+        <w:tc>
+          <w:tcPr>
+            <w:tcW w:w="3120" w:type="dxa"/>
+            <w:shd w:val="clear" w:fill="F2F2F2"/>
+          </w:tcPr>
+          <w:p>
+            <w:pPr>
+              <w:spacing w:before="40" w:after="40"/>
+            </w:pPr>
+            <w:r>
+              <w:rPr>
+                <w:sz w:val="20"/>
+                <w:b/>
+              </w:rPr>
+              <w:t xml:space="preserve">Month</w:t>
+            </w:r>
+          </w:p>
+        </w:tc>
+        <w:tc>
+          <w:tcPr>
+            <w:tcW w:w="3120" w:type="dxa"/>
+            <w:shd w:val="clear" w:fill="F2F2F2"/>
+          </w:tcPr>
+          <w:p>
+            <w:pPr>
+              <w:spacing w:before="40" w:after="40"/>
+            </w:pPr>
+            <w:r>
+              <w:rPr>
+                <w:sz w:val="20"/>
+                <w:b/>
+              </w:rPr>
+              <w:t xml:space="preserve">Result on screen</w:t>
+            </w:r>
+          </w:p>
+        </w:tc>
+      </w:tr>
+      <w:tr>
+        <w:tc>
+          <w:tcPr>
+            <w:tcW w:w="3120" w:type="dxa"/>
+          </w:tcPr>
+          <w:p>
+            <w:pPr>
+              <w:spacing w:before="40" w:after="40"/>
+            </w:pPr>
+            <w:r>
+              <w:rPr>
+                <w:sz w:val="20"/>
+              </w:rPr>
+              <w:t xml:space="preserve">2026-09-15 → 2026-010-15</w:t>
+            </w:r>
+          </w:p>
+        </w:tc>
+        <w:tc>
+          <w:tcPr>
+            <w:tcW w:w="3120" w:type="dxa"/>
+          </w:tcPr>
+          <w:p>
+            <w:pPr>
+              <w:spacing w:before="40" w:after="40"/>
+            </w:pPr>
+            <w:r>
+              <w:rPr>
+                <w:sz w:val="20"/>
+              </w:rPr>
+              <w:t xml:space="preserve">October</w:t>
+            </w:r>
+          </w:p>
+        </w:tc>
+        <w:tc>
+          <w:tcPr>
+            <w:tcW w:w="3120" w:type="dxa"/>
+          </w:tcPr>
+          <w:p>
+            <w:pPr>
+              <w:spacing w:before="40" w:after="40"/>
+            </w:pPr>
+            <w:r>
+              <w:rPr>
+                <w:sz w:val="20"/>
+              </w:rPr>
+              <w:t xml:space="preserve">figures shown, but for the wrong window</w:t>
+            </w:r>
+          </w:p>
+        </w:tc>
+      </w:tr>
+      <w:tr>
+        <w:tc>
+          <w:tcPr>
+            <w:tcW w:w="3120" w:type="dxa"/>
+          </w:tcPr>
+          <w:p>
+            <w:pPr>
+              <w:spacing w:before="40" w:after="40"/>
+            </w:pPr>
+            <w:r>
+              <w:rPr>
+                <w:sz w:val="20"/>
+              </w:rPr>
+              <w:t xml:space="preserve">2026-010-21 → 2026-011-20</w:t>
+            </w:r>
+          </w:p>
+        </w:tc>
+        <w:tc>
+          <w:tcPr>
+            <w:tcW w:w="3120" w:type="dxa"/>
+          </w:tcPr>
+          <w:p>
+            <w:pPr>
+              <w:spacing w:before="40" w:after="40"/>
+            </w:pPr>
+            <w:r>
+              <w:rPr>
+                <w:sz w:val="20"/>
+              </w:rPr>
+              <w:t xml:space="preserve">November</w:t>
+            </w:r>
+          </w:p>
+        </w:tc>
+        <w:tc>
+          <w:tcPr>
+            <w:tcW w:w="3120" w:type="dxa"/>
+          </w:tcPr>
+          <w:p>
+            <w:pPr>
+              <w:spacing w:before="40" w:after="40"/>
+            </w:pPr>
+            <w:r>
+              <w:rPr>
+                <w:sz w:val="20"/>
+              </w:rPr>
+              <w:t xml:space="preserve">everything reads zero</w:t>
+            </w:r>
+          </w:p>
+        </w:tc>
+      </w:tr>
+      <w:tr>
+        <w:tc>
+          <w:tcPr>
+            <w:tcW w:w="3120" w:type="dxa"/>
+          </w:tcPr>
+          <w:p>
+            <w:pPr>
+              <w:spacing w:before="40" w:after="40"/>
+            </w:pPr>
+            <w:r>
+              <w:rPr>
+                <w:sz w:val="20"/>
+              </w:rPr>
+              <w:t xml:space="preserve">2026-011-5 → 2026-012-05</w:t>
+            </w:r>
+          </w:p>
+        </w:tc>
+        <w:tc>
+          <w:tcPr>
+            <w:tcW w:w="3120" w:type="dxa"/>
+          </w:tcPr>
+          <w:p>
+            <w:pPr>
+              <w:spacing w:before="40" w:after="40"/>
+            </w:pPr>
+            <w:r>
+              <w:rPr>
+                <w:sz w:val="20"/>
+              </w:rPr>
+              <w:t xml:space="preserve">December</w:t>
+            </w:r>
+          </w:p>
+        </w:tc>
+        <w:tc>
+          <w:tcPr>
+            <w:tcW w:w="3120" w:type="dxa"/>
+          </w:tcPr>
+          <w:p>
+            <w:pPr>
+              <w:spacing w:before="40" w:after="40"/>
+            </w:pPr>
+            <w:r>
+              <w:rPr>
+                <w:sz w:val="20"/>
+              </w:rPr>
+              <w:t xml:space="preserve">same as November</w:t>
+            </w:r>
+          </w:p>
+        </w:tc>
+      </w:tr>
+    </w:tbl>
+    <w:p>
+      <w:pPr>
+        <w:spacing w:after="120"/>
+      </w:pPr>
+    </w:p>
+    <w:p>
+      <w:pPr>
+        <w:spacing w:before="0" w:after="120"/>
+        <w:rPr>
+          <w:sz w:val="22"/>
+        </w:rPr>
+      </w:pPr>
+      <w:r>
+        <w:rPr>
+          <w:sz w:val="22"/>
+        </w:rPr>
+        <w:t xml:space="preserve">October is the milder case because only the closing date is malformed. From November both dates carry the extra digit and nothing is returned at all.</w:t>
+      </w:r>
+    </w:p>
+    <w:p>
+      <w:pPr>
+        <w:spacing w:before="0" w:after="120"/>
+        <w:rPr>
+          <w:sz w:val="22"/>
+        </w:rPr>
+      </w:pPr>
+      <w:r>
+        <w:rPr>
+          <w:sz w:val="22"/>
+        </w:rPr>
+        <w:t xml:space="preserve">Note the December value </w:t>
+      </w:r>
+      <w:r>
+        <w:rPr>
+          <w:sz w:val="22"/>
+          <w:rFonts w:ascii="Consolas" w:hAnsi="Consolas"/>
+          <w:sz w:val="20"/>
+        </w:rPr>
+        <w:t xml:space="preserve">2026-011-5</w:t>
+      </w:r>
+      <w:r>
+        <w:rPr>
+          <w:sz w:val="22"/>
+        </w:rPr>
+        <w:t xml:space="preserve"> — the </w:t>
+      </w:r>
+      <w:r>
+        <w:rPr>
+          <w:sz w:val="22"/>
+          <w:b/>
+        </w:rPr>
+        <w:t xml:space="preserve">day</w:t>
+      </w:r>
+      <w:r>
+        <w:rPr>
+          <w:sz w:val="22"/>
+        </w:rPr>
+        <w:t xml:space="preserve"> loses its leading zero as well.</w:t>
+      </w:r>
+    </w:p>
+    <w:p>
+      <w:pPr>
+        <w:spacing w:before="280" w:after="120"/>
+        <w:rPr>
+          <w:sz w:val="28"/>
+          <w:b/>
+        </w:rPr>
+      </w:pPr>
+      <w:r>
+        <w:rPr>
+          <w:sz w:val="28"/>
+          <w:b/>
+        </w:rPr>
+        <w:t xml:space="preserve">Evidence</w:t>
+      </w:r>
+    </w:p>
+    <w:p>
+      <w:pPr>
+        <w:spacing w:before="240" w:after="100"/>
+        <w:rPr>
+          <w:sz w:val="24"/>
+          <w:b/>
+        </w:rPr>
+      </w:pPr>
+      <w:r>
+        <w:rPr>
+          <w:sz w:val="24"/>
+          <w:b/>
+        </w:rPr>
+        <w:t xml:space="preserve">September — the page working normally</w:t>
+      </w:r>
+    </w:p>
+    <w:p>
+      <w:pPr>
+        <w:spacing w:before="80" w:after="200"/>
+      </w:pPr>
+      <w:r>
+        <w:drawing>
+          <wp:inline distT="0" distB="0" distL="0" distR="0">
+            <wp:extent cx="5943600" cy="3714750"/>
+            <wp:docPr id="118" name="Picture 118"/>
+            <a:graphic xmlns:a="http://schemas.openxmlformats.org/drawingml/2006/main">
+              <a:graphicData uri="http://schemas.openxmlformats.org/drawingml/2006/picture">
+                <pic:pic xmlns:pic="http://schemas.openxmlformats.org/drawingml/2006/picture">
+                  <pic:nvPicPr>
+                    <pic:cNvPr id="118" name="Picture"/>
+                    <pic:cNvPicPr/>
+                  </pic:nvPicPr>
+                  <pic:blipFill>
+                    <a:blip r:embed="rId118"/>
+                    <a:stretch>
+                      <a:fillRect/>
+                    </a:stretch>
+                  </pic:blipFill>
+                  <pic:spPr>
+                    <a:xfrm>
+                      <a:off x="0" y="0"/>
+                      <a:ext cx="5943600" cy="3714750"/>
+                    </a:xfrm>
+                    <a:prstGeom prst="rect">
+                      <a:avLst/>
+                    </a:prstGeom>
+                  </pic:spPr>
+                </pic:pic>
+              </a:graphicData>
+            </a:graphic>
+          </wp:inline>
+        </w:drawing>
+      </w:r>
+    </w:p>
+    <w:p>
+      <w:pPr>
+        <w:spacing w:before="0" w:after="120"/>
+        <w:rPr>
+          <w:sz w:val="22"/>
+        </w:rPr>
+      </w:pPr>
+      <w:r>
+        <w:rPr>
+          <w:sz w:val="22"/>
+        </w:rPr>
+        <w:t xml:space="preserve">Card Payments </w:t>
+      </w:r>
+      <w:r>
+        <w:rPr>
+          <w:sz w:val="22"/>
+          <w:rFonts w:ascii="Consolas" w:hAnsi="Consolas"/>
+          <w:sz w:val="20"/>
+        </w:rPr>
+        <w:t xml:space="preserve">$44,903.20</w:t>
+      </w:r>
+      <w:r>
+        <w:rPr>
+          <w:sz w:val="22"/>
+        </w:rPr>
+        <w:t xml:space="preserve"> across 708 payments, Card Voids </w:t>
+      </w:r>
+      <w:r>
+        <w:rPr>
+          <w:sz w:val="22"/>
+          <w:rFonts w:ascii="Consolas" w:hAnsi="Consolas"/>
+          <w:sz w:val="20"/>
+        </w:rPr>
+        <w:t xml:space="preserve">$510.00</w:t>
+      </w:r>
+      <w:r>
+        <w:rPr>
+          <w:sz w:val="22"/>
+        </w:rPr>
+        <w:t xml:space="preserve"> across 8. The graph draws both bars.</w:t>
+      </w:r>
+    </w:p>
+    <w:p>
+      <w:pPr>
+        <w:spacing w:before="240" w:after="100"/>
+        <w:rPr>
+          <w:sz w:val="24"/>
+          <w:b/>
+        </w:rPr>
+      </w:pPr>
+      <w:r>
+        <w:rPr>
+          <w:sz w:val="24"/>
+          <w:b/>
+        </w:rPr>
+        <w:t xml:space="preserve">November — the same account, minutes later</w:t>
+      </w:r>
+    </w:p>
+    <w:p>
+      <w:pPr>
+        <w:spacing w:before="80" w:after="200"/>
+      </w:pPr>
+      <w:r>
+        <w:drawing>
+          <wp:inline distT="0" distB="0" distL="0" distR="0">
+            <wp:extent cx="5943600" cy="3714750"/>
+            <wp:docPr id="119" name="Picture 119"/>
+            <a:graphic xmlns:a="http://schemas.openxmlformats.org/drawingml/2006/main">
+              <a:graphicData uri="http://schemas.openxmlformats.org/drawingml/2006/picture">
+                <pic:pic xmlns:pic="http://schemas.openxmlformats.org/drawingml/2006/picture">
+                  <pic:nvPicPr>
+                    <pic:cNvPr id="119" name="Picture"/>
+                    <pic:cNvPicPr/>
+                  </pic:nvPicPr>
+                  <pic:blipFill>
+                    <a:blip r:embed="rId119"/>
+                    <a:stretch>
+                      <a:fillRect/>
+                    </a:stretch>
+                  </pic:blipFill>
+                  <pic:spPr>
+                    <a:xfrm>
+                      <a:off x="0" y="0"/>
+                      <a:ext cx="5943600" cy="3714750"/>
+                    </a:xfrm>
+                    <a:prstGeom prst="rect">
+                      <a:avLst/>
+                    </a:prstGeom>
+                  </pic:spPr>
+                </pic:pic>
+              </a:graphicData>
+            </a:graphic>
+          </wp:inline>
+        </w:drawing>
+      </w:r>
+    </w:p>
+    <w:p>
+      <w:pPr>
+        <w:spacing w:before="0" w:after="120"/>
+        <w:rPr>
+          <w:sz w:val="22"/>
+        </w:rPr>
+      </w:pPr>
+      <w:r>
+        <w:rPr>
+          <w:sz w:val="22"/>
+        </w:rPr>
+        <w:t xml:space="preserve">Same merchant. Same data in the system. The clock has been moved forward and the range rebuilt.</w:t>
+      </w:r>
+    </w:p>
+    <w:p>
+      <w:pPr>
+        <w:spacing w:before="0" w:after="120"/>
+        <w:rPr>
+          <w:sz w:val="22"/>
+        </w:rPr>
+      </w:pPr>
+      <w:r>
+        <w:rPr>
+          <w:sz w:val="22"/>
+          <w:b/>
+        </w:rPr>
+        <w:t xml:space="preserve">Every row now reads `$0.00` and `0`.</w:t>
+      </w:r>
+      <w:r>
+        <w:rPr>
+          <w:sz w:val="22"/>
+        </w:rPr>
+        <w:t xml:space="preserve"> The graph is empty.</w:t>
+      </w:r>
+    </w:p>
+    <w:p>
+      <w:pPr>
+        <w:spacing w:before="0" w:after="120"/>
+        <w:rPr>
+          <w:sz w:val="22"/>
+        </w:rPr>
+      </w:pPr>
+      <w:r>
+        <w:rPr>
+          <w:sz w:val="22"/>
+        </w:rPr>
+        <w:t xml:space="preserve">The date boxes read </w:t>
+      </w:r>
+      <w:r>
+        <w:rPr>
+          <w:sz w:val="22"/>
+          <w:rFonts w:ascii="Consolas" w:hAnsi="Consolas"/>
+          <w:sz w:val="20"/>
+        </w:rPr>
+        <w:t xml:space="preserve">10/21/2026</w:t>
+      </w:r>
+      <w:r>
+        <w:rPr>
+          <w:sz w:val="22"/>
+        </w:rPr>
+        <w:t xml:space="preserve"> and </w:t>
+      </w:r>
+      <w:r>
+        <w:rPr>
+          <w:sz w:val="22"/>
+          <w:rFonts w:ascii="Consolas" w:hAnsi="Consolas"/>
+          <w:sz w:val="20"/>
+        </w:rPr>
+        <w:t xml:space="preserve">11/20/2026</w:t>
+      </w:r>
+      <w:r>
+        <w:rPr>
+          <w:sz w:val="22"/>
+        </w:rPr>
+        <w:t xml:space="preserve"> — boxed in orange, and entirely reasonable. There is no toast, no banner and no empty-state message. The page looks like it worked.</w:t>
+      </w:r>
+    </w:p>
+    <w:p>
+      <w:pPr>
+        <w:spacing w:before="280" w:after="120"/>
+        <w:rPr>
+          <w:sz w:val="28"/>
+          <w:b/>
+        </w:rPr>
+      </w:pPr>
+      <w:r>
+        <w:rPr>
+          <w:sz w:val="28"/>
+          <w:b/>
+        </w:rPr>
+        <w:t xml:space="preserve">Impact</w:t>
+      </w:r>
+    </w:p>
+    <w:p>
+      <w:pPr>
+        <w:spacing w:before="0" w:after="120"/>
+        <w:rPr>
+          <w:sz w:val="22"/>
+        </w:rPr>
+      </w:pPr>
+      <w:r>
+        <w:rPr>
+          <w:sz w:val="22"/>
+        </w:rPr>
+        <w:t xml:space="preserve">For three months of the year, every merchant on every gateway opens Payment Stats and is told they took no payments.</w:t>
+      </w:r>
+    </w:p>
+    <w:p>
+      <w:pPr>
+        <w:spacing w:before="0" w:after="120"/>
+        <w:rPr>
+          <w:sz w:val="22"/>
+        </w:rPr>
+      </w:pPr>
+      <w:r>
+        <w:rPr>
+          <w:sz w:val="22"/>
+        </w:rPr>
+        <w:t xml:space="preserve">The obvious conclusion is that business stopped. The figures are not marked as unavailable or stale — they are presented as the answer. A merchant reconciling their month, or checking whether a busy day landed, gets zero and has no reason to doubt it.</w:t>
+      </w:r>
+    </w:p>
+    <w:p>
+      <w:pPr>
+        <w:spacing w:before="0" w:after="120"/>
+        <w:rPr>
+          <w:sz w:val="22"/>
+        </w:rPr>
+      </w:pPr>
+      <w:r>
+        <w:rPr>
+          <w:sz w:val="22"/>
+        </w:rPr>
+        <w:t xml:space="preserve">It affects everyone at once, on the same day, without warning. Support will not get one call, it will get a great many, and the page will offer no clue as to why.</w:t>
+      </w:r>
+    </w:p>
+    <w:p>
+      <w:pPr>
+        <w:spacing w:before="0" w:after="120"/>
+        <w:rPr>
+          <w:sz w:val="22"/>
+        </w:rPr>
+      </w:pPr>
+      <w:r>
+        <w:rPr>
+          <w:sz w:val="22"/>
+          <w:b/>
+        </w:rPr>
+        <w:t xml:space="preserve">Workaround:</w:t>
+      </w:r>
+      <w:r>
+        <w:rPr>
+          <w:sz w:val="22"/>
+        </w:rPr>
+        <w:t xml:space="preserve"> setting the dates by hand works. The picker writes a correctly formatted value; only the range the page builds on its own is affected. Merchants will not know to do this.</w:t>
+      </w:r>
+    </w:p>
+    <w:p>
+      <w:pPr>
+        <w:spacing w:before="280" w:after="120"/>
+        <w:rPr>
+          <w:sz w:val="28"/>
+          <w:b/>
+        </w:rPr>
+      </w:pPr>
+      <w:r>
+        <w:rPr>
+          <w:sz w:val="28"/>
+          <w:b/>
+        </w:rPr>
+        <w:t xml:space="preserve">Notes for the developer</w:t>
+      </w:r>
+    </w:p>
+    <w:p>
+      <w:pPr>
+        <w:spacing w:before="0" w:after="80"/>
+        <w:ind w:left="360"/>
+        <w:rPr>
+          <w:sz w:val="22"/>
+        </w:rPr>
+      </w:pPr>
+      <w:r>
+        <w:rPr>
+          <w:sz w:val="22"/>
+        </w:rPr>
+        <w:t xml:space="preserve">• The fault is a hard-coded </w:t>
+      </w:r>
+      <w:r>
+        <w:rPr>
+          <w:sz w:val="22"/>
+          <w:rFonts w:ascii="Consolas" w:hAnsi="Consolas"/>
+          <w:sz w:val="20"/>
+        </w:rPr>
+        <w:t xml:space="preserve">0</w:t>
+      </w:r>
+      <w:r>
+        <w:rPr>
+          <w:sz w:val="22"/>
+        </w:rPr>
+        <w:t xml:space="preserve"> in front of the month rather than padding to two digits. Pad the month, and pad the day for the same reason — the December value shows the day losing its leading zero too.</w:t>
+      </w:r>
+    </w:p>
+    <w:p>
+      <w:pPr>
+        <w:spacing w:before="0" w:after="80"/>
+        <w:ind w:left="360"/>
+        <w:rPr>
+          <w:sz w:val="22"/>
+        </w:rPr>
+      </w:pPr>
+      <w:r>
+        <w:rPr>
+          <w:sz w:val="22"/>
+        </w:rPr>
+        <w:t xml:space="preserve">• Check everywhere the default range is built, not just the first occurrence. October is milder than November because only one of the two dates is wrong, which means the two ends of the range are built in different places.</w:t>
+      </w:r>
+    </w:p>
+    <w:p>
+      <w:pPr>
+        <w:spacing w:before="0" w:after="80"/>
+        <w:ind w:left="360"/>
+        <w:rPr>
+          <w:sz w:val="22"/>
+        </w:rPr>
+      </w:pPr>
+      <w:r>
+        <w:rPr>
+          <w:sz w:val="22"/>
+        </w:rPr>
+        <w:t xml:space="preserve">• The date pickers are not involved and do not need changing. They were correct in every month tested.</w:t>
+      </w:r>
+    </w:p>
+    <w:p>
+      <w:pPr>
+        <w:spacing w:before="0" w:after="80"/>
+        <w:ind w:left="360"/>
+        <w:rPr>
+          <w:sz w:val="22"/>
+        </w:rPr>
+      </w:pPr>
+      <w:r>
+        <w:rPr>
+          <w:sz w:val="22"/>
+        </w:rPr>
+        <w:t xml:space="preserve">• Worth deciding separately what the page should do when a request comes back with nothing. Showing zeros with no message is what turns this from a wrong date into a merchant believing they took no money.</w:t>
+      </w:r>
+    </w:p>
+    <w:p>
+      <w:pPr>
+        <w:spacing w:before="0" w:after="80"/>
+        <w:ind w:left="360"/>
+        <w:rPr>
+          <w:sz w:val="22"/>
+        </w:rPr>
+      </w:pPr>
+      <w:r>
+        <w:rPr>
+          <w:sz w:val="22"/>
+        </w:rPr>
+        <w:t xml:space="preserve">• Three automated tests cover this, one per month, by moving the browser clock. They are in </w:t>
+      </w:r>
+      <w:r>
+        <w:rPr>
+          <w:sz w:val="22"/>
+          <w:rFonts w:ascii="Consolas" w:hAnsi="Consolas"/>
+          <w:sz w:val="20"/>
+        </w:rPr>
+        <w:t xml:space="preserve">tests/customer/payment-analytics/payment-analytics.spec.ts</w:t>
+      </w:r>
+      <w:r>
+        <w:rPr>
+          <w:sz w:val="22"/>
+        </w:rPr>
+        <w:t xml:space="preserve"> under </w:t>
+      </w:r>
+      <w:r>
+        <w:rPr>
+          <w:sz w:val="22"/>
+          <w:rFonts w:ascii="Consolas" w:hAnsi="Consolas"/>
+          <w:sz w:val="20"/>
+        </w:rPr>
+        <w:t xml:space="preserve">@PS-NEG-12</w:t>
+      </w:r>
+      <w:r>
+        <w:rPr>
+          <w:sz w:val="22"/>
+        </w:rPr>
+        <w:t xml:space="preserve"> and are marked expected-fail.</w:t>
+      </w:r>
+    </w:p>
+    <w:p>
+      <w:pPr>
+        <w:spacing w:before="280" w:after="120"/>
+        <w:rPr>
+          <w:sz w:val="28"/>
+          <w:b/>
+        </w:rPr>
+      </w:pPr>
+      <w:r>
+        <w:rPr>
+          <w:sz w:val="28"/>
+          <w:b/>
+        </w:rPr>
+        <w:t xml:space="preserve">How to tell it is fixed</w:t>
+      </w:r>
+    </w:p>
+    <w:p>
+      <w:pPr>
+        <w:spacing w:before="0" w:after="120"/>
+        <w:rPr>
+          <w:sz w:val="22"/>
+        </w:rPr>
+      </w:pPr>
+      <w:r>
+        <w:rPr>
+          <w:sz w:val="22"/>
+        </w:rPr>
+        <w:t xml:space="preserve">With the machine clock set to any date in October, November and December in turn:</w:t>
+      </w:r>
+    </w:p>
+    <w:p>
+      <w:pPr>
+        <w:spacing w:before="0" w:after="120"/>
+        <w:rPr>
+          <w:sz w:val="22"/>
+        </w:rPr>
+      </w:pPr>
+      <w:r>
+        <w:rPr>
+          <w:sz w:val="22"/>
+        </w:rPr>
+        <w:t xml:space="preserve">1. Open Payment Stats and rebuild the default range with the refresh icon. 2. The figures must match what the same account shows for an equivalent range in September. 3. Both date boxes must still read a valid date.</w:t>
+      </w:r>
+    </w:p>
+    <w:p>
+      <w:pPr>
+        <w:spacing w:before="0" w:after="120"/>
+        <w:rPr>
+          <w:sz w:val="22"/>
+        </w:rPr>
+      </w:pPr>
+      <w:r>
+        <w:rPr>
+          <w:sz w:val="22"/>
+        </w:rPr>
+        <w:t xml:space="preserve">All three months must pass. October alone is not enough, because it fails differently from the other two.</w:t>
+      </w:r>
+    </w:p>
     <w:sectPr>
       <w:pgSz w:w="12240" w:h="15840"/>
       <w:pgMar w:top="1440" w:right="1440" w:bottom="1440" w:left="1440"/>

</xml_diff>

<commit_message>
Add PS-SUB-01, which does more than leave a button enabled
The sheet recorded that Submit stays enabled when a date is missing. Checking it
again showed the button is not only enabled but accepts the click: with From
Date cleared the query runs and the page fills with figures, 708 card payments
worth $44,903.20, while the From Date box stays empty.

That is what makes it worth fixing. An enabled button that does nothing is an
annoyance; one that returns figures for a period the page never states is
something a merchant can misread.

The cause is already pinned - isSubmitButtonDisabled is maintained in five
places and the line applying it is commented out at index.js:606 - so the report
also asks why it was commented out, since restoring it blindly may bring back
whatever prompted that.

Three marked screenshots: both dates filled, From Date cleared with Submit
unchanged, and the result after clicking.
</commit_message>
<xml_diff>
--- a/PaymentStats_Bugs.docx
+++ b/PaymentStats_Bugs.docx
@@ -901,6 +901,88 @@
                 <w:sz w:val="20"/>
               </w:rPr>
               <w:t xml:space="preserve">Critical</w:t>
+            </w:r>
+          </w:p>
+        </w:tc>
+        <w:tc>
+          <w:tcPr>
+            <w:tcW w:w="1872" w:type="dxa"/>
+          </w:tcPr>
+          <w:p>
+            <w:pPr>
+              <w:spacing w:before="40" w:after="40"/>
+            </w:pPr>
+            <w:r>
+              <w:rPr>
+                <w:sz w:val="20"/>
+              </w:rPr>
+              <w:t xml:space="preserve">all gateways</w:t>
+            </w:r>
+          </w:p>
+        </w:tc>
+      </w:tr>
+      <w:tr>
+        <w:tc>
+          <w:tcPr>
+            <w:tcW w:w="1872" w:type="dxa"/>
+          </w:tcPr>
+          <w:p>
+            <w:pPr>
+              <w:spacing w:before="40" w:after="40"/>
+            </w:pPr>
+            <w:r>
+              <w:rPr>
+                <w:sz w:val="20"/>
+              </w:rPr>
+              <w:t xml:space="preserve">10</w:t>
+            </w:r>
+          </w:p>
+        </w:tc>
+        <w:tc>
+          <w:tcPr>
+            <w:tcW w:w="1872" w:type="dxa"/>
+          </w:tcPr>
+          <w:p>
+            <w:pPr>
+              <w:spacing w:before="40" w:after="40"/>
+            </w:pPr>
+            <w:r>
+              <w:rPr>
+                <w:sz w:val="20"/>
+              </w:rPr>
+              <w:t xml:space="preserve">PS-SUB-01</w:t>
+            </w:r>
+          </w:p>
+        </w:tc>
+        <w:tc>
+          <w:tcPr>
+            <w:tcW w:w="1872" w:type="dxa"/>
+          </w:tcPr>
+          <w:p>
+            <w:pPr>
+              <w:spacing w:before="40" w:after="40"/>
+            </w:pPr>
+            <w:r>
+              <w:rPr>
+                <w:sz w:val="20"/>
+              </w:rPr>
+              <w:t xml:space="preserve">Submit runs with no start date and returns figures for an unknown period</w:t>
+            </w:r>
+          </w:p>
+        </w:tc>
+        <w:tc>
+          <w:tcPr>
+            <w:tcW w:w="1872" w:type="dxa"/>
+          </w:tcPr>
+          <w:p>
+            <w:pPr>
+              <w:spacing w:before="40" w:after="40"/>
+            </w:pPr>
+            <w:r>
+              <w:rPr>
+                <w:sz w:val="20"/>
+              </w:rPr>
+              <w:t xml:space="preserve">Medium</w:t>
             </w:r>
           </w:p>
         </w:tc>
@@ -10643,6 +10725,1072 @@
         <w:t xml:space="preserve">All three months must pass. October alone is not enough, because it fails differently from the other two.</w:t>
       </w:r>
     </w:p>
+    <w:p>
+      <w:pPr>
+        <w:spacing w:before="0" w:after="200"/>
+        <w:rPr>
+          <w:sz w:val="36"/>
+          <w:b/>
+        </w:rPr>
+      </w:pPr>
+      <w:r>
+        <w:rPr>
+          <w:sz w:val="36"/>
+          <w:b/>
+        </w:rPr>
+        <w:t xml:space="preserve">10. PS-SUB-01 — Submit runs with no start date and returns figures for an unknown period</w:t>
+      </w:r>
+    </w:p>
+    <w:p>
+      <w:pPr>
+        <w:spacing w:before="0" w:after="120"/>
+        <w:rPr>
+          <w:sz w:val="22"/>
+        </w:rPr>
+      </w:pPr>
+      <w:r>
+        <w:rPr>
+          <w:sz w:val="22"/>
+          <w:b/>
+        </w:rPr>
+        <w:t xml:space="preserve">Test case:</w:t>
+      </w:r>
+      <w:r>
+        <w:rPr>
+          <w:sz w:val="22"/>
+        </w:rPr>
+        <w:t xml:space="preserve"> PS-SUB-01 </w:t>
+      </w:r>
+      <w:r>
+        <w:rPr>
+          <w:sz w:val="22"/>
+          <w:b/>
+        </w:rPr>
+        <w:t xml:space="preserve">Priority:</w:t>
+      </w:r>
+      <w:r>
+        <w:rPr>
+          <w:sz w:val="22"/>
+        </w:rPr>
+        <w:t xml:space="preserve"> Medium </w:t>
+      </w:r>
+      <w:r>
+        <w:rPr>
+          <w:sz w:val="22"/>
+          <w:b/>
+        </w:rPr>
+        <w:t xml:space="preserve">Gateways:</w:t>
+      </w:r>
+      <w:r>
+        <w:rPr>
+          <w:sz w:val="22"/>
+        </w:rPr>
+        <w:t xml:space="preserve"> all — measured on IPG </w:t>
+      </w:r>
+      <w:r>
+        <w:rPr>
+          <w:sz w:val="22"/>
+          <w:b/>
+        </w:rPr>
+        <w:t xml:space="preserve">Date observed:</w:t>
+      </w:r>
+      <w:r>
+        <w:rPr>
+          <w:sz w:val="22"/>
+        </w:rPr>
+        <w:t xml:space="preserve"> 17 September 2026, re-confirmed 24 September 2026</w:t>
+      </w:r>
+    </w:p>
+    <w:p>
+      <w:pPr>
+        <w:spacing w:before="280" w:after="120"/>
+        <w:rPr>
+          <w:sz w:val="28"/>
+          <w:b/>
+        </w:rPr>
+      </w:pPr>
+      <w:r>
+        <w:rPr>
+          <w:sz w:val="28"/>
+          <w:b/>
+        </w:rPr>
+        <w:t xml:space="preserve">Summary</w:t>
+      </w:r>
+    </w:p>
+    <w:p>
+      <w:pPr>
+        <w:spacing w:before="0" w:after="120"/>
+        <w:rPr>
+          <w:sz w:val="22"/>
+        </w:rPr>
+      </w:pPr>
+      <w:r>
+        <w:rPr>
+          <w:sz w:val="22"/>
+        </w:rPr>
+        <w:t xml:space="preserve">The From Date box can be cleared. Submit stays enabled. Pressing it runs the query anyway and the page fills with figures.</w:t>
+      </w:r>
+    </w:p>
+    <w:p>
+      <w:pPr>
+        <w:spacing w:before="0" w:after="120"/>
+        <w:rPr>
+          <w:sz w:val="22"/>
+        </w:rPr>
+      </w:pPr>
+      <w:r>
+        <w:rPr>
+          <w:sz w:val="22"/>
+        </w:rPr>
+        <w:t xml:space="preserve">Those figures cover some period, but the merchant is not told which. The box that would say so is empty.</w:t>
+      </w:r>
+    </w:p>
+    <w:p>
+      <w:pPr>
+        <w:spacing w:before="280" w:after="120"/>
+        <w:rPr>
+          <w:sz w:val="28"/>
+          <w:b/>
+        </w:rPr>
+      </w:pPr>
+      <w:r>
+        <w:rPr>
+          <w:sz w:val="28"/>
+          <w:b/>
+        </w:rPr>
+        <w:t xml:space="preserve">Steps to reproduce</w:t>
+      </w:r>
+    </w:p>
+    <w:p>
+      <w:pPr>
+        <w:spacing w:before="0" w:after="120"/>
+        <w:rPr>
+          <w:sz w:val="22"/>
+        </w:rPr>
+      </w:pPr>
+      <w:r>
+        <w:rPr>
+          <w:sz w:val="22"/>
+        </w:rPr>
+        <w:t xml:space="preserve">1. Sign in on any gateway and open </w:t>
+      </w:r>
+      <w:r>
+        <w:rPr>
+          <w:sz w:val="22"/>
+          <w:b/>
+        </w:rPr>
+        <w:t xml:space="preserve">Payment Analytics → Payment Stats</w:t>
+      </w:r>
+      <w:r>
+        <w:rPr>
+          <w:sz w:val="22"/>
+        </w:rPr>
+        <w:t xml:space="preserve">. 2. Clear the </w:t>
+      </w:r>
+      <w:r>
+        <w:rPr>
+          <w:sz w:val="22"/>
+          <w:b/>
+        </w:rPr>
+        <w:t xml:space="preserve">From Date</w:t>
+      </w:r>
+      <w:r>
+        <w:rPr>
+          <w:sz w:val="22"/>
+        </w:rPr>
+        <w:t xml:space="preserve"> box completely. 3. Look at the </w:t>
+      </w:r>
+      <w:r>
+        <w:rPr>
+          <w:sz w:val="22"/>
+          <w:b/>
+        </w:rPr>
+        <w:t xml:space="preserve">Submit</w:t>
+      </w:r>
+      <w:r>
+        <w:rPr>
+          <w:sz w:val="22"/>
+        </w:rPr>
+        <w:t xml:space="preserve"> button. 4. Press it.</w:t>
+      </w:r>
+    </w:p>
+    <w:p>
+      <w:pPr>
+        <w:spacing w:before="280" w:after="120"/>
+        <w:rPr>
+          <w:sz w:val="28"/>
+          <w:b/>
+        </w:rPr>
+      </w:pPr>
+      <w:r>
+        <w:rPr>
+          <w:sz w:val="28"/>
+          <w:b/>
+        </w:rPr>
+        <w:t xml:space="preserve">Expected result</w:t>
+      </w:r>
+    </w:p>
+    <w:p>
+      <w:pPr>
+        <w:spacing w:before="0" w:after="120"/>
+        <w:rPr>
+          <w:sz w:val="22"/>
+        </w:rPr>
+      </w:pPr>
+      <w:r>
+        <w:rPr>
+          <w:sz w:val="22"/>
+        </w:rPr>
+        <w:t xml:space="preserve">Submit is unavailable while a required date is missing. The merchant is stopped before they can ask a question the page cannot answer.</w:t>
+      </w:r>
+    </w:p>
+    <w:p>
+      <w:pPr>
+        <w:spacing w:before="0" w:after="120"/>
+        <w:rPr>
+          <w:sz w:val="22"/>
+        </w:rPr>
+      </w:pPr>
+      <w:r>
+        <w:rPr>
+          <w:sz w:val="22"/>
+        </w:rPr>
+        <w:t xml:space="preserve">If the button is to stay available, the page must say what range it used.</w:t>
+      </w:r>
+    </w:p>
+    <w:p>
+      <w:pPr>
+        <w:spacing w:before="280" w:after="120"/>
+        <w:rPr>
+          <w:sz w:val="28"/>
+          <w:b/>
+        </w:rPr>
+      </w:pPr>
+      <w:r>
+        <w:rPr>
+          <w:sz w:val="28"/>
+          <w:b/>
+        </w:rPr>
+        <w:t xml:space="preserve">Actual result</w:t>
+      </w:r>
+    </w:p>
+    <w:p>
+      <w:pPr>
+        <w:spacing w:before="0" w:after="120"/>
+        <w:rPr>
+          <w:sz w:val="22"/>
+        </w:rPr>
+      </w:pPr>
+      <w:r>
+        <w:rPr>
+          <w:sz w:val="22"/>
+        </w:rPr>
+        <w:t xml:space="preserve">Submit stays enabled, accepts the click, and the page returns a full set of figures with From Date still empty.</w:t>
+      </w:r>
+    </w:p>
+    <w:tbl>
+      <w:tblPr>
+        <w:tblW w:w="9360" w:type="dxa"/>
+        <w:tblBorders>
+          <w:top w:val="single" w:sz="4" w:space="0" w:color="BFBFBF"/>
+          <w:left w:val="single" w:sz="4" w:space="0" w:color="BFBFBF"/>
+          <w:bottom w:val="single" w:sz="4" w:space="0" w:color="BFBFBF"/>
+          <w:right w:val="single" w:sz="4" w:space="0" w:color="BFBFBF"/>
+          <w:insideH w:val="single" w:sz="4" w:space="0" w:color="BFBFBF"/>
+          <w:insideV w:val="single" w:sz="4" w:space="0" w:color="BFBFBF"/>
+        </w:tblBorders>
+      </w:tblPr>
+      <w:tr>
+        <w:tc>
+          <w:tcPr>
+            <w:tcW w:w="3120" w:type="dxa"/>
+            <w:shd w:val="clear" w:fill="F2F2F2"/>
+          </w:tcPr>
+          <w:p>
+            <w:pPr>
+              <w:spacing w:before="40" w:after="40"/>
+            </w:pPr>
+            <w:r>
+              <w:rPr>
+                <w:sz w:val="20"/>
+                <w:b/>
+              </w:rPr>
+              <w:t xml:space="preserve">State</w:t>
+            </w:r>
+          </w:p>
+        </w:tc>
+        <w:tc>
+          <w:tcPr>
+            <w:tcW w:w="3120" w:type="dxa"/>
+            <w:shd w:val="clear" w:fill="F2F2F2"/>
+          </w:tcPr>
+          <w:p>
+            <w:pPr>
+              <w:spacing w:before="40" w:after="40"/>
+            </w:pPr>
+            <w:r>
+              <w:rPr>
+                <w:sz w:val="20"/>
+                <w:b/>
+              </w:rPr>
+              <w:t xml:space="preserve">Submit</w:t>
+            </w:r>
+          </w:p>
+        </w:tc>
+        <w:tc>
+          <w:tcPr>
+            <w:tcW w:w="3120" w:type="dxa"/>
+            <w:shd w:val="clear" w:fill="F2F2F2"/>
+          </w:tcPr>
+          <w:p>
+            <w:pPr>
+              <w:spacing w:before="40" w:after="40"/>
+            </w:pPr>
+            <w:r>
+              <w:rPr>
+                <w:sz w:val="20"/>
+                <w:b/>
+              </w:rPr>
+              <w:t xml:space="preserve">disabled attribute</w:t>
+            </w:r>
+          </w:p>
+        </w:tc>
+      </w:tr>
+      <w:tr>
+        <w:tc>
+          <w:tcPr>
+            <w:tcW w:w="3120" w:type="dxa"/>
+          </w:tcPr>
+          <w:p>
+            <w:pPr>
+              <w:spacing w:before="40" w:after="40"/>
+            </w:pPr>
+            <w:r>
+              <w:rPr>
+                <w:sz w:val="20"/>
+              </w:rPr>
+              <w:t xml:space="preserve">On load, both dates filled</w:t>
+            </w:r>
+          </w:p>
+        </w:tc>
+        <w:tc>
+          <w:tcPr>
+            <w:tcW w:w="3120" w:type="dxa"/>
+          </w:tcPr>
+          <w:p>
+            <w:pPr>
+              <w:spacing w:before="40" w:after="40"/>
+            </w:pPr>
+            <w:r>
+              <w:rPr>
+                <w:sz w:val="20"/>
+              </w:rPr>
+              <w:t xml:space="preserve">enabled</w:t>
+            </w:r>
+          </w:p>
+        </w:tc>
+        <w:tc>
+          <w:tcPr>
+            <w:tcW w:w="3120" w:type="dxa"/>
+          </w:tcPr>
+          <w:p>
+            <w:pPr>
+              <w:spacing w:before="40" w:after="40"/>
+            </w:pPr>
+            <w:r>
+              <w:rPr>
+                <w:sz w:val="20"/>
+              </w:rPr>
+              <w:t xml:space="preserve">absent</w:t>
+            </w:r>
+          </w:p>
+        </w:tc>
+      </w:tr>
+      <w:tr>
+        <w:tc>
+          <w:tcPr>
+            <w:tcW w:w="3120" w:type="dxa"/>
+          </w:tcPr>
+          <w:p>
+            <w:pPr>
+              <w:spacing w:before="40" w:after="40"/>
+            </w:pPr>
+            <w:r>
+              <w:rPr>
+                <w:sz w:val="20"/>
+              </w:rPr>
+              <w:t xml:space="preserve">From Date cleared</w:t>
+            </w:r>
+          </w:p>
+        </w:tc>
+        <w:tc>
+          <w:tcPr>
+            <w:tcW w:w="3120" w:type="dxa"/>
+          </w:tcPr>
+          <w:p>
+            <w:pPr>
+              <w:spacing w:before="40" w:after="40"/>
+            </w:pPr>
+            <w:r>
+              <w:rPr>
+                <w:sz w:val="20"/>
+              </w:rPr>
+              <w:t xml:space="preserve">enabled</w:t>
+            </w:r>
+          </w:p>
+        </w:tc>
+        <w:tc>
+          <w:tcPr>
+            <w:tcW w:w="3120" w:type="dxa"/>
+          </w:tcPr>
+          <w:p>
+            <w:pPr>
+              <w:spacing w:before="40" w:after="40"/>
+            </w:pPr>
+            <w:r>
+              <w:rPr>
+                <w:sz w:val="20"/>
+              </w:rPr>
+              <w:t xml:space="preserve">absent</w:t>
+            </w:r>
+          </w:p>
+        </w:tc>
+      </w:tr>
+    </w:tbl>
+    <w:p>
+      <w:pPr>
+        <w:spacing w:after="120"/>
+      </w:pPr>
+    </w:p>
+    <w:p>
+      <w:pPr>
+        <w:spacing w:before="0" w:after="120"/>
+        <w:rPr>
+          <w:sz w:val="22"/>
+        </w:rPr>
+      </w:pPr>
+      <w:r>
+        <w:rPr>
+          <w:sz w:val="22"/>
+        </w:rPr>
+        <w:t xml:space="preserve">The button is not merely styled as though it were available. The </w:t>
+      </w:r>
+      <w:r>
+        <w:rPr>
+          <w:sz w:val="22"/>
+          <w:rFonts w:ascii="Consolas" w:hAnsi="Consolas"/>
+          <w:sz w:val="20"/>
+        </w:rPr>
+        <w:t xml:space="preserve">disabled</w:t>
+      </w:r>
+      <w:r>
+        <w:rPr>
+          <w:sz w:val="22"/>
+        </w:rPr>
+        <w:t xml:space="preserve"> attribute is absent, the click lands, and a query runs.</w:t>
+      </w:r>
+    </w:p>
+    <w:p>
+      <w:pPr>
+        <w:spacing w:before="280" w:after="120"/>
+        <w:rPr>
+          <w:sz w:val="28"/>
+          <w:b/>
+        </w:rPr>
+      </w:pPr>
+      <w:r>
+        <w:rPr>
+          <w:sz w:val="28"/>
+          <w:b/>
+        </w:rPr>
+        <w:t xml:space="preserve">Evidence</w:t>
+      </w:r>
+    </w:p>
+    <w:p>
+      <w:pPr>
+        <w:spacing w:before="240" w:after="100"/>
+        <w:rPr>
+          <w:sz w:val="24"/>
+          <w:b/>
+        </w:rPr>
+      </w:pPr>
+      <w:r>
+        <w:rPr>
+          <w:sz w:val="24"/>
+          <w:b/>
+        </w:rPr>
+        <w:t xml:space="preserve">Normal — both dates filled</w:t>
+      </w:r>
+    </w:p>
+    <w:p>
+      <w:pPr>
+        <w:spacing w:before="80" w:after="200"/>
+      </w:pPr>
+      <w:r>
+        <w:drawing>
+          <wp:inline distT="0" distB="0" distL="0" distR="0">
+            <wp:extent cx="5943600" cy="2823210"/>
+            <wp:docPr id="120" name="Picture 120"/>
+            <a:graphic xmlns:a="http://schemas.openxmlformats.org/drawingml/2006/main">
+              <a:graphicData uri="http://schemas.openxmlformats.org/drawingml/2006/picture">
+                <pic:pic xmlns:pic="http://schemas.openxmlformats.org/drawingml/2006/picture">
+                  <pic:nvPicPr>
+                    <pic:cNvPr id="120" name="Picture"/>
+                    <pic:cNvPicPr/>
+                  </pic:nvPicPr>
+                  <pic:blipFill>
+                    <a:blip r:embed="rId120"/>
+                    <a:stretch>
+                      <a:fillRect/>
+                    </a:stretch>
+                  </pic:blipFill>
+                  <pic:spPr>
+                    <a:xfrm>
+                      <a:off x="0" y="0"/>
+                      <a:ext cx="5943600" cy="2823210"/>
+                    </a:xfrm>
+                    <a:prstGeom prst="rect">
+                      <a:avLst/>
+                    </a:prstGeom>
+                  </pic:spPr>
+                </pic:pic>
+              </a:graphicData>
+            </a:graphic>
+          </wp:inline>
+        </w:drawing>
+      </w:r>
+    </w:p>
+    <w:p>
+      <w:pPr>
+        <w:spacing w:before="0" w:after="120"/>
+        <w:rPr>
+          <w:sz w:val="22"/>
+        </w:rPr>
+      </w:pPr>
+      <w:r>
+        <w:rPr>
+          <w:sz w:val="22"/>
+        </w:rPr>
+        <w:t xml:space="preserve">Submit is enabled, which is correct in this state.</w:t>
+      </w:r>
+    </w:p>
+    <w:p>
+      <w:pPr>
+        <w:spacing w:before="240" w:after="100"/>
+        <w:rPr>
+          <w:sz w:val="24"/>
+          <w:b/>
+        </w:rPr>
+      </w:pPr>
+      <w:r>
+        <w:rPr>
+          <w:sz w:val="24"/>
+          <w:b/>
+        </w:rPr>
+        <w:t xml:space="preserve">From Date cleared — Submit unchanged</w:t>
+      </w:r>
+    </w:p>
+    <w:p>
+      <w:pPr>
+        <w:spacing w:before="80" w:after="200"/>
+      </w:pPr>
+      <w:r>
+        <w:drawing>
+          <wp:inline distT="0" distB="0" distL="0" distR="0">
+            <wp:extent cx="5943600" cy="2823210"/>
+            <wp:docPr id="121" name="Picture 121"/>
+            <a:graphic xmlns:a="http://schemas.openxmlformats.org/drawingml/2006/main">
+              <a:graphicData uri="http://schemas.openxmlformats.org/drawingml/2006/picture">
+                <pic:pic xmlns:pic="http://schemas.openxmlformats.org/drawingml/2006/picture">
+                  <pic:nvPicPr>
+                    <pic:cNvPr id="121" name="Picture"/>
+                    <pic:cNvPicPr/>
+                  </pic:nvPicPr>
+                  <pic:blipFill>
+                    <a:blip r:embed="rId121"/>
+                    <a:stretch>
+                      <a:fillRect/>
+                    </a:stretch>
+                  </pic:blipFill>
+                  <pic:spPr>
+                    <a:xfrm>
+                      <a:off x="0" y="0"/>
+                      <a:ext cx="5943600" cy="2823210"/>
+                    </a:xfrm>
+                    <a:prstGeom prst="rect">
+                      <a:avLst/>
+                    </a:prstGeom>
+                  </pic:spPr>
+                </pic:pic>
+              </a:graphicData>
+            </a:graphic>
+          </wp:inline>
+        </w:drawing>
+      </w:r>
+    </w:p>
+    <w:p>
+      <w:pPr>
+        <w:spacing w:before="0" w:after="120"/>
+        <w:rPr>
+          <w:sz w:val="22"/>
+        </w:rPr>
+      </w:pPr>
+      <w:r>
+        <w:rPr>
+          <w:sz w:val="22"/>
+        </w:rPr>
+        <w:t xml:space="preserve">The From Date box is empty. Submit looks and behaves exactly as it did a moment ago.</w:t>
+      </w:r>
+    </w:p>
+    <w:p>
+      <w:pPr>
+        <w:spacing w:before="240" w:after="100"/>
+        <w:rPr>
+          <w:sz w:val="24"/>
+          <w:b/>
+        </w:rPr>
+      </w:pPr>
+      <w:r>
+        <w:rPr>
+          <w:sz w:val="24"/>
+          <w:b/>
+        </w:rPr>
+        <w:t xml:space="preserve">After pressing Submit</w:t>
+      </w:r>
+    </w:p>
+    <w:p>
+      <w:pPr>
+        <w:spacing w:before="80" w:after="200"/>
+      </w:pPr>
+      <w:r>
+        <w:drawing>
+          <wp:inline distT="0" distB="0" distL="0" distR="0">
+            <wp:extent cx="5943600" cy="2823210"/>
+            <wp:docPr id="122" name="Picture 122"/>
+            <a:graphic xmlns:a="http://schemas.openxmlformats.org/drawingml/2006/main">
+              <a:graphicData uri="http://schemas.openxmlformats.org/drawingml/2006/picture">
+                <pic:pic xmlns:pic="http://schemas.openxmlformats.org/drawingml/2006/picture">
+                  <pic:nvPicPr>
+                    <pic:cNvPr id="122" name="Picture"/>
+                    <pic:cNvPicPr/>
+                  </pic:nvPicPr>
+                  <pic:blipFill>
+                    <a:blip r:embed="rId122"/>
+                    <a:stretch>
+                      <a:fillRect/>
+                    </a:stretch>
+                  </pic:blipFill>
+                  <pic:spPr>
+                    <a:xfrm>
+                      <a:off x="0" y="0"/>
+                      <a:ext cx="5943600" cy="2823210"/>
+                    </a:xfrm>
+                    <a:prstGeom prst="rect">
+                      <a:avLst/>
+                    </a:prstGeom>
+                  </pic:spPr>
+                </pic:pic>
+              </a:graphicData>
+            </a:graphic>
+          </wp:inline>
+        </w:drawing>
+      </w:r>
+    </w:p>
+    <w:p>
+      <w:pPr>
+        <w:spacing w:before="0" w:after="120"/>
+        <w:rPr>
+          <w:sz w:val="22"/>
+        </w:rPr>
+      </w:pPr>
+      <w:r>
+        <w:rPr>
+          <w:sz w:val="22"/>
+        </w:rPr>
+        <w:t xml:space="preserve">The query ran. Card Payments reads </w:t>
+      </w:r>
+      <w:r>
+        <w:rPr>
+          <w:sz w:val="22"/>
+          <w:rFonts w:ascii="Consolas" w:hAnsi="Consolas"/>
+          <w:sz w:val="20"/>
+        </w:rPr>
+        <w:t xml:space="preserve">$44,903.20</w:t>
+      </w:r>
+      <w:r>
+        <w:rPr>
+          <w:sz w:val="22"/>
+        </w:rPr>
+        <w:t xml:space="preserve"> across 708 payments.</w:t>
+      </w:r>
+    </w:p>
+    <w:p>
+      <w:pPr>
+        <w:spacing w:before="0" w:after="120"/>
+        <w:rPr>
+          <w:sz w:val="22"/>
+        </w:rPr>
+      </w:pPr>
+      <w:r>
+        <w:rPr>
+          <w:sz w:val="22"/>
+        </w:rPr>
+        <w:t xml:space="preserve">The From Date box, boxed in red, is still empty. Nothing anywhere on the page says what period those figures cover.</w:t>
+      </w:r>
+    </w:p>
+    <w:p>
+      <w:pPr>
+        <w:spacing w:before="280" w:after="120"/>
+        <w:rPr>
+          <w:sz w:val="28"/>
+          <w:b/>
+        </w:rPr>
+      </w:pPr>
+      <w:r>
+        <w:rPr>
+          <w:sz w:val="28"/>
+          <w:b/>
+        </w:rPr>
+        <w:t xml:space="preserve">What pins the cause</w:t>
+      </w:r>
+    </w:p>
+    <w:p>
+      <w:pPr>
+        <w:spacing w:before="0" w:after="120"/>
+        <w:rPr>
+          <w:sz w:val="22"/>
+        </w:rPr>
+      </w:pPr>
+      <w:r>
+        <w:rPr>
+          <w:sz w:val="22"/>
+        </w:rPr>
+        <w:t xml:space="preserve">This is not missing logic. The logic exists and is simply never applied.</w:t>
+      </w:r>
+    </w:p>
+    <w:p>
+      <w:pPr>
+        <w:spacing w:before="0" w:after="120"/>
+        <w:rPr>
+          <w:sz w:val="22"/>
+        </w:rPr>
+      </w:pPr>
+      <w:r>
+        <w:rPr>
+          <w:sz w:val="22"/>
+          <w:rFonts w:ascii="Consolas" w:hAnsi="Consolas"/>
+          <w:sz w:val="20"/>
+        </w:rPr>
+        <w:t xml:space="preserve">isSubmitButtonDisabled</w:t>
+      </w:r>
+      <w:r>
+        <w:rPr>
+          <w:sz w:val="22"/>
+        </w:rPr>
+        <w:t xml:space="preserve"> is declared at </w:t>
+      </w:r>
+      <w:r>
+        <w:rPr>
+          <w:sz w:val="22"/>
+          <w:rFonts w:ascii="Consolas" w:hAnsi="Consolas"/>
+          <w:sz w:val="20"/>
+        </w:rPr>
+        <w:t xml:space="preserve">index.js:86</w:t>
+      </w:r>
+      <w:r>
+        <w:rPr>
+          <w:sz w:val="22"/>
+        </w:rPr>
+        <w:t xml:space="preserve"> and kept up to date in five separate places. The line that would use it is commented out:</w:t>
+      </w:r>
+    </w:p>
+    <w:p>
+      <w:pPr>
+        <w:spacing w:before="0" w:after="120"/>
+        <w:rPr>
+          <w:sz w:val="22"/>
+        </w:rPr>
+      </w:pPr>
+      <w:r>
+        <w:rPr>
+          <w:sz w:val="22"/>
+          <w:rFonts w:ascii="Consolas" w:hAnsi="Consolas"/>
+          <w:sz w:val="20"/>
+        </w:rPr>
+        <w:t xml:space="preserve"/>
+      </w:r>
+      <w:r>
+        <w:rPr>
+          <w:sz w:val="22"/>
+          <w:rFonts w:ascii="Consolas" w:hAnsi="Consolas"/>
+          <w:sz w:val="20"/>
+        </w:rPr>
+        <w:t xml:space="preserve"> // disabled={isSubmitButtonDisabled} </w:t>
+      </w:r>
+      <w:r>
+        <w:rPr>
+          <w:sz w:val="22"/>
+          <w:rFonts w:ascii="Consolas" w:hAnsi="Consolas"/>
+          <w:sz w:val="20"/>
+        </w:rPr>
+        <w:t xml:space="preserve"/>
+      </w:r>
+    </w:p>
+    <w:p>
+      <w:pPr>
+        <w:spacing w:before="0" w:after="120"/>
+        <w:rPr>
+          <w:sz w:val="22"/>
+        </w:rPr>
+      </w:pPr>
+      <w:r>
+        <w:rPr>
+          <w:sz w:val="22"/>
+        </w:rPr>
+        <w:t xml:space="preserve">at </w:t>
+      </w:r>
+      <w:r>
+        <w:rPr>
+          <w:sz w:val="22"/>
+          <w:rFonts w:ascii="Consolas" w:hAnsi="Consolas"/>
+          <w:sz w:val="20"/>
+        </w:rPr>
+        <w:t xml:space="preserve">index.js:606</w:t>
+      </w:r>
+      <w:r>
+        <w:rPr>
+          <w:sz w:val="22"/>
+        </w:rPr>
+        <w:t xml:space="preserve">. Removing the comment markers is the whole fix.</w:t>
+      </w:r>
+    </w:p>
+    <w:p>
+      <w:pPr>
+        <w:spacing w:before="280" w:after="120"/>
+        <w:rPr>
+          <w:sz w:val="28"/>
+          <w:b/>
+        </w:rPr>
+      </w:pPr>
+      <w:r>
+        <w:rPr>
+          <w:sz w:val="28"/>
+          <w:b/>
+        </w:rPr>
+        <w:t xml:space="preserve">A state that cannot be reached, and is not part of this</w:t>
+      </w:r>
+    </w:p>
+    <w:p>
+      <w:pPr>
+        <w:spacing w:before="0" w:after="120"/>
+        <w:rPr>
+          <w:sz w:val="22"/>
+        </w:rPr>
+      </w:pPr>
+      <w:r>
+        <w:rPr>
+          <w:sz w:val="22"/>
+        </w:rPr>
+        <w:t xml:space="preserve">An inverted range — From Date later than To Date — was also tried, but only by typing a date past the picker's minimum. The To Date calendar greys out every day before the current From Date, so a merchant cannot produce that state through the UI. It is not part of this report.</w:t>
+      </w:r>
+    </w:p>
+    <w:p>
+      <w:pPr>
+        <w:spacing w:before="280" w:after="120"/>
+        <w:rPr>
+          <w:sz w:val="28"/>
+          <w:b/>
+        </w:rPr>
+      </w:pPr>
+      <w:r>
+        <w:rPr>
+          <w:sz w:val="28"/>
+          <w:b/>
+        </w:rPr>
+        <w:t xml:space="preserve">Impact</w:t>
+      </w:r>
+    </w:p>
+    <w:p>
+      <w:pPr>
+        <w:spacing w:before="0" w:after="120"/>
+        <w:rPr>
+          <w:sz w:val="22"/>
+        </w:rPr>
+      </w:pPr>
+      <w:r>
+        <w:rPr>
+          <w:sz w:val="22"/>
+        </w:rPr>
+        <w:t xml:space="preserve">Low likelihood, and it does not corrupt anything. A merchant has to clear the box deliberately, and most will simply pick a new date instead.</w:t>
+      </w:r>
+    </w:p>
+    <w:p>
+      <w:pPr>
+        <w:spacing w:before="0" w:after="120"/>
+        <w:rPr>
+          <w:sz w:val="22"/>
+        </w:rPr>
+      </w:pPr>
+      <w:r>
+        <w:rPr>
+          <w:sz w:val="22"/>
+        </w:rPr>
+        <w:t xml:space="preserve">The reason it is worth fixing is the second half rather than the first. An enabled button that does nothing is a small annoyance. An enabled button that returns </w:t>
+      </w:r>
+      <w:r>
+        <w:rPr>
+          <w:sz w:val="22"/>
+          <w:b/>
+        </w:rPr>
+        <w:t xml:space="preserve">figures for an unstated period</w:t>
+      </w:r>
+      <w:r>
+        <w:rPr>
+          <w:sz w:val="22"/>
+        </w:rPr>
+        <w:t xml:space="preserve"> is different — the merchant reads those numbers as an answer, with no way to know what was asked.</w:t>
+      </w:r>
+    </w:p>
+    <w:p>
+      <w:pPr>
+        <w:spacing w:before="0" w:after="120"/>
+        <w:rPr>
+          <w:sz w:val="22"/>
+        </w:rPr>
+      </w:pPr>
+      <w:r>
+        <w:rPr>
+          <w:sz w:val="22"/>
+          <w:b/>
+        </w:rPr>
+        <w:t xml:space="preserve">Workaround:</w:t>
+      </w:r>
+      <w:r>
+        <w:rPr>
+          <w:sz w:val="22"/>
+        </w:rPr>
+        <w:t xml:space="preserve"> set a From Date. The figures are correct whenever both dates are filled.</w:t>
+      </w:r>
+    </w:p>
+    <w:p>
+      <w:pPr>
+        <w:spacing w:before="280" w:after="120"/>
+        <w:rPr>
+          <w:sz w:val="28"/>
+          <w:b/>
+        </w:rPr>
+      </w:pPr>
+      <w:r>
+        <w:rPr>
+          <w:sz w:val="28"/>
+          <w:b/>
+        </w:rPr>
+        <w:t xml:space="preserve">Notes for the developer</w:t>
+      </w:r>
+    </w:p>
+    <w:p>
+      <w:pPr>
+        <w:spacing w:before="0" w:after="80"/>
+        <w:ind w:left="360"/>
+        <w:rPr>
+          <w:sz w:val="22"/>
+        </w:rPr>
+      </w:pPr>
+      <w:r>
+        <w:rPr>
+          <w:sz w:val="22"/>
+        </w:rPr>
+        <w:t xml:space="preserve">• Uncomment </w:t>
+      </w:r>
+      <w:r>
+        <w:rPr>
+          <w:sz w:val="22"/>
+          <w:rFonts w:ascii="Consolas" w:hAnsi="Consolas"/>
+          <w:sz w:val="20"/>
+        </w:rPr>
+        <w:t xml:space="preserve">disabled={isSubmitButtonDisabled}</w:t>
+      </w:r>
+      <w:r>
+        <w:rPr>
+          <w:sz w:val="22"/>
+        </w:rPr>
+        <w:t xml:space="preserve"> at </w:t>
+      </w:r>
+      <w:r>
+        <w:rPr>
+          <w:sz w:val="22"/>
+          <w:rFonts w:ascii="Consolas" w:hAnsi="Consolas"/>
+          <w:sz w:val="20"/>
+        </w:rPr>
+        <w:t xml:space="preserve">index.js:606</w:t>
+      </w:r>
+      <w:r>
+        <w:rPr>
+          <w:sz w:val="22"/>
+        </w:rPr>
+        <w:t xml:space="preserve">. The state it depends on is already maintained.</w:t>
+      </w:r>
+    </w:p>
+    <w:p>
+      <w:pPr>
+        <w:spacing w:before="0" w:after="80"/>
+        <w:ind w:left="360"/>
+        <w:rPr>
+          <w:sz w:val="22"/>
+        </w:rPr>
+      </w:pPr>
+      <w:r>
+        <w:rPr>
+          <w:sz w:val="22"/>
+        </w:rPr>
+        <w:t xml:space="preserve">• Worth a look at why it was commented out. If it was disabling the button at the wrong moments, restoring it as-is will bring that behaviour back.</w:t>
+      </w:r>
+    </w:p>
+    <w:p>
+      <w:pPr>
+        <w:spacing w:before="0" w:after="80"/>
+        <w:ind w:left="360"/>
+        <w:rPr>
+          <w:sz w:val="22"/>
+        </w:rPr>
+      </w:pPr>
+      <w:r>
+        <w:rPr>
+          <w:sz w:val="22"/>
+        </w:rPr>
+        <w:t xml:space="preserve">• Separately, decide what the page should send when a date is missing. It currently returns a result rather than refusing, which is what turns a disabled-button bug into figures a merchant can misread.</w:t>
+      </w:r>
+    </w:p>
+    <w:p>
+      <w:pPr>
+        <w:spacing w:before="280" w:after="120"/>
+        <w:rPr>
+          <w:sz w:val="28"/>
+          <w:b/>
+        </w:rPr>
+      </w:pPr>
+      <w:r>
+        <w:rPr>
+          <w:sz w:val="28"/>
+          <w:b/>
+        </w:rPr>
+        <w:t xml:space="preserve">How to tell it is fixed</w:t>
+      </w:r>
+    </w:p>
+    <w:p>
+      <w:pPr>
+        <w:spacing w:before="0" w:after="120"/>
+        <w:rPr>
+          <w:sz w:val="22"/>
+        </w:rPr>
+      </w:pPr>
+      <w:r>
+        <w:rPr>
+          <w:sz w:val="22"/>
+        </w:rPr>
+        <w:t xml:space="preserve">1. Open Payment Stats and clear the From Date box. 2. Submit must be visibly unavailable and must not respond to a click. 3. Refill the date. Submit must become available again. 4. Repeat for the To Date box.</w:t>
+      </w:r>
+    </w:p>
     <w:sectPr>
       <w:pgSz w:w="12240" w:h="15840"/>
       <w:pgMar w:top="1440" w:right="1440" w:bottom="1440" w:left="1440"/>

</xml_diff>

<commit_message>
Add PS-SUB-07, the last undocumented Payment Stats defect
Every stats request carries the same identifier, so no single call can be picked
out of the logs and followed. Confirmed on two merchants a week apart, and on
two requests within one session that differed in every other respect.

The value itself explains the mistake. Read as a millisecond timestamp,
1647602068707 is 18 March 2022 11:14:28 UTC - a Date.now() result from one
development session that was pasted in as a constant instead of being left as a
call. The intent was right; only the call was replaced by its result.

The section opens by saying there is nothing to see on screen and no screenshots
for that reason, so nobody goes looking for a visual symptom that does not
exist. Impact is written as a diagnostics cost rather than a merchant-facing
one, including that it makes the other defects here harder to trace.
</commit_message>
<xml_diff>
--- a/PaymentStats_Bugs.docx
+++ b/PaymentStats_Bugs.docx
@@ -967,6 +967,88 @@
                 <w:sz w:val="20"/>
               </w:rPr>
               <w:t xml:space="preserve">Submit runs with no start date and returns figures for an unknown period</w:t>
+            </w:r>
+          </w:p>
+        </w:tc>
+        <w:tc>
+          <w:tcPr>
+            <w:tcW w:w="1872" w:type="dxa"/>
+          </w:tcPr>
+          <w:p>
+            <w:pPr>
+              <w:spacing w:before="40" w:after="40"/>
+            </w:pPr>
+            <w:r>
+              <w:rPr>
+                <w:sz w:val="20"/>
+              </w:rPr>
+              <w:t xml:space="preserve">Medium</w:t>
+            </w:r>
+          </w:p>
+        </w:tc>
+        <w:tc>
+          <w:tcPr>
+            <w:tcW w:w="1872" w:type="dxa"/>
+          </w:tcPr>
+          <w:p>
+            <w:pPr>
+              <w:spacing w:before="40" w:after="40"/>
+            </w:pPr>
+            <w:r>
+              <w:rPr>
+                <w:sz w:val="20"/>
+              </w:rPr>
+              <w:t xml:space="preserve">all gateways</w:t>
+            </w:r>
+          </w:p>
+        </w:tc>
+      </w:tr>
+      <w:tr>
+        <w:tc>
+          <w:tcPr>
+            <w:tcW w:w="1872" w:type="dxa"/>
+          </w:tcPr>
+          <w:p>
+            <w:pPr>
+              <w:spacing w:before="40" w:after="40"/>
+            </w:pPr>
+            <w:r>
+              <w:rPr>
+                <w:sz w:val="20"/>
+              </w:rPr>
+              <w:t xml:space="preserve">11</w:t>
+            </w:r>
+          </w:p>
+        </w:tc>
+        <w:tc>
+          <w:tcPr>
+            <w:tcW w:w="1872" w:type="dxa"/>
+          </w:tcPr>
+          <w:p>
+            <w:pPr>
+              <w:spacing w:before="40" w:after="40"/>
+            </w:pPr>
+            <w:r>
+              <w:rPr>
+                <w:sz w:val="20"/>
+              </w:rPr>
+              <w:t xml:space="preserve">PS-SUB-07</w:t>
+            </w:r>
+          </w:p>
+        </w:tc>
+        <w:tc>
+          <w:tcPr>
+            <w:tcW w:w="1872" w:type="dxa"/>
+          </w:tcPr>
+          <w:p>
+            <w:pPr>
+              <w:spacing w:before="40" w:after="40"/>
+            </w:pPr>
+            <w:r>
+              <w:rPr>
+                <w:sz w:val="20"/>
+              </w:rPr>
+              <w:t xml:space="preserve">Every request carries the same identifier, so calls cannot be told apart</w:t>
             </w:r>
           </w:p>
         </w:tc>
@@ -11791,6 +11873,777 @@
         <w:t xml:space="preserve">1. Open Payment Stats and clear the From Date box. 2. Submit must be visibly unavailable and must not respond to a click. 3. Refill the date. Submit must become available again. 4. Repeat for the To Date box.</w:t>
       </w:r>
     </w:p>
+    <w:p>
+      <w:pPr>
+        <w:spacing w:before="0" w:after="200"/>
+        <w:rPr>
+          <w:sz w:val="36"/>
+          <w:b/>
+        </w:rPr>
+      </w:pPr>
+      <w:r>
+        <w:rPr>
+          <w:sz w:val="36"/>
+          <w:b/>
+        </w:rPr>
+        <w:t xml:space="preserve">11. PS-SUB-07 — every request carries the same identifier, so calls cannot be told apart</w:t>
+      </w:r>
+    </w:p>
+    <w:p>
+      <w:pPr>
+        <w:spacing w:before="0" w:after="120"/>
+        <w:rPr>
+          <w:sz w:val="22"/>
+        </w:rPr>
+      </w:pPr>
+      <w:r>
+        <w:rPr>
+          <w:sz w:val="22"/>
+          <w:b/>
+        </w:rPr>
+        <w:t xml:space="preserve">Test case:</w:t>
+      </w:r>
+      <w:r>
+        <w:rPr>
+          <w:sz w:val="22"/>
+        </w:rPr>
+        <w:t xml:space="preserve"> PS-SUB-07 </w:t>
+      </w:r>
+      <w:r>
+        <w:rPr>
+          <w:sz w:val="22"/>
+          <w:b/>
+        </w:rPr>
+        <w:t xml:space="preserve">Priority:</w:t>
+      </w:r>
+      <w:r>
+        <w:rPr>
+          <w:sz w:val="22"/>
+        </w:rPr>
+        <w:t xml:space="preserve"> Medium </w:t>
+      </w:r>
+      <w:r>
+        <w:rPr>
+          <w:sz w:val="22"/>
+          <w:b/>
+        </w:rPr>
+        <w:t xml:space="preserve">Gateways:</w:t>
+      </w:r>
+      <w:r>
+        <w:rPr>
+          <w:sz w:val="22"/>
+        </w:rPr>
+        <w:t xml:space="preserve"> all — measured on IPG and BillPay </w:t>
+      </w:r>
+      <w:r>
+        <w:rPr>
+          <w:sz w:val="22"/>
+          <w:b/>
+        </w:rPr>
+        <w:t xml:space="preserve">Date observed:</w:t>
+      </w:r>
+      <w:r>
+        <w:rPr>
+          <w:sz w:val="22"/>
+        </w:rPr>
+        <w:t xml:space="preserve"> 17 September 2026, re-confirmed 24 September 2026</w:t>
+      </w:r>
+    </w:p>
+    <w:p>
+      <w:pPr>
+        <w:spacing w:before="0" w:after="120"/>
+        <w:rPr>
+          <w:sz w:val="22"/>
+        </w:rPr>
+      </w:pPr>
+      <w:r>
+        <w:rPr>
+          <w:sz w:val="22"/>
+        </w:rPr>
+        <w:t xml:space="preserve">&gt; </w:t>
+      </w:r>
+      <w:r>
+        <w:rPr>
+          <w:sz w:val="22"/>
+          <w:b/>
+        </w:rPr>
+        <w:t xml:space="preserve">There is nothing to see on screen for this one.</w:t>
+      </w:r>
+      <w:r>
+        <w:rPr>
+          <w:sz w:val="22"/>
+        </w:rPr>
+        <w:t xml:space="preserve"> The identifier has no surface anywhere &gt; in the page — nothing displays it and no control changes it. This section is written for &gt; whoever maintains the code and whoever reads the logs, not for a tester with a browser. &gt; That is also why it carries no screenshots: there is nothing a screenshot could show.</w:t>
+      </w:r>
+    </w:p>
+    <w:p>
+      <w:pPr>
+        <w:spacing w:before="280" w:after="120"/>
+        <w:rPr>
+          <w:sz w:val="28"/>
+          <w:b/>
+        </w:rPr>
+      </w:pPr>
+      <w:r>
+        <w:rPr>
+          <w:sz w:val="28"/>
+          <w:b/>
+        </w:rPr>
+        <w:t xml:space="preserve">Summary</w:t>
+      </w:r>
+    </w:p>
+    <w:p>
+      <w:pPr>
+        <w:spacing w:before="0" w:after="120"/>
+        <w:rPr>
+          <w:sz w:val="22"/>
+        </w:rPr>
+      </w:pPr>
+      <w:r>
+        <w:rPr>
+          <w:sz w:val="22"/>
+        </w:rPr>
+        <w:t xml:space="preserve">Every stats request the page makes carries an identifier meant to tell one call from another. It is the same number every time.</w:t>
+      </w:r>
+    </w:p>
+    <w:p>
+      <w:pPr>
+        <w:spacing w:before="0" w:after="120"/>
+        <w:rPr>
+          <w:sz w:val="22"/>
+        </w:rPr>
+      </w:pPr>
+      <w:r>
+        <w:rPr>
+          <w:sz w:val="22"/>
+        </w:rPr>
+        <w:t xml:space="preserve">It does not change between page loads, between date ranges, between merchants or between gateways. It is a constant written into the source.</w:t>
+      </w:r>
+    </w:p>
+    <w:p>
+      <w:pPr>
+        <w:spacing w:before="0" w:after="120"/>
+        <w:rPr>
+          <w:sz w:val="22"/>
+        </w:rPr>
+      </w:pPr>
+      <w:r>
+        <w:rPr>
+          <w:sz w:val="22"/>
+        </w:rPr>
+        <w:t xml:space="preserve">The consequence is in the logs rather than on the page. Two requests cannot be told apart, so a single call cannot be followed through.</w:t>
+      </w:r>
+    </w:p>
+    <w:p>
+      <w:pPr>
+        <w:spacing w:before="280" w:after="120"/>
+        <w:rPr>
+          <w:sz w:val="28"/>
+          <w:b/>
+        </w:rPr>
+      </w:pPr>
+      <w:r>
+        <w:rPr>
+          <w:sz w:val="28"/>
+          <w:b/>
+        </w:rPr>
+        <w:t xml:space="preserve">What was measured</w:t>
+      </w:r>
+    </w:p>
+    <w:p>
+      <w:pPr>
+        <w:spacing w:before="0" w:after="120"/>
+        <w:rPr>
+          <w:sz w:val="22"/>
+        </w:rPr>
+      </w:pPr>
+      <w:r>
+        <w:rPr>
+          <w:sz w:val="22"/>
+        </w:rPr>
+        <w:t xml:space="preserve">The same value appeared in every request, across two merchants a week apart:</w:t>
+      </w:r>
+    </w:p>
+    <w:tbl>
+      <w:tblPr>
+        <w:tblW w:w="9360" w:type="dxa"/>
+        <w:tblBorders>
+          <w:top w:val="single" w:sz="4" w:space="0" w:color="BFBFBF"/>
+          <w:left w:val="single" w:sz="4" w:space="0" w:color="BFBFBF"/>
+          <w:bottom w:val="single" w:sz="4" w:space="0" w:color="BFBFBF"/>
+          <w:right w:val="single" w:sz="4" w:space="0" w:color="BFBFBF"/>
+          <w:insideH w:val="single" w:sz="4" w:space="0" w:color="BFBFBF"/>
+          <w:insideV w:val="single" w:sz="4" w:space="0" w:color="BFBFBF"/>
+        </w:tblBorders>
+      </w:tblPr>
+      <w:tr>
+        <w:tc>
+          <w:tcPr>
+            <w:tcW w:w="3120" w:type="dxa"/>
+            <w:shd w:val="clear" w:fill="F2F2F2"/>
+          </w:tcPr>
+          <w:p>
+            <w:pPr>
+              <w:spacing w:before="40" w:after="40"/>
+            </w:pPr>
+            <w:r>
+              <w:rPr>
+                <w:sz w:val="20"/>
+                <w:b/>
+              </w:rPr>
+              <w:t xml:space="preserve">When</w:t>
+            </w:r>
+          </w:p>
+        </w:tc>
+        <w:tc>
+          <w:tcPr>
+            <w:tcW w:w="3120" w:type="dxa"/>
+            <w:shd w:val="clear" w:fill="F2F2F2"/>
+          </w:tcPr>
+          <w:p>
+            <w:pPr>
+              <w:spacing w:before="40" w:after="40"/>
+            </w:pPr>
+            <w:r>
+              <w:rPr>
+                <w:sz w:val="20"/>
+                <w:b/>
+              </w:rPr>
+              <w:t xml:space="preserve">Gateway</w:t>
+            </w:r>
+          </w:p>
+        </w:tc>
+        <w:tc>
+          <w:tcPr>
+            <w:tcW w:w="3120" w:type="dxa"/>
+            <w:shd w:val="clear" w:fill="F2F2F2"/>
+          </w:tcPr>
+          <w:p>
+            <w:pPr>
+              <w:spacing w:before="40" w:after="40"/>
+            </w:pPr>
+            <w:r>
+              <w:rPr>
+                <w:sz w:val="20"/>
+                <w:b/>
+              </w:rPr>
+              <w:t xml:space="preserve">Value sent</w:t>
+            </w:r>
+          </w:p>
+        </w:tc>
+      </w:tr>
+      <w:tr>
+        <w:tc>
+          <w:tcPr>
+            <w:tcW w:w="3120" w:type="dxa"/>
+          </w:tcPr>
+          <w:p>
+            <w:pPr>
+              <w:spacing w:before="40" w:after="40"/>
+            </w:pPr>
+            <w:r>
+              <w:rPr>
+                <w:sz w:val="20"/>
+              </w:rPr>
+              <w:t xml:space="preserve">17 September 2026</w:t>
+            </w:r>
+          </w:p>
+        </w:tc>
+        <w:tc>
+          <w:tcPr>
+            <w:tcW w:w="3120" w:type="dxa"/>
+          </w:tcPr>
+          <w:p>
+            <w:pPr>
+              <w:spacing w:before="40" w:after="40"/>
+            </w:pPr>
+            <w:r>
+              <w:rPr>
+                <w:sz w:val="20"/>
+              </w:rPr>
+              <w:t xml:space="preserve">IPG</w:t>
+            </w:r>
+          </w:p>
+        </w:tc>
+        <w:tc>
+          <w:tcPr>
+            <w:tcW w:w="3120" w:type="dxa"/>
+          </w:tcPr>
+          <w:p>
+            <w:pPr>
+              <w:spacing w:before="40" w:after="40"/>
+            </w:pPr>
+            <w:r>
+              <w:rPr>
+                <w:sz w:val="20"/>
+              </w:rPr>
+              <w:t xml:space="preserve">1647602068707</w:t>
+            </w:r>
+          </w:p>
+        </w:tc>
+      </w:tr>
+      <w:tr>
+        <w:tc>
+          <w:tcPr>
+            <w:tcW w:w="3120" w:type="dxa"/>
+          </w:tcPr>
+          <w:p>
+            <w:pPr>
+              <w:spacing w:before="40" w:after="40"/>
+            </w:pPr>
+            <w:r>
+              <w:rPr>
+                <w:sz w:val="20"/>
+              </w:rPr>
+              <w:t xml:space="preserve">24 September 2026</w:t>
+            </w:r>
+          </w:p>
+        </w:tc>
+        <w:tc>
+          <w:tcPr>
+            <w:tcW w:w="3120" w:type="dxa"/>
+          </w:tcPr>
+          <w:p>
+            <w:pPr>
+              <w:spacing w:before="40" w:after="40"/>
+            </w:pPr>
+            <w:r>
+              <w:rPr>
+                <w:sz w:val="20"/>
+              </w:rPr>
+              <w:t xml:space="preserve">BillPay</w:t>
+            </w:r>
+          </w:p>
+        </w:tc>
+        <w:tc>
+          <w:tcPr>
+            <w:tcW w:w="3120" w:type="dxa"/>
+          </w:tcPr>
+          <w:p>
+            <w:pPr>
+              <w:spacing w:before="40" w:after="40"/>
+            </w:pPr>
+            <w:r>
+              <w:rPr>
+                <w:sz w:val="20"/>
+              </w:rPr>
+              <w:t xml:space="preserve">1647602068707</w:t>
+            </w:r>
+          </w:p>
+        </w:tc>
+      </w:tr>
+    </w:tbl>
+    <w:p>
+      <w:pPr>
+        <w:spacing w:after="120"/>
+      </w:pPr>
+    </w:p>
+    <w:p>
+      <w:pPr>
+        <w:spacing w:before="0" w:after="120"/>
+        <w:rPr>
+          <w:sz w:val="22"/>
+        </w:rPr>
+      </w:pPr>
+      <w:r>
+        <w:rPr>
+          <w:sz w:val="22"/>
+        </w:rPr>
+        <w:t xml:space="preserve">On 24 September two different requests in a </w:t>
+      </w:r>
+      <w:r>
+        <w:rPr>
+          <w:sz w:val="22"/>
+          <w:b/>
+        </w:rPr>
+        <w:t xml:space="preserve">single session</w:t>
+      </w:r>
+      <w:r>
+        <w:rPr>
+          <w:sz w:val="22"/>
+        </w:rPr>
+        <w:t xml:space="preserve"> — one for a 30-day range and one for a 90-day range — both carried </w:t>
+      </w:r>
+      <w:r>
+        <w:rPr>
+          <w:sz w:val="22"/>
+          <w:rFonts w:ascii="Consolas" w:hAnsi="Consolas"/>
+          <w:sz w:val="20"/>
+        </w:rPr>
+        <w:t xml:space="preserve">1647602068707</w:t>
+      </w:r>
+      <w:r>
+        <w:rPr>
+          <w:sz w:val="22"/>
+        </w:rPr>
+        <w:t xml:space="preserve">. Everything else about those two requests differed. The identifier did not.</w:t>
+      </w:r>
+    </w:p>
+    <w:p>
+      <w:pPr>
+        <w:spacing w:before="280" w:after="120"/>
+        <w:rPr>
+          <w:sz w:val="28"/>
+          <w:b/>
+        </w:rPr>
+      </w:pPr>
+      <w:r>
+        <w:rPr>
+          <w:sz w:val="28"/>
+          <w:b/>
+        </w:rPr>
+        <w:t xml:space="preserve">Where it comes from</w:t>
+      </w:r>
+    </w:p>
+    <w:p>
+      <w:pPr>
+        <w:spacing w:before="0" w:after="120"/>
+        <w:rPr>
+          <w:sz w:val="22"/>
+        </w:rPr>
+      </w:pPr>
+      <w:r>
+        <w:rPr>
+          <w:sz w:val="22"/>
+          <w:rFonts w:ascii="Consolas" w:hAnsi="Consolas"/>
+          <w:sz w:val="20"/>
+        </w:rPr>
+        <w:t xml:space="preserve">apis/payment.js:101</w:t>
+      </w:r>
+      <w:r>
+        <w:rPr>
+          <w:sz w:val="22"/>
+        </w:rPr>
+        <w:t xml:space="preserve"> sets it as a literal rather than generating one per call.</w:t>
+      </w:r>
+    </w:p>
+    <w:p>
+      <w:pPr>
+        <w:spacing w:before="0" w:after="120"/>
+        <w:rPr>
+          <w:sz w:val="22"/>
+        </w:rPr>
+      </w:pPr>
+      <w:r>
+        <w:rPr>
+          <w:sz w:val="22"/>
+        </w:rPr>
+        <w:t xml:space="preserve">The value itself is the clue to what happened. </w:t>
+      </w:r>
+      <w:r>
+        <w:rPr>
+          <w:sz w:val="22"/>
+          <w:rFonts w:ascii="Consolas" w:hAnsi="Consolas"/>
+          <w:sz w:val="20"/>
+        </w:rPr>
+        <w:t xml:space="preserve">1647602068707</w:t>
+      </w:r>
+      <w:r>
+        <w:rPr>
+          <w:sz w:val="22"/>
+        </w:rPr>
+        <w:t xml:space="preserve"> read as a millisecond timestamp is </w:t>
+      </w:r>
+      <w:r>
+        <w:rPr>
+          <w:sz w:val="22"/>
+          <w:b/>
+        </w:rPr>
+        <w:t xml:space="preserve">18 March 2022, 11:14:28 UTC</w:t>
+      </w:r>
+      <w:r>
+        <w:rPr>
+          <w:sz w:val="22"/>
+        </w:rPr>
+        <w:t xml:space="preserve"> — a </w:t>
+      </w:r>
+      <w:r>
+        <w:rPr>
+          <w:sz w:val="22"/>
+          <w:rFonts w:ascii="Consolas" w:hAnsi="Consolas"/>
+          <w:sz w:val="20"/>
+        </w:rPr>
+        <w:t xml:space="preserve">Date.now()</w:t>
+      </w:r>
+      <w:r>
+        <w:rPr>
+          <w:sz w:val="22"/>
+        </w:rPr>
+        <w:t xml:space="preserve"> result from one afternoon during development, which was pasted in as a constant instead of being left as a call.</w:t>
+      </w:r>
+    </w:p>
+    <w:p>
+      <w:pPr>
+        <w:spacing w:before="0" w:after="120"/>
+        <w:rPr>
+          <w:sz w:val="22"/>
+        </w:rPr>
+      </w:pPr>
+      <w:r>
+        <w:rPr>
+          <w:sz w:val="22"/>
+        </w:rPr>
+        <w:t xml:space="preserve">So the intent was right. A fresh timestamp per request is exactly what was wanted. Only the call was replaced by its result.</w:t>
+      </w:r>
+    </w:p>
+    <w:p>
+      <w:pPr>
+        <w:spacing w:before="280" w:after="120"/>
+        <w:rPr>
+          <w:sz w:val="28"/>
+          <w:b/>
+        </w:rPr>
+      </w:pPr>
+      <w:r>
+        <w:rPr>
+          <w:sz w:val="28"/>
+          <w:b/>
+        </w:rPr>
+        <w:t xml:space="preserve">Expected result</w:t>
+      </w:r>
+    </w:p>
+    <w:p>
+      <w:pPr>
+        <w:spacing w:before="0" w:after="120"/>
+        <w:rPr>
+          <w:sz w:val="22"/>
+        </w:rPr>
+      </w:pPr>
+      <w:r>
+        <w:rPr>
+          <w:sz w:val="22"/>
+        </w:rPr>
+        <w:t xml:space="preserve">Each request carries its own identifier, so any one call can be picked out and followed.</w:t>
+      </w:r>
+    </w:p>
+    <w:p>
+      <w:pPr>
+        <w:spacing w:before="280" w:after="120"/>
+        <w:rPr>
+          <w:sz w:val="28"/>
+          <w:b/>
+        </w:rPr>
+      </w:pPr>
+      <w:r>
+        <w:rPr>
+          <w:sz w:val="28"/>
+          <w:b/>
+        </w:rPr>
+        <w:t xml:space="preserve">Actual result</w:t>
+      </w:r>
+    </w:p>
+    <w:p>
+      <w:pPr>
+        <w:spacing w:before="0" w:after="120"/>
+        <w:rPr>
+          <w:sz w:val="22"/>
+        </w:rPr>
+      </w:pPr>
+      <w:r>
+        <w:rPr>
+          <w:sz w:val="22"/>
+        </w:rPr>
+        <w:t xml:space="preserve">Every request carries </w:t>
+      </w:r>
+      <w:r>
+        <w:rPr>
+          <w:sz w:val="22"/>
+          <w:rFonts w:ascii="Consolas" w:hAnsi="Consolas"/>
+          <w:sz w:val="20"/>
+        </w:rPr>
+        <w:t xml:space="preserve">1647602068707</w:t>
+      </w:r>
+      <w:r>
+        <w:rPr>
+          <w:sz w:val="22"/>
+        </w:rPr>
+        <w:t xml:space="preserve">.</w:t>
+      </w:r>
+    </w:p>
+    <w:p>
+      <w:pPr>
+        <w:spacing w:before="280" w:after="120"/>
+        <w:rPr>
+          <w:sz w:val="28"/>
+          <w:b/>
+        </w:rPr>
+      </w:pPr>
+      <w:r>
+        <w:rPr>
+          <w:sz w:val="28"/>
+          <w:b/>
+        </w:rPr>
+        <w:t xml:space="preserve">Impact</w:t>
+      </w:r>
+    </w:p>
+    <w:p>
+      <w:pPr>
+        <w:spacing w:before="0" w:after="120"/>
+        <w:rPr>
+          <w:sz w:val="22"/>
+        </w:rPr>
+      </w:pPr>
+      <w:r>
+        <w:rPr>
+          <w:sz w:val="22"/>
+        </w:rPr>
+        <w:t xml:space="preserve">Nothing a merchant can see, and nothing measured is wrong. The figures are correct and the page behaves normally. This is a diagnostics problem, and it is felt when something else goes wrong.</w:t>
+      </w:r>
+    </w:p>
+    <w:p>
+      <w:pPr>
+        <w:spacing w:before="0" w:after="120"/>
+        <w:rPr>
+          <w:sz w:val="22"/>
+        </w:rPr>
+      </w:pPr>
+      <w:r>
+        <w:rPr>
+          <w:sz w:val="22"/>
+        </w:rPr>
+        <w:t xml:space="preserve">When a merchant reports that Payment Stats gave them the wrong numbers at a particular moment, the usual route is to find that one request in the logs and follow it. Here every request looks identical, so there is nothing to search on. A support case that should take minutes becomes guesswork.</w:t>
+      </w:r>
+    </w:p>
+    <w:p>
+      <w:pPr>
+        <w:spacing w:before="0" w:after="120"/>
+        <w:rPr>
+          <w:sz w:val="22"/>
+        </w:rPr>
+      </w:pPr>
+      <w:r>
+        <w:rPr>
+          <w:sz w:val="22"/>
+        </w:rPr>
+        <w:t xml:space="preserve">It also quietly weakens every other defect in this document. PS-NEG-02 and PS-NEG-12 both depend on knowing which call did what, and this makes that harder than it needs to be.</w:t>
+      </w:r>
+    </w:p>
+    <w:p>
+      <w:pPr>
+        <w:spacing w:before="0" w:after="120"/>
+        <w:rPr>
+          <w:sz w:val="22"/>
+        </w:rPr>
+      </w:pPr>
+      <w:r>
+        <w:rPr>
+          <w:sz w:val="22"/>
+          <w:b/>
+        </w:rPr>
+        <w:t xml:space="preserve">Workaround:</w:t>
+      </w:r>
+      <w:r>
+        <w:rPr>
+          <w:sz w:val="22"/>
+        </w:rPr>
+        <w:t xml:space="preserve"> none. Nothing the merchant or the tester does changes it.</w:t>
+      </w:r>
+    </w:p>
+    <w:p>
+      <w:pPr>
+        <w:spacing w:before="280" w:after="120"/>
+        <w:rPr>
+          <w:sz w:val="28"/>
+          <w:b/>
+        </w:rPr>
+      </w:pPr>
+      <w:r>
+        <w:rPr>
+          <w:sz w:val="28"/>
+          <w:b/>
+        </w:rPr>
+        <w:t xml:space="preserve">Notes for the developer</w:t>
+      </w:r>
+    </w:p>
+    <w:p>
+      <w:pPr>
+        <w:spacing w:before="0" w:after="80"/>
+        <w:ind w:left="360"/>
+        <w:rPr>
+          <w:sz w:val="22"/>
+        </w:rPr>
+      </w:pPr>
+      <w:r>
+        <w:rPr>
+          <w:sz w:val="22"/>
+        </w:rPr>
+        <w:t xml:space="preserve">• Restore the generated value at </w:t>
+      </w:r>
+      <w:r>
+        <w:rPr>
+          <w:sz w:val="22"/>
+          <w:rFonts w:ascii="Consolas" w:hAnsi="Consolas"/>
+          <w:sz w:val="20"/>
+        </w:rPr>
+        <w:t xml:space="preserve">apis/payment.js:101</w:t>
+      </w:r>
+      <w:r>
+        <w:rPr>
+          <w:sz w:val="22"/>
+        </w:rPr>
+        <w:t xml:space="preserve">. The surrounding code already expects an identifier of this shape.</w:t>
+      </w:r>
+    </w:p>
+    <w:p>
+      <w:pPr>
+        <w:spacing w:before="0" w:after="80"/>
+        <w:ind w:left="360"/>
+        <w:rPr>
+          <w:sz w:val="22"/>
+        </w:rPr>
+      </w:pPr>
+      <w:r>
+        <w:rPr>
+          <w:sz w:val="22"/>
+        </w:rPr>
+        <w:t xml:space="preserve">• Check whether the same literal was pasted anywhere else at the same time. A constant that came from one development session is rarely used in only one place.</w:t>
+      </w:r>
+    </w:p>
+    <w:p>
+      <w:pPr>
+        <w:spacing w:before="0" w:after="80"/>
+        <w:ind w:left="360"/>
+        <w:rPr>
+          <w:sz w:val="22"/>
+        </w:rPr>
+      </w:pPr>
+      <w:r>
+        <w:rPr>
+          <w:sz w:val="22"/>
+        </w:rPr>
+        <w:t xml:space="preserve">• Worth confirming nothing downstream has come to rely on the value being fixed. It has been constant since March 2022, which is long enough for something to have quietly depended on it.</w:t>
+      </w:r>
+    </w:p>
+    <w:p>
+      <w:pPr>
+        <w:spacing w:before="280" w:after="120"/>
+        <w:rPr>
+          <w:sz w:val="28"/>
+          <w:b/>
+        </w:rPr>
+      </w:pPr>
+      <w:r>
+        <w:rPr>
+          <w:sz w:val="28"/>
+          <w:b/>
+        </w:rPr>
+        <w:t xml:space="preserve">How to tell it is fixed</w:t>
+      </w:r>
+    </w:p>
+    <w:p>
+      <w:pPr>
+        <w:spacing w:before="0" w:after="120"/>
+        <w:rPr>
+          <w:sz w:val="22"/>
+        </w:rPr>
+      </w:pPr>
+      <w:r>
+        <w:rPr>
+          <w:sz w:val="22"/>
+        </w:rPr>
+        <w:t xml:space="preserve">1. Open Payment Stats with the browser's network view recording. 2. Change the date range and submit again, so at least two requests are made. 3. Compare the identifier on the two requests. They must differ. 4. Reload and repeat. The values must differ again, and must not repeat from the earlier run.</w:t>
+      </w:r>
+    </w:p>
     <w:sectPr>
       <w:pgSz w:w="12240" w:h="15840"/>
       <w:pgMar w:top="1440" w:right="1440" w:bottom="1440" w:left="1440"/>

</xml_diff>